<commit_message>
Update cover: full-bleed navy design matching PDF, uniform borders
</commit_message>
<xml_diff>
--- a/Legitimo_Mifos_X_Pricing_2025.docx
+++ b/Legitimo_Mifos_X_Pricing_2025.docx
@@ -2,124 +2,9 @@
 <file path=word/document.xml><?xml version="1.0" encoding="utf-8"?>
 <w:document xmlns:wpc="http://schemas.microsoft.com/office/word/2010/wordprocessingCanvas" xmlns:mc="http://schemas.openxmlformats.org/markup-compatibility/2006" xmlns:o="urn:schemas-microsoft-com:office:office" xmlns:r="http://schemas.openxmlformats.org/officeDocument/2006/relationships" xmlns:m="http://schemas.openxmlformats.org/officeDocument/2006/math" xmlns:v="urn:schemas-microsoft-com:vml" xmlns:wp14="http://schemas.microsoft.com/office/word/2010/wordprocessingDrawing" xmlns:wp="http://schemas.openxmlformats.org/drawingml/2006/wordprocessingDrawing" xmlns:w10="urn:schemas-microsoft-com:office:word" xmlns:w="http://schemas.openxmlformats.org/wordprocessingml/2006/main" xmlns:w14="http://schemas.microsoft.com/office/word/2010/wordml" xmlns:w15="http://schemas.microsoft.com/office/word/2012/wordml" xmlns:wpg="http://schemas.microsoft.com/office/word/2010/wordprocessingGroup" xmlns:wpi="http://schemas.microsoft.com/office/word/2010/wordprocessingInk" xmlns:wne="http://schemas.microsoft.com/office/word/2006/wordml" xmlns:wps="http://schemas.microsoft.com/office/word/2010/wordprocessingShape" xmlns:cx="http://schemas.microsoft.com/office/drawing/2014/chartex" xmlns:cx1="http://schemas.microsoft.com/office/drawing/2015/9/8/chartex" xmlns:cx2="http://schemas.microsoft.com/office/drawing/2015/10/21/chartex" xmlns:cx3="http://schemas.microsoft.com/office/drawing/2016/5/9/chartex" xmlns:cx4="http://schemas.microsoft.com/office/drawing/2016/5/10/chartex" xmlns:cx5="http://schemas.microsoft.com/office/drawing/2016/5/11/chartex" xmlns:cx6="http://schemas.microsoft.com/office/drawing/2016/5/12/chartex" xmlns:cx7="http://schemas.microsoft.com/office/drawing/2016/5/13/chartex" xmlns:cx8="http://schemas.microsoft.com/office/drawing/2016/5/14/chartex" xmlns:aink="http://schemas.microsoft.com/office/drawing/2016/ink" xmlns:am3d="http://schemas.microsoft.com/office/drawing/2017/model3d" xmlns:w16cex="http://schemas.microsoft.com/office/word/2018/wordml/cex" xmlns:w16cid="http://schemas.microsoft.com/office/word/2016/wordml/cid" xmlns:w16="http://schemas.microsoft.com/office/word/2018/wordml" xmlns:w16sdtdh="http://schemas.microsoft.com/office/word/2020/wordml/sdtdatahash" xmlns:w16se="http://schemas.microsoft.com/office/word/2015/wordml/symex" mc:Ignorable="w14 w15 wp14">
   <w:body>
-    <w:p>
-      <w:pPr>
-        <w:spacing w:before="0" w:after="200"/>
-      </w:pPr>
-      <w:r>
-        <w:rPr>
-          <w:rFonts w:ascii="Arial" w:cs="Arial" w:eastAsia="Arial" w:hAnsi="Arial"/>
-          <w:color w:val="334E6E"/>
-          <w:sz w:val="20"/>
-          <w:szCs w:val="20"/>
-        </w:rPr>
-        <w:t xml:space="preserve"/>
-      </w:r>
-    </w:p>
-    <w:p>
-      <w:pPr>
-        <w:spacing w:before="0" w:after="80"/>
-      </w:pPr>
-      <w:r>
-        <w:rPr>
-          <w:rFonts w:ascii="Arial" w:cs="Arial" w:eastAsia="Arial" w:hAnsi="Arial"/>
-          <w:b/>
-          <w:bCs/>
-          <w:color w:val="1E88E5"/>
-          <w:spacing w:val="60"/>
-          <w:sz w:val="18"/>
-          <w:szCs w:val="18"/>
-        </w:rPr>
-        <w:t xml:space="preserve">PRICING PROPOSAL  ·  2025</w:t>
-      </w:r>
-    </w:p>
-    <w:p>
-      <w:pPr>
-        <w:spacing w:before="0" w:after="40"/>
-      </w:pPr>
-      <w:r>
-        <w:rPr>
-          <w:rFonts w:ascii="Arial" w:cs="Arial" w:eastAsia="Arial" w:hAnsi="Arial"/>
-          <w:b/>
-          <w:bCs/>
-          <w:color w:val="0F2D5A"/>
-          <w:sz w:val="52"/>
-          <w:szCs w:val="52"/>
-        </w:rPr>
-        <w:t xml:space="preserve">Core Banking for Microfinance</w:t>
-      </w:r>
-    </w:p>
-    <w:p>
-      <w:pPr>
-        <w:spacing w:before="0" w:after="40"/>
-      </w:pPr>
-      <w:r>
-        <w:rPr>
-          <w:rFonts w:ascii="Arial" w:cs="Arial" w:eastAsia="Arial" w:hAnsi="Arial"/>
-          <w:b w:val="false"/>
-          <w:bCs w:val="false"/>
-          <w:i/>
-          <w:iCs/>
-          <w:color w:val="1565C0"/>
-          <w:sz w:val="28"/>
-          <w:szCs w:val="28"/>
-        </w:rPr>
-        <w:t xml:space="preserve">Deployment Packages &amp; Pricing</w:t>
-      </w:r>
-    </w:p>
-    <w:p>
-      <w:pPr>
-        <w:pBdr>
-          <w:bottom w:val="single" w:color="1E88E5" w:sz="12" w:space="2"/>
-        </w:pBdr>
-        <w:spacing w:before="0" w:after="0"/>
-      </w:pPr>
-    </w:p>
-    <w:p>
-      <w:pPr>
-        <w:spacing w:before="100" w:after="120"/>
-      </w:pPr>
-      <w:r>
-        <w:rPr>
-          <w:rFonts w:ascii="Arial" w:cs="Arial" w:eastAsia="Arial" w:hAnsi="Arial"/>
-          <w:color w:val="334E6E"/>
-          <w:sz w:val="20"/>
-          <w:szCs w:val="20"/>
-        </w:rPr>
-        <w:t xml:space="preserve"/>
-      </w:r>
-    </w:p>
-    <w:p>
-      <w:pPr>
-        <w:spacing w:before="0" w:after="80"/>
-      </w:pPr>
-      <w:r>
-        <w:rPr>
-          <w:rFonts w:ascii="Arial" w:cs="Arial" w:eastAsia="Arial" w:hAnsi="Arial"/>
-          <w:color w:val="334E6E"/>
-          <w:sz w:val="20"/>
-          <w:szCs w:val="20"/>
-        </w:rPr>
-        <w:t xml:space="preserve">Three deployment tiers covering every institutional scale — from first-time digital deployment to full multi-branch operations. Powered by Mifos X / Apache Fineract, the world's most trusted open-source MFI platform.</w:t>
-      </w:r>
-    </w:p>
-    <w:p>
-      <w:pPr>
-        <w:spacing w:before="80" w:after="80"/>
-      </w:pPr>
-      <w:r>
-        <w:rPr>
-          <w:rFonts w:ascii="Arial" w:cs="Arial" w:eastAsia="Arial" w:hAnsi="Arial"/>
-          <w:color w:val="334E6E"/>
-          <w:sz w:val="20"/>
-          <w:szCs w:val="20"/>
-        </w:rPr>
-        <w:t xml:space="preserve"/>
-      </w:r>
-    </w:p>
     <w:tbl>
       <w:tblPr>
-        <w:tblW w:type="dxa" w:w="9026"/>
+        <w:tblW w:type="dxa" w:w="11906"/>
         <w:tblBorders>
           <w:top w:val="single" w:color="auto" w:sz="4"/>
           <w:left w:val="single" w:color="auto" w:sz="4"/>
@@ -130,141 +15,588 @@
         </w:tblBorders>
       </w:tblPr>
       <w:tblGrid>
-        <w:gridCol w:w="2256"/>
-        <w:gridCol w:w="2257"/>
-        <w:gridCol w:w="2257"/>
-        <w:gridCol w:w="2256"/>
+        <w:gridCol w:w="7143"/>
+        <w:gridCol w:w="4763"/>
       </w:tblGrid>
       <w:tr>
         <w:tc>
           <w:tcPr>
-            <w:tcW w:type="dxa" w:w="2256"/>
-            <w:tcBorders>
-              <w:top w:val="none" w:color="FFFFFF" w:sz="0"/>
-              <w:left w:val="none" w:color="FFFFFF" w:sz="0"/>
-              <w:bottom w:val="none" w:color="FFFFFF" w:sz="0"/>
-              <w:right w:val="none" w:color="FFFFFF" w:sz="0"/>
+            <w:tcW w:type="dxa" w:w="11906"/>
+            <w:gridSpan w:val="2"/>
+            <w:tcBorders>
+              <w:top w:val="none" w:color="auto" w:sz="0"/>
+              <w:left w:val="none" w:color="auto" w:sz="0"/>
+              <w:bottom w:val="none" w:color="auto" w:sz="0"/>
+              <w:right w:val="none" w:color="auto" w:sz="0"/>
+            </w:tcBorders>
+            <w:shd w:fill="C9A84C" w:val="clear"/>
+            <w:tcMar>
+              <w:top w:type="dxa" w:w="0"/>
+              <w:left w:type="dxa" w:w="0"/>
+              <w:bottom w:type="dxa" w:w="0"/>
+              <w:right w:type="dxa" w:w="0"/>
+            </w:tcMar>
+          </w:tcPr>
+          <w:p>
+            <w:pPr>
+              <w:spacing w:before="0" w:after="0"/>
+            </w:pPr>
+            <w:r>
+              <w:rPr>
+                <w:rFonts w:ascii="Arial" w:cs="Arial" w:eastAsia="Arial" w:hAnsi="Arial"/>
+                <w:color w:val="C9A84C"/>
+                <w:sz w:val="16"/>
+                <w:szCs w:val="16"/>
+              </w:rPr>
+              <w:t xml:space="preserve"> </w:t>
+            </w:r>
+          </w:p>
+        </w:tc>
+      </w:tr>
+      <w:tr>
+        <w:tc>
+          <w:tcPr>
+            <w:tcW w:type="dxa" w:w="5953"/>
+            <w:tcBorders>
+              <w:top w:val="none" w:color="auto" w:sz="0"/>
+              <w:left w:val="none" w:color="auto" w:sz="0"/>
+              <w:bottom w:val="none" w:color="auto" w:sz="0"/>
+              <w:right w:val="none" w:color="auto" w:sz="0"/>
             </w:tcBorders>
             <w:shd w:fill="0F2D5A" w:val="clear"/>
             <w:tcMar>
-              <w:top w:type="dxa" w:w="100"/>
-              <w:left w:type="dxa" w:w="120"/>
-              <w:bottom w:type="dxa" w:w="60"/>
-              <w:right w:type="dxa" w:w="120"/>
-            </w:tcMar>
-          </w:tcPr>
-          <w:p>
-            <w:pPr>
-              <w:spacing w:before="0" w:after="0"/>
-              <w:jc w:val="center"/>
-            </w:pPr>
+              <w:top w:type="dxa" w:w="160"/>
+              <w:left w:type="dxa" w:w="460"/>
+              <w:bottom w:type="dxa" w:w="160"/>
+              <w:right w:type="dxa" w:w="0"/>
+            </w:tcMar>
+          </w:tcPr>
+          <w:p>
+            <w:pPr>
+              <w:spacing w:before="0" w:after="0"/>
+            </w:pPr>
+            <w:r>
+              <w:rPr>
+                <w:rFonts w:ascii="Arial" w:cs="Arial" w:eastAsia="Arial" w:hAnsi="Arial"/>
+                <w:b/>
+                <w:bCs/>
+                <w:color w:val="FFFFFF"/>
+                <w:sz w:val="24"/>
+                <w:szCs w:val="24"/>
+              </w:rPr>
+              <w:t xml:space="preserve">Legitimo</w:t>
+            </w:r>
+            <w:r>
+              <w:rPr>
+                <w:rFonts w:ascii="Arial" w:cs="Arial" w:eastAsia="Arial" w:hAnsi="Arial"/>
+                <w:b/>
+                <w:bCs/>
+                <w:color w:val="E8C878"/>
+                <w:sz w:val="24"/>
+                <w:szCs w:val="24"/>
+              </w:rPr>
+              <w:t xml:space="preserve">Tech</w:t>
+            </w:r>
             <w:r>
               <w:rPr>
                 <w:rFonts w:ascii="Arial" w:cs="Arial" w:eastAsia="Arial" w:hAnsi="Arial"/>
                 <w:b/>
                 <w:bCs/>
                 <w:color w:val="7AACDB"/>
-                <w:spacing w:val="40"/>
+                <w:sz w:val="24"/>
+                <w:szCs w:val="24"/>
+              </w:rPr>
+              <w:t xml:space="preserve"> Solutions</w:t>
+            </w:r>
+          </w:p>
+        </w:tc>
+        <w:tc>
+          <w:tcPr>
+            <w:tcW w:type="dxa" w:w="5953"/>
+            <w:tcBorders>
+              <w:top w:val="none" w:color="auto" w:sz="0"/>
+              <w:left w:val="none" w:color="auto" w:sz="0"/>
+              <w:bottom w:val="none" w:color="auto" w:sz="0"/>
+              <w:right w:val="none" w:color="auto" w:sz="0"/>
+            </w:tcBorders>
+            <w:shd w:fill="0F2D5A" w:val="clear"/>
+            <w:tcMar>
+              <w:top w:type="dxa" w:w="160"/>
+              <w:left w:type="dxa" w:w="0"/>
+              <w:bottom w:type="dxa" w:w="160"/>
+              <w:right w:type="dxa" w:w="460"/>
+            </w:tcMar>
+          </w:tcPr>
+          <w:p>
+            <w:pPr>
+              <w:spacing w:before="0" w:after="0"/>
+              <w:jc w:val="right"/>
+            </w:pPr>
+            <w:r>
+              <w:rPr>
+                <w:rFonts w:ascii="Arial" w:cs="Arial" w:eastAsia="Arial" w:hAnsi="Arial"/>
+                <w:color w:val="6B84A0"/>
+                <w:sz w:val="18"/>
+                <w:szCs w:val="18"/>
+              </w:rPr>
+              <w:t xml:space="preserve">Mifos X / Apache Fineract</w:t>
+            </w:r>
+          </w:p>
+        </w:tc>
+      </w:tr>
+      <w:tr>
+        <w:tc>
+          <w:tcPr>
+            <w:tcW w:type="dxa" w:w="7143"/>
+            <w:tcBorders>
+              <w:top w:val="none" w:color="auto" w:sz="0"/>
+              <w:left w:val="none" w:color="auto" w:sz="0"/>
+              <w:bottom w:val="none" w:color="auto" w:sz="0"/>
+              <w:right w:val="none" w:color="auto" w:sz="0"/>
+            </w:tcBorders>
+            <w:shd w:fill="0F2D5A" w:val="clear"/>
+            <w:tcMar>
+              <w:top w:type="dxa" w:w="440"/>
+              <w:left w:type="dxa" w:w="460"/>
+              <w:bottom w:type="dxa" w:w="440"/>
+              <w:right w:type="dxa" w:w="280"/>
+            </w:tcMar>
+          </w:tcPr>
+          <w:tbl>
+            <w:tblPr>
+              <w:tblW w:type="dxa" w:w="6683"/>
+              <w:tblBorders>
+                <w:top w:val="single" w:color="auto" w:sz="4"/>
+                <w:left w:val="single" w:color="auto" w:sz="4"/>
+                <w:bottom w:val="single" w:color="auto" w:sz="4"/>
+                <w:right w:val="single" w:color="auto" w:sz="4"/>
+                <w:insideH w:val="single" w:color="auto" w:sz="4"/>
+                <w:insideV w:val="single" w:color="auto" w:sz="4"/>
+              </w:tblBorders>
+            </w:tblPr>
+            <w:tblGrid>
+              <w:gridCol w:w="6683"/>
+            </w:tblGrid>
+            <w:tr>
+              <w:tc>
+                <w:tcPr>
+                  <w:tcW w:type="dxa" w:w="6683"/>
+                  <w:tcBorders>
+                    <w:top w:val="none" w:color="auto" w:sz="0"/>
+                    <w:left w:val="single" w:color="C9A84C" w:sz="6"/>
+                    <w:bottom w:val="none" w:color="auto" w:sz="0"/>
+                    <w:right w:val="none" w:color="auto" w:sz="0"/>
+                  </w:tcBorders>
+                  <w:shd w:fill="0D3A8A" w:val="clear"/>
+                  <w:tcMar>
+                    <w:top w:type="dxa" w:w="40"/>
+                    <w:left w:type="dxa" w:w="120"/>
+                    <w:bottom w:type="dxa" w:w="40"/>
+                    <w:right w:type="dxa" w:w="120"/>
+                  </w:tcMar>
+                </w:tcPr>
+                <w:p>
+                  <w:pPr>
+                    <w:spacing w:before="0" w:after="0"/>
+                  </w:pPr>
+                  <w:r>
+                    <w:rPr>
+                      <w:rFonts w:ascii="Arial" w:cs="Arial" w:eastAsia="Arial" w:hAnsi="Arial"/>
+                      <w:b/>
+                      <w:bCs/>
+                      <w:color w:val="E8C878"/>
+                      <w:spacing w:val="20"/>
+                      <w:sz w:val="16"/>
+                      <w:szCs w:val="16"/>
+                    </w:rPr>
+                    <w:t xml:space="preserve">  PRICING PROPOSAL · 2025  </w:t>
+                  </w:r>
+                </w:p>
+              </w:tc>
+            </w:tr>
+          </w:tbl>
+          <w:p>
+            <w:pPr>
+              <w:spacing w:before="160" w:after="0"/>
+            </w:pPr>
+            <w:r>
+              <w:rPr>
+                <w:rFonts w:ascii="Arial" w:cs="Arial" w:eastAsia="Arial" w:hAnsi="Arial"/>
+                <w:color w:val="334E6E"/>
+                <w:sz w:val="20"/>
+                <w:szCs w:val="20"/>
+              </w:rPr>
+              <w:t xml:space="preserve"/>
+            </w:r>
+          </w:p>
+          <w:p>
+            <w:pPr>
+              <w:spacing w:before="0" w:after="0"/>
+            </w:pPr>
+            <w:r>
+              <w:rPr>
+                <w:rFonts w:ascii="Arial" w:cs="Arial" w:eastAsia="Arial" w:hAnsi="Arial"/>
+                <w:b/>
+                <w:bCs/>
+                <w:color w:val="FFFFFF"/>
+                <w:sz w:val="74"/>
+                <w:szCs w:val="74"/>
+              </w:rPr>
+              <w:t xml:space="preserve">Core Banking</w:t>
+            </w:r>
+          </w:p>
+          <w:p>
+            <w:pPr>
+              <w:spacing w:before="0" w:after="0"/>
+            </w:pPr>
+            <w:r>
+              <w:rPr>
+                <w:rFonts w:ascii="Arial" w:cs="Arial" w:eastAsia="Arial" w:hAnsi="Arial"/>
+                <w:b/>
+                <w:bCs/>
+                <w:i/>
+                <w:iCs/>
+                <w:color w:val="E8C878"/>
+                <w:sz w:val="74"/>
+                <w:szCs w:val="74"/>
+              </w:rPr>
+              <w:t xml:space="preserve">for Microfinance.</w:t>
+            </w:r>
+          </w:p>
+          <w:p>
+            <w:pPr>
+              <w:spacing w:before="0" w:after="100"/>
+            </w:pPr>
+            <w:r>
+              <w:rPr>
+                <w:rFonts w:ascii="Arial" w:cs="Arial" w:eastAsia="Arial" w:hAnsi="Arial"/>
+                <w:color w:val="334E6E"/>
+                <w:sz w:val="20"/>
+                <w:szCs w:val="20"/>
+              </w:rPr>
+              <w:t xml:space="preserve"/>
+            </w:r>
+          </w:p>
+          <w:p>
+            <w:pPr>
+              <w:pBdr>
+                <w:bottom w:val="single" w:color="C9A84C" w:sz="16" w:space="2"/>
+              </w:pBdr>
+              <w:spacing w:before="0" w:after="120"/>
+            </w:pPr>
+          </w:p>
+          <w:p>
+            <w:pPr>
+              <w:spacing w:before="0" w:after="80"/>
+            </w:pPr>
+            <w:r>
+              <w:rPr>
+                <w:rFonts w:ascii="Arial" w:cs="Arial" w:eastAsia="Arial" w:hAnsi="Arial"/>
+                <w:color w:val="7AACDB"/>
+                <w:sz w:val="22"/>
+                <w:szCs w:val="22"/>
+              </w:rPr>
+              <w:t xml:space="preserve">Deployment packages — Mifos X / Apache Fineract</w:t>
+            </w:r>
+          </w:p>
+          <w:p>
+            <w:pPr>
+              <w:spacing w:before="0" w:after="80"/>
+            </w:pPr>
+            <w:r>
+              <w:rPr>
+                <w:rFonts w:ascii="Arial" w:cs="Arial" w:eastAsia="Arial" w:hAnsi="Arial"/>
+                <w:color w:val="334E6E"/>
+                <w:sz w:val="20"/>
+                <w:szCs w:val="20"/>
+              </w:rPr>
+              <w:t xml:space="preserve"/>
+            </w:r>
+          </w:p>
+          <w:p>
+            <w:pPr>
+              <w:spacing w:before="0" w:after="0"/>
+            </w:pPr>
+            <w:r>
+              <w:rPr>
+                <w:rFonts w:ascii="Arial" w:cs="Arial" w:eastAsia="Arial" w:hAnsi="Arial"/>
+                <w:color w:val="7AACDB"/>
+                <w:sz w:val="20"/>
+                <w:szCs w:val="20"/>
+              </w:rPr>
+              <w:t xml:space="preserve">Three deployment tiers covering every institutional scale — from first-time digital deployment to full multi-branch operations. Powered by the world’s most trusted open-source MFI platform.</w:t>
+            </w:r>
+          </w:p>
+        </w:tc>
+        <w:tc>
+          <w:tcPr>
+            <w:tcW w:type="dxa" w:w="4763"/>
+            <w:tcBorders>
+              <w:top w:val="none" w:color="auto" w:sz="0"/>
+              <w:left w:val="none" w:color="auto" w:sz="0"/>
+              <w:bottom w:val="none" w:color="auto" w:sz="0"/>
+              <w:right w:val="none" w:color="auto" w:sz="0"/>
+            </w:tcBorders>
+            <w:shd w:fill="0F2D5A" w:val="clear"/>
+            <w:tcMar>
+              <w:top w:type="dxa" w:w="0"/>
+              <w:left w:type="dxa" w:w="0"/>
+              <w:bottom w:type="dxa" w:w="0"/>
+              <w:right w:type="dxa" w:w="0"/>
+            </w:tcMar>
+          </w:tcPr>
+          <w:tbl>
+            <w:tblPr>
+              <w:tblW w:type="dxa" w:w="4763"/>
+              <w:tblBorders>
+                <w:top w:val="single" w:color="auto" w:sz="4"/>
+                <w:left w:val="single" w:color="auto" w:sz="4"/>
+                <w:bottom w:val="single" w:color="auto" w:sz="4"/>
+                <w:right w:val="single" w:color="auto" w:sz="4"/>
+                <w:insideH w:val="single" w:color="auto" w:sz="4"/>
+                <w:insideV w:val="single" w:color="auto" w:sz="4"/>
+              </w:tblBorders>
+            </w:tblPr>
+            <w:tblGrid>
+              <w:gridCol w:w="4763"/>
+            </w:tblGrid>
+            <w:tr>
+              <w:tc>
+                <w:tcPr>
+                  <w:tcW w:type="dxa" w:w="4763"/>
+                  <w:tcBorders>
+                    <w:top w:val="none" w:color="auto" w:sz="0"/>
+                    <w:left w:val="none" w:color="auto" w:sz="0"/>
+                    <w:bottom w:val="none" w:color="auto" w:sz="0"/>
+                    <w:right w:val="none" w:color="auto" w:sz="0"/>
+                  </w:tcBorders>
+                  <w:shd w:fill="1A5FAB" w:val="clear"/>
+                  <w:tcMar>
+                    <w:top w:type="dxa" w:w="0"/>
+                    <w:left w:type="dxa" w:w="0"/>
+                    <w:bottom w:type="dxa" w:w="0"/>
+                    <w:right w:type="dxa" w:w="0"/>
+                  </w:tcMar>
+                </w:tcPr>
+                <w:p>
+                  <w:pPr>
+                    <w:spacing w:before="0" w:after="0"/>
+                  </w:pPr>
+                  <w:r>
+                    <w:rPr>
+                      <w:rFonts w:ascii="Arial" w:cs="Arial" w:eastAsia="Arial" w:hAnsi="Arial"/>
+                      <w:color w:val="1A5FAB"/>
+                      <w:sz w:val="80"/>
+                      <w:szCs w:val="80"/>
+                    </w:rPr>
+                    <w:t xml:space="preserve"> </w:t>
+                  </w:r>
+                </w:p>
+              </w:tc>
+            </w:tr>
+            <w:tr>
+              <w:tc>
+                <w:tcPr>
+                  <w:tcW w:type="dxa" w:w="4763"/>
+                  <w:tcBorders>
+                    <w:top w:val="none" w:color="auto" w:sz="0"/>
+                    <w:left w:val="none" w:color="auto" w:sz="0"/>
+                    <w:bottom w:val="none" w:color="auto" w:sz="0"/>
+                    <w:right w:val="none" w:color="auto" w:sz="0"/>
+                  </w:tcBorders>
+                  <w:shd w:fill="0F2D5A" w:val="clear"/>
+                  <w:tcMar>
+                    <w:top w:type="dxa" w:w="0"/>
+                    <w:left w:type="dxa" w:w="0"/>
+                    <w:bottom w:type="dxa" w:w="0"/>
+                    <w:right w:type="dxa" w:w="0"/>
+                  </w:tcMar>
+                </w:tcPr>
+                <w:p>
+                  <w:pPr>
+                    <w:spacing w:before="0" w:after="0"/>
+                  </w:pPr>
+                  <w:r>
+                    <w:rPr>
+                      <w:rFonts w:ascii="Arial" w:cs="Arial" w:eastAsia="Arial" w:hAnsi="Arial"/>
+                      <w:color w:val="0F2D5A"/>
+                      <w:sz w:val="20"/>
+                      <w:szCs w:val="20"/>
+                    </w:rPr>
+                    <w:t xml:space="preserve"> </w:t>
+                  </w:r>
+                </w:p>
+              </w:tc>
+            </w:tr>
+          </w:tbl>
+          <w:p/>
+        </w:tc>
+      </w:tr>
+      <w:tr>
+        <w:tc>
+          <w:tcPr>
+            <w:tcW w:type="dxa" w:w="2976"/>
+            <w:tcBorders>
+              <w:top w:val="single" w:color="C9A84C" w:sz="8" w:space="0"/>
+              <w:left w:val="none" w:color="auto" w:sz="0"/>
+              <w:bottom w:val="none" w:color="auto" w:sz="0"/>
+              <w:right w:val="none" w:color="auto" w:sz="0"/>
+            </w:tcBorders>
+            <w:shd w:fill="0F2D5A" w:val="clear"/>
+            <w:tcMar>
+              <w:top w:type="dxa" w:w="200"/>
+              <w:left w:type="dxa" w:w="180"/>
+              <w:bottom w:type="dxa" w:w="200"/>
+              <w:right w:type="dxa" w:w="180"/>
+            </w:tcMar>
+          </w:tcPr>
+          <w:p>
+            <w:pPr>
+              <w:spacing w:before="0" w:after="60"/>
+            </w:pPr>
+            <w:r>
+              <w:rPr>
+                <w:rFonts w:ascii="Arial" w:cs="Arial" w:eastAsia="Arial" w:hAnsi="Arial"/>
+                <w:b/>
+                <w:bCs/>
+                <w:color w:val="FFFFFF"/>
+                <w:sz w:val="30"/>
+                <w:szCs w:val="30"/>
+              </w:rPr>
+              <w:t xml:space="preserve">UGX 2.5M</w:t>
+            </w:r>
+          </w:p>
+          <w:p>
+            <w:pPr>
+              <w:spacing w:before="0" w:after="0"/>
+            </w:pPr>
+            <w:r>
+              <w:rPr>
+                <w:rFonts w:ascii="Arial" w:cs="Arial" w:eastAsia="Arial" w:hAnsi="Arial"/>
+                <w:color w:val="6B84A0"/>
                 <w:sz w:val="17"/>
                 <w:szCs w:val="17"/>
               </w:rPr>
-              <w:t xml:space="preserve">BASIC</w:t>
-            </w:r>
-          </w:p>
-        </w:tc>
-        <w:tc>
-          <w:tcPr>
-            <w:tcW w:type="dxa" w:w="2257"/>
-            <w:tcBorders>
-              <w:top w:val="none" w:color="FFFFFF" w:sz="0"/>
-              <w:left w:val="none" w:color="FFFFFF" w:sz="0"/>
-              <w:bottom w:val="none" w:color="FFFFFF" w:sz="0"/>
-              <w:right w:val="none" w:color="FFFFFF" w:sz="0"/>
+              <w:t xml:space="preserve">Basic Deployment</w:t>
+            </w:r>
+          </w:p>
+        </w:tc>
+        <w:tc>
+          <w:tcPr>
+            <w:tcW w:type="dxa" w:w="2976"/>
+            <w:tcBorders>
+              <w:top w:val="single" w:color="C9A84C" w:sz="8" w:space="0"/>
+              <w:left w:val="single" w:color="162444" w:sz="3"/>
+              <w:bottom w:val="none" w:color="auto" w:sz="0"/>
+              <w:right w:val="none" w:color="auto" w:sz="0"/>
             </w:tcBorders>
             <w:shd w:fill="0D3A8A" w:val="clear"/>
             <w:tcMar>
-              <w:top w:type="dxa" w:w="100"/>
-              <w:left w:type="dxa" w:w="120"/>
-              <w:bottom w:type="dxa" w:w="60"/>
-              <w:right w:type="dxa" w:w="120"/>
-            </w:tcMar>
-          </w:tcPr>
-          <w:p>
-            <w:pPr>
-              <w:spacing w:before="0" w:after="0"/>
-              <w:jc w:val="center"/>
-            </w:pPr>
-            <w:r>
-              <w:rPr>
-                <w:rFonts w:ascii="Arial" w:cs="Arial" w:eastAsia="Arial" w:hAnsi="Arial"/>
-                <w:b/>
-                <w:bCs/>
-                <w:color w:val="7AACDB"/>
-                <w:spacing w:val="40"/>
+              <w:top w:type="dxa" w:w="200"/>
+              <w:left w:type="dxa" w:w="180"/>
+              <w:bottom w:type="dxa" w:w="200"/>
+              <w:right w:type="dxa" w:w="180"/>
+            </w:tcMar>
+          </w:tcPr>
+          <w:p>
+            <w:pPr>
+              <w:spacing w:before="0" w:after="60"/>
+            </w:pPr>
+            <w:r>
+              <w:rPr>
+                <w:rFonts w:ascii="Arial" w:cs="Arial" w:eastAsia="Arial" w:hAnsi="Arial"/>
+                <w:b/>
+                <w:bCs/>
+                <w:color w:val="FFFFFF"/>
+                <w:sz w:val="30"/>
+                <w:szCs w:val="30"/>
+              </w:rPr>
+              <w:t xml:space="preserve">UGX 3.5M</w:t>
+            </w:r>
+          </w:p>
+          <w:p>
+            <w:pPr>
+              <w:spacing w:before="0" w:after="0"/>
+            </w:pPr>
+            <w:r>
+              <w:rPr>
+                <w:rFonts w:ascii="Arial" w:cs="Arial" w:eastAsia="Arial" w:hAnsi="Arial"/>
+                <w:color w:val="6B84A0"/>
                 <w:sz w:val="17"/>
                 <w:szCs w:val="17"/>
               </w:rPr>
-              <w:t xml:space="preserve">PROFESSIONAL</w:t>
-            </w:r>
-          </w:p>
-        </w:tc>
-        <w:tc>
-          <w:tcPr>
-            <w:tcW w:type="dxa" w:w="2257"/>
-            <w:tcBorders>
-              <w:top w:val="none" w:color="FFFFFF" w:sz="0"/>
-              <w:left w:val="none" w:color="FFFFFF" w:sz="0"/>
-              <w:bottom w:val="none" w:color="FFFFFF" w:sz="0"/>
-              <w:right w:val="none" w:color="FFFFFF" w:sz="0"/>
+              <w:t xml:space="preserve">Professional</w:t>
+            </w:r>
+          </w:p>
+        </w:tc>
+        <w:tc>
+          <w:tcPr>
+            <w:tcW w:type="dxa" w:w="2976"/>
+            <w:tcBorders>
+              <w:top w:val="single" w:color="C9A84C" w:sz="8" w:space="0"/>
+              <w:left w:val="single" w:color="162444" w:sz="3"/>
+              <w:bottom w:val="none" w:color="auto" w:sz="0"/>
+              <w:right w:val="none" w:color="auto" w:sz="0"/>
             </w:tcBorders>
             <w:shd w:fill="0F2D5A" w:val="clear"/>
             <w:tcMar>
-              <w:top w:type="dxa" w:w="100"/>
-              <w:left w:type="dxa" w:w="120"/>
-              <w:bottom w:type="dxa" w:w="60"/>
-              <w:right w:type="dxa" w:w="120"/>
-            </w:tcMar>
-          </w:tcPr>
-          <w:p>
-            <w:pPr>
-              <w:spacing w:before="0" w:after="0"/>
-              <w:jc w:val="center"/>
-            </w:pPr>
-            <w:r>
-              <w:rPr>
-                <w:rFonts w:ascii="Arial" w:cs="Arial" w:eastAsia="Arial" w:hAnsi="Arial"/>
-                <w:b/>
-                <w:bCs/>
-                <w:color w:val="7AACDB"/>
-                <w:spacing w:val="40"/>
+              <w:top w:type="dxa" w:w="200"/>
+              <w:left w:type="dxa" w:w="180"/>
+              <w:bottom w:type="dxa" w:w="200"/>
+              <w:right w:type="dxa" w:w="180"/>
+            </w:tcMar>
+          </w:tcPr>
+          <w:p>
+            <w:pPr>
+              <w:spacing w:before="0" w:after="60"/>
+            </w:pPr>
+            <w:r>
+              <w:rPr>
+                <w:rFonts w:ascii="Arial" w:cs="Arial" w:eastAsia="Arial" w:hAnsi="Arial"/>
+                <w:b/>
+                <w:bCs/>
+                <w:color w:val="FFFFFF"/>
+                <w:sz w:val="30"/>
+                <w:szCs w:val="30"/>
+              </w:rPr>
+              <w:t xml:space="preserve">UGX 5.5M+</w:t>
+            </w:r>
+          </w:p>
+          <w:p>
+            <w:pPr>
+              <w:spacing w:before="0" w:after="0"/>
+            </w:pPr>
+            <w:r>
+              <w:rPr>
+                <w:rFonts w:ascii="Arial" w:cs="Arial" w:eastAsia="Arial" w:hAnsi="Arial"/>
+                <w:color w:val="6B84A0"/>
                 <w:sz w:val="17"/>
                 <w:szCs w:val="17"/>
               </w:rPr>
-              <w:t xml:space="preserve">ENTERPRISE</w:t>
-            </w:r>
-          </w:p>
-        </w:tc>
-        <w:tc>
-          <w:tcPr>
-            <w:tcW w:type="dxa" w:w="2256"/>
-            <w:tcBorders>
-              <w:top w:val="none" w:color="FFFFFF" w:sz="0"/>
-              <w:left w:val="none" w:color="FFFFFF" w:sz="0"/>
-              <w:bottom w:val="none" w:color="FFFFFF" w:sz="0"/>
-              <w:right w:val="none" w:color="FFFFFF" w:sz="0"/>
+              <w:t xml:space="preserve">Enterprise</w:t>
+            </w:r>
+          </w:p>
+        </w:tc>
+        <w:tc>
+          <w:tcPr>
+            <w:tcW w:type="dxa" w:w="2976"/>
+            <w:tcBorders>
+              <w:top w:val="single" w:color="C9A84C" w:sz="8" w:space="0"/>
+              <w:left w:val="single" w:color="162444" w:sz="3"/>
+              <w:bottom w:val="none" w:color="auto" w:sz="0"/>
+              <w:right w:val="none" w:color="auto" w:sz="0"/>
             </w:tcBorders>
             <w:shd w:fill="0A1E3C" w:val="clear"/>
             <w:tcMar>
-              <w:top w:type="dxa" w:w="100"/>
-              <w:left w:type="dxa" w:w="120"/>
-              <w:bottom w:type="dxa" w:w="60"/>
-              <w:right w:type="dxa" w:w="120"/>
-            </w:tcMar>
-          </w:tcPr>
-          <w:p>
-            <w:pPr>
-              <w:spacing w:before="0" w:after="0"/>
-              <w:jc w:val="center"/>
+              <w:top w:type="dxa" w:w="200"/>
+              <w:left w:type="dxa" w:w="180"/>
+              <w:bottom w:type="dxa" w:w="200"/>
+              <w:right w:type="dxa" w:w="180"/>
+            </w:tcMar>
+          </w:tcPr>
+          <w:p>
+            <w:pPr>
+              <w:spacing w:before="0" w:after="60"/>
             </w:pPr>
             <w:r>
               <w:rPr>
@@ -272,11 +604,24 @@
                 <w:b/>
                 <w:bCs/>
                 <w:color w:val="E8C878"/>
-                <w:spacing w:val="40"/>
+                <w:sz w:val="30"/>
+                <w:szCs w:val="30"/>
+              </w:rPr>
+              <w:t xml:space="preserve">UGX 400K /mo</w:t>
+            </w:r>
+          </w:p>
+          <w:p>
+            <w:pPr>
+              <w:spacing w:before="0" w:after="0"/>
+            </w:pPr>
+            <w:r>
+              <w:rPr>
+                <w:rFonts w:ascii="Arial" w:cs="Arial" w:eastAsia="Arial" w:hAnsi="Arial"/>
+                <w:color w:val="6B84A0"/>
                 <w:sz w:val="17"/>
                 <w:szCs w:val="17"/>
               </w:rPr>
-              <w:t xml:space="preserve">MONTHLY</w:t>
+              <w:t xml:space="preserve">Monthly Maintenance</w:t>
             </w:r>
           </w:p>
         </w:tc>
@@ -284,201 +629,66 @@
       <w:tr>
         <w:tc>
           <w:tcPr>
-            <w:tcW w:type="dxa" w:w="2256"/>
-            <w:tcBorders>
-              <w:top w:val="none" w:color="FFFFFF" w:sz="0"/>
-              <w:left w:val="none" w:color="FFFFFF" w:sz="0"/>
-              <w:bottom w:val="none" w:color="FFFFFF" w:sz="0"/>
-              <w:right w:val="none" w:color="FFFFFF" w:sz="0"/>
-            </w:tcBorders>
-            <w:shd w:fill="EEF5FF" w:val="clear"/>
-            <w:tcMar>
-              <w:top w:type="dxa" w:w="80"/>
-              <w:left w:type="dxa" w:w="120"/>
-              <w:bottom w:type="dxa" w:w="120"/>
-              <w:right w:type="dxa" w:w="120"/>
-            </w:tcMar>
-          </w:tcPr>
-          <w:p>
-            <w:pPr>
-              <w:spacing w:before="0" w:after="20"/>
-              <w:jc w:val="center"/>
-            </w:pPr>
-            <w:r>
-              <w:rPr>
-                <w:rFonts w:ascii="Arial" w:cs="Arial" w:eastAsia="Arial" w:hAnsi="Arial"/>
-                <w:b/>
-                <w:bCs/>
-                <w:color w:val="0F2D5A"/>
-                <w:sz w:val="26"/>
-                <w:szCs w:val="26"/>
-              </w:rPr>
-              <w:t xml:space="preserve">UGX 2,500,000</w:t>
-            </w:r>
-          </w:p>
-          <w:p>
-            <w:pPr>
-              <w:spacing w:before="0" w:after="0"/>
-              <w:jc w:val="center"/>
-            </w:pPr>
-            <w:r>
-              <w:rPr>
-                <w:rFonts w:ascii="Arial" w:cs="Arial" w:eastAsia="Arial" w:hAnsi="Arial"/>
-                <w:color w:val="6B84A0"/>
+            <w:tcW w:type="dxa" w:w="6548"/>
+            <w:tcBorders>
+              <w:top w:val="none" w:color="auto" w:sz="0"/>
+              <w:left w:val="none" w:color="auto" w:sz="0"/>
+              <w:bottom w:val="none" w:color="auto" w:sz="0"/>
+              <w:right w:val="none" w:color="auto" w:sz="0"/>
+            </w:tcBorders>
+            <w:shd w:fill="070F1E" w:val="clear"/>
+            <w:tcMar>
+              <w:top w:type="dxa" w:w="110"/>
+              <w:left w:type="dxa" w:w="460"/>
+              <w:bottom w:type="dxa" w:w="110"/>
+              <w:right w:type="dxa" w:w="0"/>
+            </w:tcMar>
+          </w:tcPr>
+          <w:p>
+            <w:pPr>
+              <w:spacing w:before="0" w:after="0"/>
+            </w:pPr>
+            <w:r>
+              <w:rPr>
+                <w:rFonts w:ascii="Arial" w:cs="Arial" w:eastAsia="Arial" w:hAnsi="Arial"/>
+                <w:color w:val="3A6090"/>
                 <w:sz w:val="16"/>
                 <w:szCs w:val="16"/>
               </w:rPr>
-              <w:t xml:space="preserve">One-time deployment</w:t>
-            </w:r>
-          </w:p>
-        </w:tc>
-        <w:tc>
-          <w:tcPr>
-            <w:tcW w:type="dxa" w:w="2257"/>
-            <w:tcBorders>
-              <w:top w:val="none" w:color="FFFFFF" w:sz="0"/>
-              <w:left w:val="none" w:color="FFFFFF" w:sz="0"/>
-              <w:bottom w:val="none" w:color="FFFFFF" w:sz="0"/>
-              <w:right w:val="none" w:color="FFFFFF" w:sz="0"/>
-            </w:tcBorders>
-            <w:shd w:fill="D6E8FF" w:val="clear"/>
-            <w:tcMar>
-              <w:top w:type="dxa" w:w="80"/>
-              <w:left w:type="dxa" w:w="120"/>
-              <w:bottom w:type="dxa" w:w="120"/>
-              <w:right w:type="dxa" w:w="120"/>
-            </w:tcMar>
-          </w:tcPr>
-          <w:p>
-            <w:pPr>
-              <w:spacing w:before="0" w:after="20"/>
-              <w:jc w:val="center"/>
-            </w:pPr>
-            <w:r>
-              <w:rPr>
-                <w:rFonts w:ascii="Arial" w:cs="Arial" w:eastAsia="Arial" w:hAnsi="Arial"/>
-                <w:b/>
-                <w:bCs/>
-                <w:color w:val="0F2D5A"/>
-                <w:sz w:val="26"/>
-                <w:szCs w:val="26"/>
-              </w:rPr>
-              <w:t xml:space="preserve">UGX 3,500,000</w:t>
-            </w:r>
-          </w:p>
-          <w:p>
-            <w:pPr>
-              <w:spacing w:before="0" w:after="0"/>
-              <w:jc w:val="center"/>
-            </w:pPr>
-            <w:r>
-              <w:rPr>
-                <w:rFonts w:ascii="Arial" w:cs="Arial" w:eastAsia="Arial" w:hAnsi="Arial"/>
-                <w:color w:val="6B84A0"/>
+              <w:t xml:space="preserve">Powered by Mifos X / Apache Fineract · Certified Digital Public Good</w:t>
+            </w:r>
+          </w:p>
+        </w:tc>
+        <w:tc>
+          <w:tcPr>
+            <w:tcW w:type="dxa" w:w="5358"/>
+            <w:tcBorders>
+              <w:top w:val="none" w:color="auto" w:sz="0"/>
+              <w:left w:val="none" w:color="auto" w:sz="0"/>
+              <w:bottom w:val="none" w:color="auto" w:sz="0"/>
+              <w:right w:val="none" w:color="auto" w:sz="0"/>
+            </w:tcBorders>
+            <w:shd w:fill="070F1E" w:val="clear"/>
+            <w:tcMar>
+              <w:top w:type="dxa" w:w="110"/>
+              <w:left w:type="dxa" w:w="0"/>
+              <w:bottom w:type="dxa" w:w="110"/>
+              <w:right w:type="dxa" w:w="460"/>
+            </w:tcMar>
+          </w:tcPr>
+          <w:p>
+            <w:pPr>
+              <w:spacing w:before="0" w:after="0"/>
+              <w:jc w:val="right"/>
+            </w:pPr>
+            <w:r>
+              <w:rPr>
+                <w:rFonts w:ascii="Arial" w:cs="Arial" w:eastAsia="Arial" w:hAnsi="Arial"/>
+                <w:color w:val="3A6090"/>
                 <w:sz w:val="16"/>
                 <w:szCs w:val="16"/>
               </w:rPr>
-              <w:t xml:space="preserve">One-time deployment</w:t>
-            </w:r>
-          </w:p>
-        </w:tc>
-        <w:tc>
-          <w:tcPr>
-            <w:tcW w:type="dxa" w:w="2257"/>
-            <w:tcBorders>
-              <w:top w:val="none" w:color="FFFFFF" w:sz="0"/>
-              <w:left w:val="none" w:color="FFFFFF" w:sz="0"/>
-              <w:bottom w:val="none" w:color="FFFFFF" w:sz="0"/>
-              <w:right w:val="none" w:color="FFFFFF" w:sz="0"/>
-            </w:tcBorders>
-            <w:shd w:fill="D0DCF0" w:val="clear"/>
-            <w:tcMar>
-              <w:top w:type="dxa" w:w="80"/>
-              <w:left w:type="dxa" w:w="120"/>
-              <w:bottom w:type="dxa" w:w="120"/>
-              <w:right w:type="dxa" w:w="120"/>
-            </w:tcMar>
-          </w:tcPr>
-          <w:p>
-            <w:pPr>
-              <w:spacing w:before="0" w:after="20"/>
-              <w:jc w:val="center"/>
-            </w:pPr>
-            <w:r>
-              <w:rPr>
-                <w:rFonts w:ascii="Arial" w:cs="Arial" w:eastAsia="Arial" w:hAnsi="Arial"/>
-                <w:b/>
-                <w:bCs/>
-                <w:color w:val="0F2D5A"/>
-                <w:sz w:val="26"/>
-                <w:szCs w:val="26"/>
-              </w:rPr>
-              <w:t xml:space="preserve">UGX 5,500,000+</w:t>
-            </w:r>
-          </w:p>
-          <w:p>
-            <w:pPr>
-              <w:spacing w:before="0" w:after="0"/>
-              <w:jc w:val="center"/>
-            </w:pPr>
-            <w:r>
-              <w:rPr>
-                <w:rFonts w:ascii="Arial" w:cs="Arial" w:eastAsia="Arial" w:hAnsi="Arial"/>
-                <w:color w:val="6B84A0"/>
-                <w:sz w:val="16"/>
-                <w:szCs w:val="16"/>
-              </w:rPr>
-              <w:t xml:space="preserve">Custom scoped</w:t>
-            </w:r>
-          </w:p>
-        </w:tc>
-        <w:tc>
-          <w:tcPr>
-            <w:tcW w:type="dxa" w:w="2256"/>
-            <w:tcBorders>
-              <w:top w:val="none" w:color="FFFFFF" w:sz="0"/>
-              <w:left w:val="none" w:color="FFFFFF" w:sz="0"/>
-              <w:bottom w:val="none" w:color="FFFFFF" w:sz="0"/>
-              <w:right w:val="none" w:color="FFFFFF" w:sz="0"/>
-            </w:tcBorders>
-            <w:shd w:fill="EEF5FF" w:val="clear"/>
-            <w:tcMar>
-              <w:top w:type="dxa" w:w="80"/>
-              <w:left w:type="dxa" w:w="120"/>
-              <w:bottom w:type="dxa" w:w="120"/>
-              <w:right w:type="dxa" w:w="120"/>
-            </w:tcMar>
-          </w:tcPr>
-          <w:p>
-            <w:pPr>
-              <w:spacing w:before="0" w:after="20"/>
-              <w:jc w:val="center"/>
-            </w:pPr>
-            <w:r>
-              <w:rPr>
-                <w:rFonts w:ascii="Arial" w:cs="Arial" w:eastAsia="Arial" w:hAnsi="Arial"/>
-                <w:b/>
-                <w:bCs/>
-                <w:color w:val="1565C0"/>
-                <w:sz w:val="26"/>
-                <w:szCs w:val="26"/>
-              </w:rPr>
-              <w:t xml:space="preserve">UGX 400,000</w:t>
-            </w:r>
-          </w:p>
-          <w:p>
-            <w:pPr>
-              <w:spacing w:before="0" w:after="0"/>
-              <w:jc w:val="center"/>
-            </w:pPr>
-            <w:r>
-              <w:rPr>
-                <w:rFonts w:ascii="Arial" w:cs="Arial" w:eastAsia="Arial" w:hAnsi="Arial"/>
-                <w:color w:val="6B84A0"/>
-                <w:sz w:val="16"/>
-                <w:szCs w:val="16"/>
-              </w:rPr>
-              <w:t xml:space="preserve">Per month · all tiers</w:t>
+              <w:t xml:space="preserve">legitimo.tech · Confidential</w:t>
             </w:r>
           </w:p>
         </w:tc>
@@ -486,26 +696,18 @@
     </w:tbl>
     <w:p>
       <w:pPr>
-        <w:spacing w:before="200" w:after="0"/>
+        <w:sectPr>
+          <w:type w:val="nextPage"/>
+          <w:pgSz w:w="11906" w:h="16838" w:orient="portrait"/>
+          <w:pgMar w:top="0" w:right="0" w:bottom="0" w:left="0" w:header="708" w:footer="708" w:gutter="0"/>
+          <w:pgNumType/>
+          <w:docGrid w:linePitch="360"/>
+        </w:sectPr>
       </w:pPr>
-      <w:r>
-        <w:rPr>
-          <w:rFonts w:ascii="Arial" w:cs="Arial" w:eastAsia="Arial" w:hAnsi="Arial"/>
-          <w:color w:val="334E6E"/>
-          <w:sz w:val="20"/>
-          <w:szCs w:val="20"/>
-        </w:rPr>
-        <w:t xml:space="preserve"/>
-      </w:r>
-    </w:p>
-    <w:p>
-      <w:r>
-        <w:br w:type="page"/>
-      </w:r>
     </w:p>
     <w:p>
       <w:pPr>
-        <w:spacing w:before="200" w:after="60"/>
+        <w:spacing w:before="220" w:after="60"/>
       </w:pPr>
       <w:r>
         <w:rPr>
@@ -513,7 +715,7 @@
           <w:b/>
           <w:bCs/>
           <w:color w:val="1E88E5"/>
-          <w:spacing w:val="40"/>
+          <w:spacing w:val="50"/>
           <w:sz w:val="16"/>
           <w:szCs w:val="16"/>
         </w:rPr>
@@ -523,9 +725,9 @@
     <w:p>
       <w:pPr>
         <w:pBdr>
-          <w:bottom w:val="single" w:color="1E88E5" w:sz="8" w:space="4"/>
+          <w:bottom w:val="single" w:color="1E88E5" w:sz="10" w:space="4"/>
         </w:pBdr>
-        <w:spacing w:before="0" w:after="80"/>
+        <w:spacing w:before="0" w:after="100"/>
       </w:pPr>
       <w:r>
         <w:rPr>
@@ -533,8 +735,8 @@
           <w:b/>
           <w:bCs/>
           <w:color w:val="0F2D5A"/>
-          <w:sz w:val="36"/>
-          <w:szCs w:val="36"/>
+          <w:sz w:val="34"/>
+          <w:szCs w:val="34"/>
         </w:rPr>
         <w:t xml:space="preserve">Deployment Packages — Feature Comparison</w:t>
       </w:r>
@@ -583,7 +785,7 @@
     </w:p>
     <w:tbl>
       <w:tblPr>
-        <w:tblW w:type="dxa" w:w="9026"/>
+        <w:tblW w:type="dxa" w:w="9746"/>
         <w:tblBorders>
           <w:top w:val="single" w:color="auto" w:sz="4"/>
           <w:left w:val="single" w:color="auto" w:sz="4"/>
@@ -594,10 +796,10 @@
         </w:tblBorders>
       </w:tblPr>
       <w:tblGrid>
-        <w:gridCol w:w="3255"/>
-        <w:gridCol w:w="2257"/>
-        <w:gridCol w:w="2257"/>
-        <w:gridCol w:w="2257"/>
+        <w:gridCol w:w="3000"/>
+        <w:gridCol w:w="2248"/>
+        <w:gridCol w:w="2248"/>
+        <w:gridCol w:w="2250"/>
       </w:tblGrid>
       <w:tr>
         <w:trPr>
@@ -605,7 +807,7 @@
         </w:trPr>
         <w:tc>
           <w:tcPr>
-            <w:tcW w:type="dxa" w:w="2257"/>
+            <w:tcW w:type="dxa" w:w="3000"/>
             <w:tcBorders>
               <w:top w:val="single" w:color="C5DDF9" w:sz="4"/>
               <w:left w:val="single" w:color="C5DDF9" w:sz="4"/>
@@ -617,7 +819,41 @@
               <w:top w:type="dxa" w:w="100"/>
               <w:left w:type="dxa" w:w="120"/>
               <w:bottom w:type="dxa" w:w="100"/>
-              <w:right w:type="dxa" w:w="120"/>
+              <w:right w:type="dxa" w:w="80"/>
+            </w:tcMar>
+          </w:tcPr>
+          <w:p>
+            <w:pPr>
+              <w:spacing w:before="0" w:after="0"/>
+            </w:pPr>
+            <w:r>
+              <w:rPr>
+                <w:rFonts w:ascii="Arial" w:cs="Arial" w:eastAsia="Arial" w:hAnsi="Arial"/>
+                <w:b/>
+                <w:bCs/>
+                <w:color w:val="FFFFFF"/>
+                <w:sz w:val="17"/>
+                <w:szCs w:val="17"/>
+              </w:rPr>
+              <w:t xml:space="preserve">Feature</w:t>
+            </w:r>
+          </w:p>
+        </w:tc>
+        <w:tc>
+          <w:tcPr>
+            <w:tcW w:type="dxa" w:w="2248"/>
+            <w:tcBorders>
+              <w:top w:val="single" w:color="C5DDF9" w:sz="4"/>
+              <w:left w:val="single" w:color="C5DDF9" w:sz="4"/>
+              <w:bottom w:val="single" w:color="C5DDF9" w:sz="4"/>
+              <w:right w:val="single" w:color="C5DDF9" w:sz="4"/>
+            </w:tcBorders>
+            <w:shd w:fill="1040A0" w:val="clear"/>
+            <w:tcMar>
+              <w:top w:type="dxa" w:w="100"/>
+              <w:left w:type="dxa" w:w="100"/>
+              <w:bottom w:type="dxa" w:w="100"/>
+              <w:right w:type="dxa" w:w="100"/>
             </w:tcMar>
             <w:vAlign w:val="center"/>
           </w:tcPr>
@@ -631,30 +867,30 @@
                 <w:rFonts w:ascii="Arial" w:cs="Arial" w:eastAsia="Arial" w:hAnsi="Arial"/>
                 <w:b/>
                 <w:bCs/>
-                <w:color w:val="FFFFFF"/>
-                <w:spacing w:val="20"/>
-                <w:sz w:val="18"/>
-                <w:szCs w:val="18"/>
-              </w:rPr>
-              <w:t xml:space="preserve">FEATURE</w:t>
-            </w:r>
-          </w:p>
-        </w:tc>
-        <w:tc>
-          <w:tcPr>
-            <w:tcW w:type="dxa" w:w="2257"/>
-            <w:tcBorders>
-              <w:top w:val="single" w:color="C5DDF9" w:sz="4"/>
-              <w:left w:val="single" w:color="C5DDF9" w:sz="4"/>
-              <w:bottom w:val="single" w:color="C5DDF9" w:sz="4"/>
-              <w:right w:val="single" w:color="C5DDF9" w:sz="4"/>
-            </w:tcBorders>
-            <w:shd w:fill="1040A0" w:val="clear"/>
+                <w:color w:val="7AACDB"/>
+                <w:spacing w:val="30"/>
+                <w:sz w:val="17"/>
+                <w:szCs w:val="17"/>
+              </w:rPr>
+              <w:t xml:space="preserve">BASIC</w:t>
+            </w:r>
+          </w:p>
+        </w:tc>
+        <w:tc>
+          <w:tcPr>
+            <w:tcW w:type="dxa" w:w="2248"/>
+            <w:tcBorders>
+              <w:top w:val="single" w:color="C5DDF9" w:sz="4"/>
+              <w:left w:val="single" w:color="C5DDF9" w:sz="4"/>
+              <w:bottom w:val="single" w:color="C5DDF9" w:sz="4"/>
+              <w:right w:val="single" w:color="C5DDF9" w:sz="4"/>
+            </w:tcBorders>
+            <w:shd w:fill="0D3A8A" w:val="clear"/>
             <w:tcMar>
               <w:top w:type="dxa" w:w="100"/>
-              <w:left w:type="dxa" w:w="120"/>
+              <w:left w:type="dxa" w:w="100"/>
               <w:bottom w:type="dxa" w:w="100"/>
-              <w:right w:type="dxa" w:w="120"/>
+              <w:right w:type="dxa" w:w="100"/>
             </w:tcMar>
             <w:vAlign w:val="center"/>
           </w:tcPr>
@@ -668,30 +904,30 @@
                 <w:rFonts w:ascii="Arial" w:cs="Arial" w:eastAsia="Arial" w:hAnsi="Arial"/>
                 <w:b/>
                 <w:bCs/>
-                <w:color w:val="FFFFFF"/>
-                <w:spacing w:val="20"/>
-                <w:sz w:val="18"/>
-                <w:szCs w:val="18"/>
-              </w:rPr>
-              <w:t xml:space="preserve">BASIC</w:t>
-            </w:r>
-          </w:p>
-        </w:tc>
-        <w:tc>
-          <w:tcPr>
-            <w:tcW w:type="dxa" w:w="2257"/>
-            <w:tcBorders>
-              <w:top w:val="single" w:color="C5DDF9" w:sz="4"/>
-              <w:left w:val="single" w:color="C5DDF9" w:sz="4"/>
-              <w:bottom w:val="single" w:color="C5DDF9" w:sz="4"/>
-              <w:right w:val="single" w:color="C5DDF9" w:sz="4"/>
-            </w:tcBorders>
-            <w:shd w:fill="0D3A8A" w:val="clear"/>
+                <w:color w:val="7AACDB"/>
+                <w:spacing w:val="30"/>
+                <w:sz w:val="17"/>
+                <w:szCs w:val="17"/>
+              </w:rPr>
+              <w:t xml:space="preserve">PROFESSIONAL</w:t>
+            </w:r>
+          </w:p>
+        </w:tc>
+        <w:tc>
+          <w:tcPr>
+            <w:tcW w:type="dxa" w:w="2248"/>
+            <w:tcBorders>
+              <w:top w:val="single" w:color="C5DDF9" w:sz="4"/>
+              <w:left w:val="single" w:color="C5DDF9" w:sz="4"/>
+              <w:bottom w:val="single" w:color="C5DDF9" w:sz="4"/>
+              <w:right w:val="single" w:color="C5DDF9" w:sz="4"/>
+            </w:tcBorders>
+            <w:shd w:fill="0F2D5A" w:val="clear"/>
             <w:tcMar>
               <w:top w:type="dxa" w:w="100"/>
-              <w:left w:type="dxa" w:w="120"/>
+              <w:left w:type="dxa" w:w="100"/>
               <w:bottom w:type="dxa" w:w="100"/>
-              <w:right w:type="dxa" w:w="120"/>
+              <w:right w:type="dxa" w:w="100"/>
             </w:tcMar>
             <w:vAlign w:val="center"/>
           </w:tcPr>
@@ -705,47 +941,10 @@
                 <w:rFonts w:ascii="Arial" w:cs="Arial" w:eastAsia="Arial" w:hAnsi="Arial"/>
                 <w:b/>
                 <w:bCs/>
-                <w:color w:val="FFFFFF"/>
-                <w:spacing w:val="20"/>
-                <w:sz w:val="18"/>
-                <w:szCs w:val="18"/>
-              </w:rPr>
-              <w:t xml:space="preserve">PROFESSIONAL</w:t>
-            </w:r>
-          </w:p>
-        </w:tc>
-        <w:tc>
-          <w:tcPr>
-            <w:tcW w:type="dxa" w:w="2257"/>
-            <w:tcBorders>
-              <w:top w:val="single" w:color="C5DDF9" w:sz="4"/>
-              <w:left w:val="single" w:color="C5DDF9" w:sz="4"/>
-              <w:bottom w:val="single" w:color="C5DDF9" w:sz="4"/>
-              <w:right w:val="single" w:color="C5DDF9" w:sz="4"/>
-            </w:tcBorders>
-            <w:shd w:fill="0F2D5A" w:val="clear"/>
-            <w:tcMar>
-              <w:top w:type="dxa" w:w="100"/>
-              <w:left w:type="dxa" w:w="120"/>
-              <w:bottom w:type="dxa" w:w="100"/>
-              <w:right w:type="dxa" w:w="120"/>
-            </w:tcMar>
-            <w:vAlign w:val="center"/>
-          </w:tcPr>
-          <w:p>
-            <w:pPr>
-              <w:spacing w:before="0" w:after="0"/>
-              <w:jc w:val="center"/>
-            </w:pPr>
-            <w:r>
-              <w:rPr>
-                <w:rFonts w:ascii="Arial" w:cs="Arial" w:eastAsia="Arial" w:hAnsi="Arial"/>
-                <w:b/>
-                <w:bCs/>
-                <w:color w:val="FFFFFF"/>
-                <w:spacing w:val="20"/>
-                <w:sz w:val="18"/>
-                <w:szCs w:val="18"/>
+                <w:color w:val="7AACDB"/>
+                <w:spacing w:val="30"/>
+                <w:sz w:val="17"/>
+                <w:szCs w:val="17"/>
               </w:rPr>
               <w:t xml:space="preserve">ENTERPRISE</w:t>
             </w:r>
@@ -755,19 +954,19 @@
       <w:tr>
         <w:tc>
           <w:tcPr>
-            <w:tcW w:type="dxa" w:w="3255"/>
-            <w:tcBorders>
-              <w:top w:val="single" w:color="C5DDF9" w:sz="4"/>
-              <w:left w:val="single" w:color="C5DDF9" w:sz="4"/>
-              <w:bottom w:val="single" w:color="C5DDF9" w:sz="4"/>
-              <w:right w:val="single" w:color="C5DDF9" w:sz="4"/>
-            </w:tcBorders>
-            <w:shd w:fill="F4F8FF" w:val="clear"/>
+            <w:tcW w:type="dxa" w:w="3000"/>
+            <w:tcBorders>
+              <w:top w:val="single" w:color="C5DDF9" w:sz="4"/>
+              <w:left w:val="single" w:color="C5DDF9" w:sz="4"/>
+              <w:bottom w:val="single" w:color="C5DDF9" w:sz="4"/>
+              <w:right w:val="single" w:color="C5DDF9" w:sz="4"/>
+            </w:tcBorders>
+            <w:shd w:fill="EEF5FF" w:val="clear"/>
             <w:tcMar>
               <w:top w:type="dxa" w:w="80"/>
               <w:left w:type="dxa" w:w="120"/>
               <w:bottom w:type="dxa" w:w="80"/>
-              <w:right w:type="dxa" w:w="120"/>
+              <w:right w:type="dxa" w:w="80"/>
             </w:tcMar>
             <w:vAlign w:val="center"/>
           </w:tcPr>
@@ -790,7 +989,7 @@
         </w:tc>
         <w:tc>
           <w:tcPr>
-            <w:tcW w:type="dxa" w:w="2257"/>
+            <w:tcW w:type="dxa" w:w="2248"/>
             <w:tcBorders>
               <w:top w:val="single" w:color="C5DDF9" w:sz="4"/>
               <w:left w:val="single" w:color="C5DDF9" w:sz="4"/>
@@ -800,9 +999,9 @@
             <w:shd w:fill="EEF5FF" w:val="clear"/>
             <w:tcMar>
               <w:top w:type="dxa" w:w="100"/>
-              <w:left w:type="dxa" w:w="120"/>
+              <w:left w:type="dxa" w:w="80"/>
               <w:bottom w:type="dxa" w:w="100"/>
-              <w:right w:type="dxa" w:w="120"/>
+              <w:right w:type="dxa" w:w="80"/>
             </w:tcMar>
             <w:vAlign w:val="center"/>
           </w:tcPr>
@@ -817,8 +1016,8 @@
                 <w:b/>
                 <w:bCs/>
                 <w:color w:val="0F2D5A"/>
-                <w:sz w:val="24"/>
-                <w:szCs w:val="24"/>
+                <w:sz w:val="22"/>
+                <w:szCs w:val="22"/>
               </w:rPr>
               <w:t xml:space="preserve">UGX 2,500,000</w:t>
             </w:r>
@@ -826,19 +1025,19 @@
         </w:tc>
         <w:tc>
           <w:tcPr>
-            <w:tcW w:type="dxa" w:w="2257"/>
-            <w:tcBorders>
-              <w:top w:val="single" w:color="C5DDF9" w:sz="4"/>
-              <w:left w:val="single" w:color="C5DDF9" w:sz="4"/>
-              <w:bottom w:val="single" w:color="C5DDF9" w:sz="4"/>
-              <w:right w:val="single" w:color="C5DDF9" w:sz="4"/>
-            </w:tcBorders>
-            <w:shd w:fill="D6E8FF" w:val="clear"/>
+            <w:tcW w:type="dxa" w:w="2248"/>
+            <w:tcBorders>
+              <w:top w:val="single" w:color="C5DDF9" w:sz="4"/>
+              <w:left w:val="single" w:color="C5DDF9" w:sz="4"/>
+              <w:bottom w:val="single" w:color="C5DDF9" w:sz="4"/>
+              <w:right w:val="single" w:color="C5DDF9" w:sz="4"/>
+            </w:tcBorders>
+            <w:shd w:fill="D0E4FF" w:val="clear"/>
             <w:tcMar>
               <w:top w:type="dxa" w:w="100"/>
-              <w:left w:type="dxa" w:w="120"/>
+              <w:left w:type="dxa" w:w="80"/>
               <w:bottom w:type="dxa" w:w="100"/>
-              <w:right w:type="dxa" w:w="120"/>
+              <w:right w:type="dxa" w:w="80"/>
             </w:tcMar>
             <w:vAlign w:val="center"/>
           </w:tcPr>
@@ -853,8 +1052,8 @@
                 <w:b/>
                 <w:bCs/>
                 <w:color w:val="0F2D5A"/>
-                <w:sz w:val="24"/>
-                <w:szCs w:val="24"/>
+                <w:sz w:val="22"/>
+                <w:szCs w:val="22"/>
               </w:rPr>
               <w:t xml:space="preserve">UGX 3,500,000</w:t>
             </w:r>
@@ -862,19 +1061,19 @@
         </w:tc>
         <w:tc>
           <w:tcPr>
-            <w:tcW w:type="dxa" w:w="2257"/>
-            <w:tcBorders>
-              <w:top w:val="single" w:color="C5DDF9" w:sz="4"/>
-              <w:left w:val="single" w:color="C5DDF9" w:sz="4"/>
-              <w:bottom w:val="single" w:color="C5DDF9" w:sz="4"/>
-              <w:right w:val="single" w:color="C5DDF9" w:sz="4"/>
-            </w:tcBorders>
-            <w:shd w:fill="D0DCF0" w:val="clear"/>
+            <w:tcW w:type="dxa" w:w="2248"/>
+            <w:tcBorders>
+              <w:top w:val="single" w:color="C5DDF9" w:sz="4"/>
+              <w:left w:val="single" w:color="C5DDF9" w:sz="4"/>
+              <w:bottom w:val="single" w:color="C5DDF9" w:sz="4"/>
+              <w:right w:val="single" w:color="C5DDF9" w:sz="4"/>
+            </w:tcBorders>
+            <w:shd w:fill="C8D8F0" w:val="clear"/>
             <w:tcMar>
               <w:top w:type="dxa" w:w="100"/>
-              <w:left w:type="dxa" w:w="120"/>
+              <w:left w:type="dxa" w:w="80"/>
               <w:bottom w:type="dxa" w:w="100"/>
-              <w:right w:type="dxa" w:w="120"/>
+              <w:right w:type="dxa" w:w="80"/>
             </w:tcMar>
             <w:vAlign w:val="center"/>
           </w:tcPr>
@@ -889,8 +1088,8 @@
                 <w:b/>
                 <w:bCs/>
                 <w:color w:val="0F2D5A"/>
-                <w:sz w:val="24"/>
-                <w:szCs w:val="24"/>
+                <w:sz w:val="22"/>
+                <w:szCs w:val="22"/>
               </w:rPr>
               <w:t xml:space="preserve">UGX 5,500,000+</w:t>
             </w:r>
@@ -900,19 +1099,19 @@
       <w:tr>
         <w:tc>
           <w:tcPr>
-            <w:tcW w:type="dxa" w:w="3255"/>
-            <w:tcBorders>
-              <w:top w:val="single" w:color="C5DDF9" w:sz="4"/>
-              <w:left w:val="single" w:color="C5DDF9" w:sz="4"/>
-              <w:bottom w:val="single" w:color="C5DDF9" w:sz="4"/>
-              <w:right w:val="single" w:color="C5DDF9" w:sz="4"/>
-            </w:tcBorders>
-            <w:shd w:fill="EEF5FF" w:val="clear"/>
+            <w:tcW w:type="dxa" w:w="3000"/>
+            <w:tcBorders>
+              <w:top w:val="single" w:color="C5DDF9" w:sz="4"/>
+              <w:left w:val="single" w:color="C5DDF9" w:sz="4"/>
+              <w:bottom w:val="single" w:color="C5DDF9" w:sz="4"/>
+              <w:right w:val="single" w:color="C5DDF9" w:sz="4"/>
+            </w:tcBorders>
+            <w:shd w:fill="F4F8FF" w:val="clear"/>
             <w:tcMar>
               <w:top w:type="dxa" w:w="80"/>
               <w:left w:type="dxa" w:w="120"/>
               <w:bottom w:type="dxa" w:w="80"/>
-              <w:right w:type="dxa" w:w="120"/>
+              <w:right w:type="dxa" w:w="80"/>
             </w:tcMar>
             <w:vAlign w:val="center"/>
           </w:tcPr>
@@ -935,19 +1134,19 @@
         </w:tc>
         <w:tc>
           <w:tcPr>
-            <w:tcW w:type="dxa" w:w="2257"/>
-            <w:tcBorders>
-              <w:top w:val="single" w:color="C5DDF9" w:sz="4"/>
-              <w:left w:val="single" w:color="C5DDF9" w:sz="4"/>
-              <w:bottom w:val="single" w:color="C5DDF9" w:sz="4"/>
-              <w:right w:val="single" w:color="C5DDF9" w:sz="4"/>
-            </w:tcBorders>
-            <w:shd w:fill="EEF5FF" w:val="clear"/>
-            <w:tcMar>
-              <w:top w:type="dxa" w:w="80"/>
-              <w:left w:type="dxa" w:w="120"/>
-              <w:bottom w:type="dxa" w:w="80"/>
-              <w:right w:type="dxa" w:w="120"/>
+            <w:tcW w:type="dxa" w:w="2248"/>
+            <w:tcBorders>
+              <w:top w:val="single" w:color="C5DDF9" w:sz="4"/>
+              <w:left w:val="single" w:color="C5DDF9" w:sz="4"/>
+              <w:bottom w:val="single" w:color="C5DDF9" w:sz="4"/>
+              <w:right w:val="single" w:color="C5DDF9" w:sz="4"/>
+            </w:tcBorders>
+            <w:shd w:fill="FFFFFF" w:val="clear"/>
+            <w:tcMar>
+              <w:top w:type="dxa" w:w="80"/>
+              <w:left w:type="dxa" w:w="80"/>
+              <w:bottom w:type="dxa" w:w="80"/>
+              <w:right w:type="dxa" w:w="80"/>
             </w:tcMar>
             <w:vAlign w:val="center"/>
           </w:tcPr>
@@ -971,19 +1170,19 @@
         </w:tc>
         <w:tc>
           <w:tcPr>
-            <w:tcW w:type="dxa" w:w="2257"/>
-            <w:tcBorders>
-              <w:top w:val="single" w:color="C5DDF9" w:sz="4"/>
-              <w:left w:val="single" w:color="C5DDF9" w:sz="4"/>
-              <w:bottom w:val="single" w:color="C5DDF9" w:sz="4"/>
-              <w:right w:val="single" w:color="C5DDF9" w:sz="4"/>
-            </w:tcBorders>
-            <w:shd w:fill="EEF5FF" w:val="clear"/>
-            <w:tcMar>
-              <w:top w:type="dxa" w:w="80"/>
-              <w:left w:type="dxa" w:w="120"/>
-              <w:bottom w:type="dxa" w:w="80"/>
-              <w:right w:type="dxa" w:w="120"/>
+            <w:tcW w:type="dxa" w:w="2248"/>
+            <w:tcBorders>
+              <w:top w:val="single" w:color="C5DDF9" w:sz="4"/>
+              <w:left w:val="single" w:color="C5DDF9" w:sz="4"/>
+              <w:bottom w:val="single" w:color="C5DDF9" w:sz="4"/>
+              <w:right w:val="single" w:color="C5DDF9" w:sz="4"/>
+            </w:tcBorders>
+            <w:shd w:fill="F0F5FF" w:val="clear"/>
+            <w:tcMar>
+              <w:top w:type="dxa" w:w="80"/>
+              <w:left w:type="dxa" w:w="80"/>
+              <w:bottom w:type="dxa" w:w="80"/>
+              <w:right w:type="dxa" w:w="80"/>
             </w:tcMar>
             <w:vAlign w:val="center"/>
           </w:tcPr>
@@ -1007,19 +1206,19 @@
         </w:tc>
         <w:tc>
           <w:tcPr>
-            <w:tcW w:type="dxa" w:w="2257"/>
-            <w:tcBorders>
-              <w:top w:val="single" w:color="C5DDF9" w:sz="4"/>
-              <w:left w:val="single" w:color="C5DDF9" w:sz="4"/>
-              <w:bottom w:val="single" w:color="C5DDF9" w:sz="4"/>
-              <w:right w:val="single" w:color="C5DDF9" w:sz="4"/>
-            </w:tcBorders>
-            <w:shd w:fill="EEF5FF" w:val="clear"/>
-            <w:tcMar>
-              <w:top w:type="dxa" w:w="80"/>
-              <w:left w:type="dxa" w:w="120"/>
-              <w:bottom w:type="dxa" w:w="80"/>
-              <w:right w:type="dxa" w:w="120"/>
+            <w:tcW w:type="dxa" w:w="2248"/>
+            <w:tcBorders>
+              <w:top w:val="single" w:color="C5DDF9" w:sz="4"/>
+              <w:left w:val="single" w:color="C5DDF9" w:sz="4"/>
+              <w:bottom w:val="single" w:color="C5DDF9" w:sz="4"/>
+              <w:right w:val="single" w:color="C5DDF9" w:sz="4"/>
+            </w:tcBorders>
+            <w:shd w:fill="F0F5FF" w:val="clear"/>
+            <w:tcMar>
+              <w:top w:type="dxa" w:w="80"/>
+              <w:left w:type="dxa" w:w="80"/>
+              <w:bottom w:type="dxa" w:w="80"/>
+              <w:right w:type="dxa" w:w="80"/>
             </w:tcMar>
             <w:vAlign w:val="center"/>
           </w:tcPr>
@@ -1045,19 +1244,19 @@
       <w:tr>
         <w:tc>
           <w:tcPr>
-            <w:tcW w:type="dxa" w:w="3255"/>
-            <w:tcBorders>
-              <w:top w:val="single" w:color="C5DDF9" w:sz="4"/>
-              <w:left w:val="single" w:color="C5DDF9" w:sz="4"/>
-              <w:bottom w:val="single" w:color="C5DDF9" w:sz="4"/>
-              <w:right w:val="single" w:color="C5DDF9" w:sz="4"/>
-            </w:tcBorders>
-            <w:shd w:fill="F4F8FF" w:val="clear"/>
+            <w:tcW w:type="dxa" w:w="3000"/>
+            <w:tcBorders>
+              <w:top w:val="single" w:color="C5DDF9" w:sz="4"/>
+              <w:left w:val="single" w:color="C5DDF9" w:sz="4"/>
+              <w:bottom w:val="single" w:color="C5DDF9" w:sz="4"/>
+              <w:right w:val="single" w:color="C5DDF9" w:sz="4"/>
+            </w:tcBorders>
+            <w:shd w:fill="EEF5FF" w:val="clear"/>
             <w:tcMar>
               <w:top w:type="dxa" w:w="80"/>
               <w:left w:type="dxa" w:w="120"/>
               <w:bottom w:type="dxa" w:w="80"/>
-              <w:right w:type="dxa" w:w="120"/>
+              <w:right w:type="dxa" w:w="80"/>
             </w:tcMar>
             <w:vAlign w:val="center"/>
           </w:tcPr>
@@ -1080,19 +1279,19 @@
         </w:tc>
         <w:tc>
           <w:tcPr>
-            <w:tcW w:type="dxa" w:w="2257"/>
-            <w:tcBorders>
-              <w:top w:val="single" w:color="C5DDF9" w:sz="4"/>
-              <w:left w:val="single" w:color="C5DDF9" w:sz="4"/>
-              <w:bottom w:val="single" w:color="C5DDF9" w:sz="4"/>
-              <w:right w:val="single" w:color="C5DDF9" w:sz="4"/>
-            </w:tcBorders>
-            <w:shd w:fill="FFFFFF" w:val="clear"/>
-            <w:tcMar>
-              <w:top w:type="dxa" w:w="80"/>
-              <w:left w:type="dxa" w:w="120"/>
-              <w:bottom w:type="dxa" w:w="80"/>
-              <w:right w:type="dxa" w:w="120"/>
+            <w:tcW w:type="dxa" w:w="2248"/>
+            <w:tcBorders>
+              <w:top w:val="single" w:color="C5DDF9" w:sz="4"/>
+              <w:left w:val="single" w:color="C5DDF9" w:sz="4"/>
+              <w:bottom w:val="single" w:color="C5DDF9" w:sz="4"/>
+              <w:right w:val="single" w:color="C5DDF9" w:sz="4"/>
+            </w:tcBorders>
+            <w:shd w:fill="EEF5FF" w:val="clear"/>
+            <w:tcMar>
+              <w:top w:type="dxa" w:w="80"/>
+              <w:left w:type="dxa" w:w="80"/>
+              <w:bottom w:type="dxa" w:w="80"/>
+              <w:right w:type="dxa" w:w="80"/>
             </w:tcMar>
             <w:vAlign w:val="center"/>
           </w:tcPr>
@@ -1116,19 +1315,19 @@
         </w:tc>
         <w:tc>
           <w:tcPr>
-            <w:tcW w:type="dxa" w:w="2257"/>
-            <w:tcBorders>
-              <w:top w:val="single" w:color="C5DDF9" w:sz="4"/>
-              <w:left w:val="single" w:color="C5DDF9" w:sz="4"/>
-              <w:bottom w:val="single" w:color="C5DDF9" w:sz="4"/>
-              <w:right w:val="single" w:color="C5DDF9" w:sz="4"/>
-            </w:tcBorders>
-            <w:shd w:fill="F0F5FF" w:val="clear"/>
-            <w:tcMar>
-              <w:top w:type="dxa" w:w="80"/>
-              <w:left w:type="dxa" w:w="120"/>
-              <w:bottom w:type="dxa" w:w="80"/>
-              <w:right w:type="dxa" w:w="120"/>
+            <w:tcW w:type="dxa" w:w="2248"/>
+            <w:tcBorders>
+              <w:top w:val="single" w:color="C5DDF9" w:sz="4"/>
+              <w:left w:val="single" w:color="C5DDF9" w:sz="4"/>
+              <w:bottom w:val="single" w:color="C5DDF9" w:sz="4"/>
+              <w:right w:val="single" w:color="C5DDF9" w:sz="4"/>
+            </w:tcBorders>
+            <w:shd w:fill="EEF5FF" w:val="clear"/>
+            <w:tcMar>
+              <w:top w:type="dxa" w:w="80"/>
+              <w:left w:type="dxa" w:w="80"/>
+              <w:bottom w:type="dxa" w:w="80"/>
+              <w:right w:type="dxa" w:w="80"/>
             </w:tcMar>
             <w:vAlign w:val="center"/>
           </w:tcPr>
@@ -1152,19 +1351,19 @@
         </w:tc>
         <w:tc>
           <w:tcPr>
-            <w:tcW w:type="dxa" w:w="2257"/>
-            <w:tcBorders>
-              <w:top w:val="single" w:color="C5DDF9" w:sz="4"/>
-              <w:left w:val="single" w:color="C5DDF9" w:sz="4"/>
-              <w:bottom w:val="single" w:color="C5DDF9" w:sz="4"/>
-              <w:right w:val="single" w:color="C5DDF9" w:sz="4"/>
-            </w:tcBorders>
-            <w:shd w:fill="F0F5FF" w:val="clear"/>
-            <w:tcMar>
-              <w:top w:type="dxa" w:w="80"/>
-              <w:left w:type="dxa" w:w="120"/>
-              <w:bottom w:type="dxa" w:w="80"/>
-              <w:right w:type="dxa" w:w="120"/>
+            <w:tcW w:type="dxa" w:w="2248"/>
+            <w:tcBorders>
+              <w:top w:val="single" w:color="C5DDF9" w:sz="4"/>
+              <w:left w:val="single" w:color="C5DDF9" w:sz="4"/>
+              <w:bottom w:val="single" w:color="C5DDF9" w:sz="4"/>
+              <w:right w:val="single" w:color="C5DDF9" w:sz="4"/>
+            </w:tcBorders>
+            <w:shd w:fill="EEF5FF" w:val="clear"/>
+            <w:tcMar>
+              <w:top w:type="dxa" w:w="80"/>
+              <w:left w:type="dxa" w:w="80"/>
+              <w:bottom w:type="dxa" w:w="80"/>
+              <w:right w:type="dxa" w:w="80"/>
             </w:tcMar>
             <w:vAlign w:val="center"/>
           </w:tcPr>
@@ -1190,19 +1389,19 @@
       <w:tr>
         <w:tc>
           <w:tcPr>
-            <w:tcW w:type="dxa" w:w="3255"/>
-            <w:tcBorders>
-              <w:top w:val="single" w:color="C5DDF9" w:sz="4"/>
-              <w:left w:val="single" w:color="C5DDF9" w:sz="4"/>
-              <w:bottom w:val="single" w:color="C5DDF9" w:sz="4"/>
-              <w:right w:val="single" w:color="C5DDF9" w:sz="4"/>
-            </w:tcBorders>
-            <w:shd w:fill="EEF5FF" w:val="clear"/>
+            <w:tcW w:type="dxa" w:w="3000"/>
+            <w:tcBorders>
+              <w:top w:val="single" w:color="C5DDF9" w:sz="4"/>
+              <w:left w:val="single" w:color="C5DDF9" w:sz="4"/>
+              <w:bottom w:val="single" w:color="C5DDF9" w:sz="4"/>
+              <w:right w:val="single" w:color="C5DDF9" w:sz="4"/>
+            </w:tcBorders>
+            <w:shd w:fill="F4F8FF" w:val="clear"/>
             <w:tcMar>
               <w:top w:type="dxa" w:w="80"/>
               <w:left w:type="dxa" w:w="120"/>
               <w:bottom w:type="dxa" w:w="80"/>
-              <w:right w:type="dxa" w:w="120"/>
+              <w:right w:type="dxa" w:w="80"/>
             </w:tcMar>
             <w:vAlign w:val="center"/>
           </w:tcPr>
@@ -1225,19 +1424,19 @@
         </w:tc>
         <w:tc>
           <w:tcPr>
-            <w:tcW w:type="dxa" w:w="2257"/>
-            <w:tcBorders>
-              <w:top w:val="single" w:color="C5DDF9" w:sz="4"/>
-              <w:left w:val="single" w:color="C5DDF9" w:sz="4"/>
-              <w:bottom w:val="single" w:color="C5DDF9" w:sz="4"/>
-              <w:right w:val="single" w:color="C5DDF9" w:sz="4"/>
-            </w:tcBorders>
-            <w:shd w:fill="EEF5FF" w:val="clear"/>
-            <w:tcMar>
-              <w:top w:type="dxa" w:w="80"/>
-              <w:left w:type="dxa" w:w="120"/>
-              <w:bottom w:type="dxa" w:w="80"/>
-              <w:right w:type="dxa" w:w="120"/>
+            <w:tcW w:type="dxa" w:w="2248"/>
+            <w:tcBorders>
+              <w:top w:val="single" w:color="C5DDF9" w:sz="4"/>
+              <w:left w:val="single" w:color="C5DDF9" w:sz="4"/>
+              <w:bottom w:val="single" w:color="C5DDF9" w:sz="4"/>
+              <w:right w:val="single" w:color="C5DDF9" w:sz="4"/>
+            </w:tcBorders>
+            <w:shd w:fill="FFFFFF" w:val="clear"/>
+            <w:tcMar>
+              <w:top w:type="dxa" w:w="80"/>
+              <w:left w:type="dxa" w:w="80"/>
+              <w:bottom w:type="dxa" w:w="80"/>
+              <w:right w:type="dxa" w:w="80"/>
             </w:tcMar>
             <w:vAlign w:val="center"/>
           </w:tcPr>
@@ -1261,19 +1460,19 @@
         </w:tc>
         <w:tc>
           <w:tcPr>
-            <w:tcW w:type="dxa" w:w="2257"/>
-            <w:tcBorders>
-              <w:top w:val="single" w:color="C5DDF9" w:sz="4"/>
-              <w:left w:val="single" w:color="C5DDF9" w:sz="4"/>
-              <w:bottom w:val="single" w:color="C5DDF9" w:sz="4"/>
-              <w:right w:val="single" w:color="C5DDF9" w:sz="4"/>
-            </w:tcBorders>
-            <w:shd w:fill="EEF5FF" w:val="clear"/>
-            <w:tcMar>
-              <w:top w:type="dxa" w:w="80"/>
-              <w:left w:type="dxa" w:w="120"/>
-              <w:bottom w:type="dxa" w:w="80"/>
-              <w:right w:type="dxa" w:w="120"/>
+            <w:tcW w:type="dxa" w:w="2248"/>
+            <w:tcBorders>
+              <w:top w:val="single" w:color="C5DDF9" w:sz="4"/>
+              <w:left w:val="single" w:color="C5DDF9" w:sz="4"/>
+              <w:bottom w:val="single" w:color="C5DDF9" w:sz="4"/>
+              <w:right w:val="single" w:color="C5DDF9" w:sz="4"/>
+            </w:tcBorders>
+            <w:shd w:fill="F0F5FF" w:val="clear"/>
+            <w:tcMar>
+              <w:top w:type="dxa" w:w="80"/>
+              <w:left w:type="dxa" w:w="80"/>
+              <w:bottom w:type="dxa" w:w="80"/>
+              <w:right w:type="dxa" w:w="80"/>
             </w:tcMar>
             <w:vAlign w:val="center"/>
           </w:tcPr>
@@ -1297,19 +1496,19 @@
         </w:tc>
         <w:tc>
           <w:tcPr>
-            <w:tcW w:type="dxa" w:w="2257"/>
-            <w:tcBorders>
-              <w:top w:val="single" w:color="C5DDF9" w:sz="4"/>
-              <w:left w:val="single" w:color="C5DDF9" w:sz="4"/>
-              <w:bottom w:val="single" w:color="C5DDF9" w:sz="4"/>
-              <w:right w:val="single" w:color="C5DDF9" w:sz="4"/>
-            </w:tcBorders>
-            <w:shd w:fill="EEF5FF" w:val="clear"/>
-            <w:tcMar>
-              <w:top w:type="dxa" w:w="80"/>
-              <w:left w:type="dxa" w:w="120"/>
-              <w:bottom w:type="dxa" w:w="80"/>
-              <w:right w:type="dxa" w:w="120"/>
+            <w:tcW w:type="dxa" w:w="2248"/>
+            <w:tcBorders>
+              <w:top w:val="single" w:color="C5DDF9" w:sz="4"/>
+              <w:left w:val="single" w:color="C5DDF9" w:sz="4"/>
+              <w:bottom w:val="single" w:color="C5DDF9" w:sz="4"/>
+              <w:right w:val="single" w:color="C5DDF9" w:sz="4"/>
+            </w:tcBorders>
+            <w:shd w:fill="F0F5FF" w:val="clear"/>
+            <w:tcMar>
+              <w:top w:type="dxa" w:w="80"/>
+              <w:left w:type="dxa" w:w="80"/>
+              <w:bottom w:type="dxa" w:w="80"/>
+              <w:right w:type="dxa" w:w="80"/>
             </w:tcMar>
             <w:vAlign w:val="center"/>
           </w:tcPr>
@@ -1335,19 +1534,19 @@
       <w:tr>
         <w:tc>
           <w:tcPr>
-            <w:tcW w:type="dxa" w:w="3255"/>
-            <w:tcBorders>
-              <w:top w:val="single" w:color="C5DDF9" w:sz="4"/>
-              <w:left w:val="single" w:color="C5DDF9" w:sz="4"/>
-              <w:bottom w:val="single" w:color="C5DDF9" w:sz="4"/>
-              <w:right w:val="single" w:color="C5DDF9" w:sz="4"/>
-            </w:tcBorders>
-            <w:shd w:fill="F4F8FF" w:val="clear"/>
+            <w:tcW w:type="dxa" w:w="3000"/>
+            <w:tcBorders>
+              <w:top w:val="single" w:color="C5DDF9" w:sz="4"/>
+              <w:left w:val="single" w:color="C5DDF9" w:sz="4"/>
+              <w:bottom w:val="single" w:color="C5DDF9" w:sz="4"/>
+              <w:right w:val="single" w:color="C5DDF9" w:sz="4"/>
+            </w:tcBorders>
+            <w:shd w:fill="EEF5FF" w:val="clear"/>
             <w:tcMar>
               <w:top w:type="dxa" w:w="80"/>
               <w:left w:type="dxa" w:w="120"/>
               <w:bottom w:type="dxa" w:w="80"/>
-              <w:right w:type="dxa" w:w="120"/>
+              <w:right w:type="dxa" w:w="80"/>
             </w:tcMar>
             <w:vAlign w:val="center"/>
           </w:tcPr>
@@ -1370,19 +1569,19 @@
         </w:tc>
         <w:tc>
           <w:tcPr>
-            <w:tcW w:type="dxa" w:w="2257"/>
-            <w:tcBorders>
-              <w:top w:val="single" w:color="C5DDF9" w:sz="4"/>
-              <w:left w:val="single" w:color="C5DDF9" w:sz="4"/>
-              <w:bottom w:val="single" w:color="C5DDF9" w:sz="4"/>
-              <w:right w:val="single" w:color="C5DDF9" w:sz="4"/>
-            </w:tcBorders>
-            <w:shd w:fill="FFFFFF" w:val="clear"/>
-            <w:tcMar>
-              <w:top w:type="dxa" w:w="80"/>
-              <w:left w:type="dxa" w:w="120"/>
-              <w:bottom w:type="dxa" w:w="80"/>
-              <w:right w:type="dxa" w:w="120"/>
+            <w:tcW w:type="dxa" w:w="2248"/>
+            <w:tcBorders>
+              <w:top w:val="single" w:color="C5DDF9" w:sz="4"/>
+              <w:left w:val="single" w:color="C5DDF9" w:sz="4"/>
+              <w:bottom w:val="single" w:color="C5DDF9" w:sz="4"/>
+              <w:right w:val="single" w:color="C5DDF9" w:sz="4"/>
+            </w:tcBorders>
+            <w:shd w:fill="EEF5FF" w:val="clear"/>
+            <w:tcMar>
+              <w:top w:type="dxa" w:w="80"/>
+              <w:left w:type="dxa" w:w="80"/>
+              <w:bottom w:type="dxa" w:w="80"/>
+              <w:right w:type="dxa" w:w="80"/>
             </w:tcMar>
             <w:vAlign w:val="center"/>
           </w:tcPr>
@@ -1406,19 +1605,19 @@
         </w:tc>
         <w:tc>
           <w:tcPr>
-            <w:tcW w:type="dxa" w:w="2257"/>
-            <w:tcBorders>
-              <w:top w:val="single" w:color="C5DDF9" w:sz="4"/>
-              <w:left w:val="single" w:color="C5DDF9" w:sz="4"/>
-              <w:bottom w:val="single" w:color="C5DDF9" w:sz="4"/>
-              <w:right w:val="single" w:color="C5DDF9" w:sz="4"/>
-            </w:tcBorders>
-            <w:shd w:fill="F0F5FF" w:val="clear"/>
-            <w:tcMar>
-              <w:top w:type="dxa" w:w="80"/>
-              <w:left w:type="dxa" w:w="120"/>
-              <w:bottom w:type="dxa" w:w="80"/>
-              <w:right w:type="dxa" w:w="120"/>
+            <w:tcW w:type="dxa" w:w="2248"/>
+            <w:tcBorders>
+              <w:top w:val="single" w:color="C5DDF9" w:sz="4"/>
+              <w:left w:val="single" w:color="C5DDF9" w:sz="4"/>
+              <w:bottom w:val="single" w:color="C5DDF9" w:sz="4"/>
+              <w:right w:val="single" w:color="C5DDF9" w:sz="4"/>
+            </w:tcBorders>
+            <w:shd w:fill="EEF5FF" w:val="clear"/>
+            <w:tcMar>
+              <w:top w:type="dxa" w:w="80"/>
+              <w:left w:type="dxa" w:w="80"/>
+              <w:bottom w:type="dxa" w:w="80"/>
+              <w:right w:type="dxa" w:w="80"/>
             </w:tcMar>
             <w:vAlign w:val="center"/>
           </w:tcPr>
@@ -1442,19 +1641,19 @@
         </w:tc>
         <w:tc>
           <w:tcPr>
-            <w:tcW w:type="dxa" w:w="2257"/>
-            <w:tcBorders>
-              <w:top w:val="single" w:color="C5DDF9" w:sz="4"/>
-              <w:left w:val="single" w:color="C5DDF9" w:sz="4"/>
-              <w:bottom w:val="single" w:color="C5DDF9" w:sz="4"/>
-              <w:right w:val="single" w:color="C5DDF9" w:sz="4"/>
-            </w:tcBorders>
-            <w:shd w:fill="F0F5FF" w:val="clear"/>
-            <w:tcMar>
-              <w:top w:type="dxa" w:w="80"/>
-              <w:left w:type="dxa" w:w="120"/>
-              <w:bottom w:type="dxa" w:w="80"/>
-              <w:right w:type="dxa" w:w="120"/>
+            <w:tcW w:type="dxa" w:w="2248"/>
+            <w:tcBorders>
+              <w:top w:val="single" w:color="C5DDF9" w:sz="4"/>
+              <w:left w:val="single" w:color="C5DDF9" w:sz="4"/>
+              <w:bottom w:val="single" w:color="C5DDF9" w:sz="4"/>
+              <w:right w:val="single" w:color="C5DDF9" w:sz="4"/>
+            </w:tcBorders>
+            <w:shd w:fill="EEF5FF" w:val="clear"/>
+            <w:tcMar>
+              <w:top w:type="dxa" w:w="80"/>
+              <w:left w:type="dxa" w:w="80"/>
+              <w:bottom w:type="dxa" w:w="80"/>
+              <w:right w:type="dxa" w:w="80"/>
             </w:tcMar>
             <w:vAlign w:val="center"/>
           </w:tcPr>
@@ -1480,19 +1679,19 @@
       <w:tr>
         <w:tc>
           <w:tcPr>
-            <w:tcW w:type="dxa" w:w="3255"/>
-            <w:tcBorders>
-              <w:top w:val="single" w:color="C5DDF9" w:sz="4"/>
-              <w:left w:val="single" w:color="C5DDF9" w:sz="4"/>
-              <w:bottom w:val="single" w:color="C5DDF9" w:sz="4"/>
-              <w:right w:val="single" w:color="C5DDF9" w:sz="4"/>
-            </w:tcBorders>
-            <w:shd w:fill="EEF5FF" w:val="clear"/>
+            <w:tcW w:type="dxa" w:w="3000"/>
+            <w:tcBorders>
+              <w:top w:val="single" w:color="C5DDF9" w:sz="4"/>
+              <w:left w:val="single" w:color="C5DDF9" w:sz="4"/>
+              <w:bottom w:val="single" w:color="C5DDF9" w:sz="4"/>
+              <w:right w:val="single" w:color="C5DDF9" w:sz="4"/>
+            </w:tcBorders>
+            <w:shd w:fill="F4F8FF" w:val="clear"/>
             <w:tcMar>
               <w:top w:type="dxa" w:w="80"/>
               <w:left w:type="dxa" w:w="120"/>
               <w:bottom w:type="dxa" w:w="80"/>
-              <w:right w:type="dxa" w:w="120"/>
+              <w:right w:type="dxa" w:w="80"/>
             </w:tcMar>
             <w:vAlign w:val="center"/>
           </w:tcPr>
@@ -1515,19 +1714,19 @@
         </w:tc>
         <w:tc>
           <w:tcPr>
-            <w:tcW w:type="dxa" w:w="2257"/>
-            <w:tcBorders>
-              <w:top w:val="single" w:color="C5DDF9" w:sz="4"/>
-              <w:left w:val="single" w:color="C5DDF9" w:sz="4"/>
-              <w:bottom w:val="single" w:color="C5DDF9" w:sz="4"/>
-              <w:right w:val="single" w:color="C5DDF9" w:sz="4"/>
-            </w:tcBorders>
-            <w:shd w:fill="EEF5FF" w:val="clear"/>
-            <w:tcMar>
-              <w:top w:type="dxa" w:w="80"/>
-              <w:left w:type="dxa" w:w="120"/>
-              <w:bottom w:type="dxa" w:w="80"/>
-              <w:right w:type="dxa" w:w="120"/>
+            <w:tcW w:type="dxa" w:w="2248"/>
+            <w:tcBorders>
+              <w:top w:val="single" w:color="C5DDF9" w:sz="4"/>
+              <w:left w:val="single" w:color="C5DDF9" w:sz="4"/>
+              <w:bottom w:val="single" w:color="C5DDF9" w:sz="4"/>
+              <w:right w:val="single" w:color="C5DDF9" w:sz="4"/>
+            </w:tcBorders>
+            <w:shd w:fill="FFFFFF" w:val="clear"/>
+            <w:tcMar>
+              <w:top w:type="dxa" w:w="80"/>
+              <w:left w:type="dxa" w:w="80"/>
+              <w:bottom w:type="dxa" w:w="80"/>
+              <w:right w:type="dxa" w:w="80"/>
             </w:tcMar>
             <w:vAlign w:val="center"/>
           </w:tcPr>
@@ -1551,19 +1750,19 @@
         </w:tc>
         <w:tc>
           <w:tcPr>
-            <w:tcW w:type="dxa" w:w="2257"/>
-            <w:tcBorders>
-              <w:top w:val="single" w:color="C5DDF9" w:sz="4"/>
-              <w:left w:val="single" w:color="C5DDF9" w:sz="4"/>
-              <w:bottom w:val="single" w:color="C5DDF9" w:sz="4"/>
-              <w:right w:val="single" w:color="C5DDF9" w:sz="4"/>
-            </w:tcBorders>
-            <w:shd w:fill="EEF5FF" w:val="clear"/>
-            <w:tcMar>
-              <w:top w:type="dxa" w:w="80"/>
-              <w:left w:type="dxa" w:w="120"/>
-              <w:bottom w:type="dxa" w:w="80"/>
-              <w:right w:type="dxa" w:w="120"/>
+            <w:tcW w:type="dxa" w:w="2248"/>
+            <w:tcBorders>
+              <w:top w:val="single" w:color="C5DDF9" w:sz="4"/>
+              <w:left w:val="single" w:color="C5DDF9" w:sz="4"/>
+              <w:bottom w:val="single" w:color="C5DDF9" w:sz="4"/>
+              <w:right w:val="single" w:color="C5DDF9" w:sz="4"/>
+            </w:tcBorders>
+            <w:shd w:fill="F0F5FF" w:val="clear"/>
+            <w:tcMar>
+              <w:top w:type="dxa" w:w="80"/>
+              <w:left w:type="dxa" w:w="80"/>
+              <w:bottom w:type="dxa" w:w="80"/>
+              <w:right w:type="dxa" w:w="80"/>
             </w:tcMar>
             <w:vAlign w:val="center"/>
           </w:tcPr>
@@ -1587,19 +1786,19 @@
         </w:tc>
         <w:tc>
           <w:tcPr>
-            <w:tcW w:type="dxa" w:w="2257"/>
-            <w:tcBorders>
-              <w:top w:val="single" w:color="C5DDF9" w:sz="4"/>
-              <w:left w:val="single" w:color="C5DDF9" w:sz="4"/>
-              <w:bottom w:val="single" w:color="C5DDF9" w:sz="4"/>
-              <w:right w:val="single" w:color="C5DDF9" w:sz="4"/>
-            </w:tcBorders>
-            <w:shd w:fill="EEF5FF" w:val="clear"/>
-            <w:tcMar>
-              <w:top w:type="dxa" w:w="80"/>
-              <w:left w:type="dxa" w:w="120"/>
-              <w:bottom w:type="dxa" w:w="80"/>
-              <w:right w:type="dxa" w:w="120"/>
+            <w:tcW w:type="dxa" w:w="2248"/>
+            <w:tcBorders>
+              <w:top w:val="single" w:color="C5DDF9" w:sz="4"/>
+              <w:left w:val="single" w:color="C5DDF9" w:sz="4"/>
+              <w:bottom w:val="single" w:color="C5DDF9" w:sz="4"/>
+              <w:right w:val="single" w:color="C5DDF9" w:sz="4"/>
+            </w:tcBorders>
+            <w:shd w:fill="F0F5FF" w:val="clear"/>
+            <w:tcMar>
+              <w:top w:type="dxa" w:w="80"/>
+              <w:left w:type="dxa" w:w="80"/>
+              <w:bottom w:type="dxa" w:w="80"/>
+              <w:right w:type="dxa" w:w="80"/>
             </w:tcMar>
             <w:vAlign w:val="center"/>
           </w:tcPr>
@@ -1625,19 +1824,19 @@
       <w:tr>
         <w:tc>
           <w:tcPr>
-            <w:tcW w:type="dxa" w:w="3255"/>
-            <w:tcBorders>
-              <w:top w:val="single" w:color="C5DDF9" w:sz="4"/>
-              <w:left w:val="single" w:color="C5DDF9" w:sz="4"/>
-              <w:bottom w:val="single" w:color="C5DDF9" w:sz="4"/>
-              <w:right w:val="single" w:color="C5DDF9" w:sz="4"/>
-            </w:tcBorders>
-            <w:shd w:fill="F4F8FF" w:val="clear"/>
+            <w:tcW w:type="dxa" w:w="3000"/>
+            <w:tcBorders>
+              <w:top w:val="single" w:color="C5DDF9" w:sz="4"/>
+              <w:left w:val="single" w:color="C5DDF9" w:sz="4"/>
+              <w:bottom w:val="single" w:color="C5DDF9" w:sz="4"/>
+              <w:right w:val="single" w:color="C5DDF9" w:sz="4"/>
+            </w:tcBorders>
+            <w:shd w:fill="EEF5FF" w:val="clear"/>
             <w:tcMar>
               <w:top w:type="dxa" w:w="80"/>
               <w:left w:type="dxa" w:w="120"/>
               <w:bottom w:type="dxa" w:w="80"/>
-              <w:right w:type="dxa" w:w="120"/>
+              <w:right w:type="dxa" w:w="80"/>
             </w:tcMar>
             <w:vAlign w:val="center"/>
           </w:tcPr>
@@ -1660,19 +1859,19 @@
         </w:tc>
         <w:tc>
           <w:tcPr>
-            <w:tcW w:type="dxa" w:w="2257"/>
-            <w:tcBorders>
-              <w:top w:val="single" w:color="C5DDF9" w:sz="4"/>
-              <w:left w:val="single" w:color="C5DDF9" w:sz="4"/>
-              <w:bottom w:val="single" w:color="C5DDF9" w:sz="4"/>
-              <w:right w:val="single" w:color="C5DDF9" w:sz="4"/>
-            </w:tcBorders>
-            <w:shd w:fill="FFFFFF" w:val="clear"/>
-            <w:tcMar>
-              <w:top w:type="dxa" w:w="80"/>
-              <w:left w:type="dxa" w:w="120"/>
-              <w:bottom w:type="dxa" w:w="80"/>
-              <w:right w:type="dxa" w:w="120"/>
+            <w:tcW w:type="dxa" w:w="2248"/>
+            <w:tcBorders>
+              <w:top w:val="single" w:color="C5DDF9" w:sz="4"/>
+              <w:left w:val="single" w:color="C5DDF9" w:sz="4"/>
+              <w:bottom w:val="single" w:color="C5DDF9" w:sz="4"/>
+              <w:right w:val="single" w:color="C5DDF9" w:sz="4"/>
+            </w:tcBorders>
+            <w:shd w:fill="EEF5FF" w:val="clear"/>
+            <w:tcMar>
+              <w:top w:type="dxa" w:w="80"/>
+              <w:left w:type="dxa" w:w="80"/>
+              <w:bottom w:type="dxa" w:w="80"/>
+              <w:right w:type="dxa" w:w="80"/>
             </w:tcMar>
             <w:vAlign w:val="center"/>
           </w:tcPr>
@@ -1696,19 +1895,19 @@
         </w:tc>
         <w:tc>
           <w:tcPr>
-            <w:tcW w:type="dxa" w:w="2257"/>
-            <w:tcBorders>
-              <w:top w:val="single" w:color="C5DDF9" w:sz="4"/>
-              <w:left w:val="single" w:color="C5DDF9" w:sz="4"/>
-              <w:bottom w:val="single" w:color="C5DDF9" w:sz="4"/>
-              <w:right w:val="single" w:color="C5DDF9" w:sz="4"/>
-            </w:tcBorders>
-            <w:shd w:fill="F0F5FF" w:val="clear"/>
-            <w:tcMar>
-              <w:top w:type="dxa" w:w="80"/>
-              <w:left w:type="dxa" w:w="120"/>
-              <w:bottom w:type="dxa" w:w="80"/>
-              <w:right w:type="dxa" w:w="120"/>
+            <w:tcW w:type="dxa" w:w="2248"/>
+            <w:tcBorders>
+              <w:top w:val="single" w:color="C5DDF9" w:sz="4"/>
+              <w:left w:val="single" w:color="C5DDF9" w:sz="4"/>
+              <w:bottom w:val="single" w:color="C5DDF9" w:sz="4"/>
+              <w:right w:val="single" w:color="C5DDF9" w:sz="4"/>
+            </w:tcBorders>
+            <w:shd w:fill="EEF5FF" w:val="clear"/>
+            <w:tcMar>
+              <w:top w:type="dxa" w:w="80"/>
+              <w:left w:type="dxa" w:w="80"/>
+              <w:bottom w:type="dxa" w:w="80"/>
+              <w:right w:type="dxa" w:w="80"/>
             </w:tcMar>
             <w:vAlign w:val="center"/>
           </w:tcPr>
@@ -1732,19 +1931,19 @@
         </w:tc>
         <w:tc>
           <w:tcPr>
-            <w:tcW w:type="dxa" w:w="2257"/>
-            <w:tcBorders>
-              <w:top w:val="single" w:color="C5DDF9" w:sz="4"/>
-              <w:left w:val="single" w:color="C5DDF9" w:sz="4"/>
-              <w:bottom w:val="single" w:color="C5DDF9" w:sz="4"/>
-              <w:right w:val="single" w:color="C5DDF9" w:sz="4"/>
-            </w:tcBorders>
-            <w:shd w:fill="F0F5FF" w:val="clear"/>
-            <w:tcMar>
-              <w:top w:type="dxa" w:w="80"/>
-              <w:left w:type="dxa" w:w="120"/>
-              <w:bottom w:type="dxa" w:w="80"/>
-              <w:right w:type="dxa" w:w="120"/>
+            <w:tcW w:type="dxa" w:w="2248"/>
+            <w:tcBorders>
+              <w:top w:val="single" w:color="C5DDF9" w:sz="4"/>
+              <w:left w:val="single" w:color="C5DDF9" w:sz="4"/>
+              <w:bottom w:val="single" w:color="C5DDF9" w:sz="4"/>
+              <w:right w:val="single" w:color="C5DDF9" w:sz="4"/>
+            </w:tcBorders>
+            <w:shd w:fill="EEF5FF" w:val="clear"/>
+            <w:tcMar>
+              <w:top w:type="dxa" w:w="80"/>
+              <w:left w:type="dxa" w:w="80"/>
+              <w:bottom w:type="dxa" w:w="80"/>
+              <w:right w:type="dxa" w:w="80"/>
             </w:tcMar>
             <w:vAlign w:val="center"/>
           </w:tcPr>
@@ -1770,7 +1969,152 @@
       <w:tr>
         <w:tc>
           <w:tcPr>
-            <w:tcW w:type="dxa" w:w="3255"/>
+            <w:tcW w:type="dxa" w:w="3000"/>
+            <w:tcBorders>
+              <w:top w:val="single" w:color="C5DDF9" w:sz="4"/>
+              <w:left w:val="single" w:color="C5DDF9" w:sz="4"/>
+              <w:bottom w:val="single" w:color="C5DDF9" w:sz="4"/>
+              <w:right w:val="single" w:color="C5DDF9" w:sz="4"/>
+            </w:tcBorders>
+            <w:shd w:fill="F4F8FF" w:val="clear"/>
+            <w:tcMar>
+              <w:top w:type="dxa" w:w="80"/>
+              <w:left w:type="dxa" w:w="120"/>
+              <w:bottom w:type="dxa" w:w="80"/>
+              <w:right w:type="dxa" w:w="80"/>
+            </w:tcMar>
+            <w:vAlign w:val="center"/>
+          </w:tcPr>
+          <w:p>
+            <w:pPr>
+              <w:spacing w:before="0" w:after="0"/>
+            </w:pPr>
+            <w:r>
+              <w:rPr>
+                <w:rFonts w:ascii="Arial" w:cs="Arial" w:eastAsia="Arial" w:hAnsi="Arial"/>
+                <w:b/>
+                <w:bCs/>
+                <w:color w:val="334E6E"/>
+                <w:sz w:val="19"/>
+                <w:szCs w:val="19"/>
+              </w:rPr>
+              <w:t xml:space="preserve">Analytics dashboards</w:t>
+            </w:r>
+          </w:p>
+        </w:tc>
+        <w:tc>
+          <w:tcPr>
+            <w:tcW w:type="dxa" w:w="2248"/>
+            <w:tcBorders>
+              <w:top w:val="single" w:color="C5DDF9" w:sz="4"/>
+              <w:left w:val="single" w:color="C5DDF9" w:sz="4"/>
+              <w:bottom w:val="single" w:color="C5DDF9" w:sz="4"/>
+              <w:right w:val="single" w:color="C5DDF9" w:sz="4"/>
+            </w:tcBorders>
+            <w:shd w:fill="FFFFFF" w:val="clear"/>
+            <w:tcMar>
+              <w:top w:type="dxa" w:w="80"/>
+              <w:left w:type="dxa" w:w="80"/>
+              <w:bottom w:type="dxa" w:w="80"/>
+              <w:right w:type="dxa" w:w="80"/>
+            </w:tcMar>
+            <w:vAlign w:val="center"/>
+          </w:tcPr>
+          <w:p>
+            <w:pPr>
+              <w:spacing w:before="0" w:after="0"/>
+              <w:jc w:val="center"/>
+            </w:pPr>
+            <w:r>
+              <w:rPr>
+                <w:rFonts w:ascii="Arial" w:cs="Arial" w:eastAsia="Arial" w:hAnsi="Arial"/>
+                <w:b w:val="false"/>
+                <w:bCs w:val="false"/>
+                <w:color w:val="0D1F3C"/>
+                <w:sz w:val="19"/>
+                <w:szCs w:val="19"/>
+              </w:rPr>
+              <w:t xml:space="preserve">Basic</w:t>
+            </w:r>
+          </w:p>
+        </w:tc>
+        <w:tc>
+          <w:tcPr>
+            <w:tcW w:type="dxa" w:w="2248"/>
+            <w:tcBorders>
+              <w:top w:val="single" w:color="C5DDF9" w:sz="4"/>
+              <w:left w:val="single" w:color="C5DDF9" w:sz="4"/>
+              <w:bottom w:val="single" w:color="C5DDF9" w:sz="4"/>
+              <w:right w:val="single" w:color="C5DDF9" w:sz="4"/>
+            </w:tcBorders>
+            <w:shd w:fill="F0F5FF" w:val="clear"/>
+            <w:tcMar>
+              <w:top w:type="dxa" w:w="80"/>
+              <w:left w:type="dxa" w:w="80"/>
+              <w:bottom w:type="dxa" w:w="80"/>
+              <w:right w:type="dxa" w:w="80"/>
+            </w:tcMar>
+            <w:vAlign w:val="center"/>
+          </w:tcPr>
+          <w:p>
+            <w:pPr>
+              <w:spacing w:before="0" w:after="0"/>
+              <w:jc w:val="center"/>
+            </w:pPr>
+            <w:r>
+              <w:rPr>
+                <w:rFonts w:ascii="Arial" w:cs="Arial" w:eastAsia="Arial" w:hAnsi="Arial"/>
+                <w:b w:val="false"/>
+                <w:bCs w:val="false"/>
+                <w:color w:val="0D1F3C"/>
+                <w:sz w:val="19"/>
+                <w:szCs w:val="19"/>
+              </w:rPr>
+              <w:t xml:space="preserve">Branch-level</w:t>
+            </w:r>
+          </w:p>
+        </w:tc>
+        <w:tc>
+          <w:tcPr>
+            <w:tcW w:type="dxa" w:w="2248"/>
+            <w:tcBorders>
+              <w:top w:val="single" w:color="C5DDF9" w:sz="4"/>
+              <w:left w:val="single" w:color="C5DDF9" w:sz="4"/>
+              <w:bottom w:val="single" w:color="C5DDF9" w:sz="4"/>
+              <w:right w:val="single" w:color="C5DDF9" w:sz="4"/>
+            </w:tcBorders>
+            <w:shd w:fill="F0F5FF" w:val="clear"/>
+            <w:tcMar>
+              <w:top w:type="dxa" w:w="80"/>
+              <w:left w:type="dxa" w:w="80"/>
+              <w:bottom w:type="dxa" w:w="80"/>
+              <w:right w:type="dxa" w:w="80"/>
+            </w:tcMar>
+            <w:vAlign w:val="center"/>
+          </w:tcPr>
+          <w:p>
+            <w:pPr>
+              <w:spacing w:before="0" w:after="0"/>
+              <w:jc w:val="center"/>
+            </w:pPr>
+            <w:r>
+              <w:rPr>
+                <w:rFonts w:ascii="Arial" w:cs="Arial" w:eastAsia="Arial" w:hAnsi="Arial"/>
+                <w:b w:val="false"/>
+                <w:bCs w:val="false"/>
+                <w:color w:val="0D1F3C"/>
+                <w:sz w:val="19"/>
+                <w:szCs w:val="19"/>
+              </w:rPr>
+              <w:t xml:space="preserve">Advanced</w:t>
+            </w:r>
+          </w:p>
+        </w:tc>
+      </w:tr>
+      <w:tr>
+        <w:tc>
+          <w:tcPr>
+            <w:tcW w:type="dxa" w:w="3000"/>
             <w:tcBorders>
               <w:top w:val="single" w:color="C5DDF9" w:sz="4"/>
               <w:left w:val="single" w:color="C5DDF9" w:sz="4"/>
@@ -1782,7 +2126,7 @@
               <w:top w:type="dxa" w:w="80"/>
               <w:left w:type="dxa" w:w="120"/>
               <w:bottom w:type="dxa" w:w="80"/>
-              <w:right w:type="dxa" w:w="120"/>
+              <w:right w:type="dxa" w:w="80"/>
             </w:tcMar>
             <w:vAlign w:val="center"/>
           </w:tcPr>
@@ -1799,13 +2143,13 @@
                 <w:sz w:val="19"/>
                 <w:szCs w:val="19"/>
               </w:rPr>
-              <w:t xml:space="preserve">Analytics dashboards</w:t>
-            </w:r>
-          </w:p>
-        </w:tc>
-        <w:tc>
-          <w:tcPr>
-            <w:tcW w:type="dxa" w:w="2257"/>
+              <w:t xml:space="preserve">Staff training included</w:t>
+            </w:r>
+          </w:p>
+        </w:tc>
+        <w:tc>
+          <w:tcPr>
+            <w:tcW w:type="dxa" w:w="2248"/>
             <w:tcBorders>
               <w:top w:val="single" w:color="C5DDF9" w:sz="4"/>
               <w:left w:val="single" w:color="C5DDF9" w:sz="4"/>
@@ -1815,9 +2159,9 @@
             <w:shd w:fill="EEF5FF" w:val="clear"/>
             <w:tcMar>
               <w:top w:type="dxa" w:w="80"/>
-              <w:left w:type="dxa" w:w="120"/>
-              <w:bottom w:type="dxa" w:w="80"/>
-              <w:right w:type="dxa" w:w="120"/>
+              <w:left w:type="dxa" w:w="80"/>
+              <w:bottom w:type="dxa" w:w="80"/>
+              <w:right w:type="dxa" w:w="80"/>
             </w:tcMar>
             <w:vAlign w:val="center"/>
           </w:tcPr>
@@ -1835,13 +2179,13 @@
                 <w:sz w:val="20"/>
                 <w:szCs w:val="20"/>
               </w:rPr>
-              <w:t xml:space="preserve">Basic</w:t>
-            </w:r>
-          </w:p>
-        </w:tc>
-        <w:tc>
-          <w:tcPr>
-            <w:tcW w:type="dxa" w:w="2257"/>
+              <w:t xml:space="preserve">2 days</w:t>
+            </w:r>
+          </w:p>
+        </w:tc>
+        <w:tc>
+          <w:tcPr>
+            <w:tcW w:type="dxa" w:w="2248"/>
             <w:tcBorders>
               <w:top w:val="single" w:color="C5DDF9" w:sz="4"/>
               <w:left w:val="single" w:color="C5DDF9" w:sz="4"/>
@@ -1851,9 +2195,9 @@
             <w:shd w:fill="EEF5FF" w:val="clear"/>
             <w:tcMar>
               <w:top w:type="dxa" w:w="80"/>
-              <w:left w:type="dxa" w:w="120"/>
-              <w:bottom w:type="dxa" w:w="80"/>
-              <w:right w:type="dxa" w:w="120"/>
+              <w:left w:type="dxa" w:w="80"/>
+              <w:bottom w:type="dxa" w:w="80"/>
+              <w:right w:type="dxa" w:w="80"/>
             </w:tcMar>
             <w:vAlign w:val="center"/>
           </w:tcPr>
@@ -1871,13 +2215,13 @@
                 <w:sz w:val="20"/>
                 <w:szCs w:val="20"/>
               </w:rPr>
-              <w:t xml:space="preserve">Branch-level</w:t>
-            </w:r>
-          </w:p>
-        </w:tc>
-        <w:tc>
-          <w:tcPr>
-            <w:tcW w:type="dxa" w:w="2257"/>
+              <w:t xml:space="preserve">2–3 days</w:t>
+            </w:r>
+          </w:p>
+        </w:tc>
+        <w:tc>
+          <w:tcPr>
+            <w:tcW w:type="dxa" w:w="2248"/>
             <w:tcBorders>
               <w:top w:val="single" w:color="C5DDF9" w:sz="4"/>
               <w:left w:val="single" w:color="C5DDF9" w:sz="4"/>
@@ -1887,9 +2231,9 @@
             <w:shd w:fill="EEF5FF" w:val="clear"/>
             <w:tcMar>
               <w:top w:type="dxa" w:w="80"/>
-              <w:left w:type="dxa" w:w="120"/>
-              <w:bottom w:type="dxa" w:w="80"/>
-              <w:right w:type="dxa" w:w="120"/>
+              <w:left w:type="dxa" w:w="80"/>
+              <w:bottom w:type="dxa" w:w="80"/>
+              <w:right w:type="dxa" w:w="80"/>
             </w:tcMar>
             <w:vAlign w:val="center"/>
           </w:tcPr>
@@ -1907,7 +2251,7 @@
                 <w:sz w:val="20"/>
                 <w:szCs w:val="20"/>
               </w:rPr>
-              <w:t xml:space="preserve">Advanced</w:t>
+              <w:t xml:space="preserve">3–4 days</w:t>
             </w:r>
           </w:p>
         </w:tc>
@@ -1915,7 +2259,7 @@
       <w:tr>
         <w:tc>
           <w:tcPr>
-            <w:tcW w:type="dxa" w:w="3255"/>
+            <w:tcW w:type="dxa" w:w="3000"/>
             <w:tcBorders>
               <w:top w:val="single" w:color="C5DDF9" w:sz="4"/>
               <w:left w:val="single" w:color="C5DDF9" w:sz="4"/>
@@ -1927,7 +2271,7 @@
               <w:top w:type="dxa" w:w="80"/>
               <w:left w:type="dxa" w:w="120"/>
               <w:bottom w:type="dxa" w:w="80"/>
-              <w:right w:type="dxa" w:w="120"/>
+              <w:right w:type="dxa" w:w="80"/>
             </w:tcMar>
             <w:vAlign w:val="center"/>
           </w:tcPr>
@@ -1944,13 +2288,13 @@
                 <w:sz w:val="19"/>
                 <w:szCs w:val="19"/>
               </w:rPr>
-              <w:t xml:space="preserve">Training included</w:t>
-            </w:r>
-          </w:p>
-        </w:tc>
-        <w:tc>
-          <w:tcPr>
-            <w:tcW w:type="dxa" w:w="2257"/>
+              <w:t xml:space="preserve">Go-live timeline</w:t>
+            </w:r>
+          </w:p>
+        </w:tc>
+        <w:tc>
+          <w:tcPr>
+            <w:tcW w:type="dxa" w:w="2248"/>
             <w:tcBorders>
               <w:top w:val="single" w:color="C5DDF9" w:sz="4"/>
               <w:left w:val="single" w:color="C5DDF9" w:sz="4"/>
@@ -1960,9 +2304,9 @@
             <w:shd w:fill="FFFFFF" w:val="clear"/>
             <w:tcMar>
               <w:top w:type="dxa" w:w="80"/>
-              <w:left w:type="dxa" w:w="120"/>
-              <w:bottom w:type="dxa" w:w="80"/>
-              <w:right w:type="dxa" w:w="120"/>
+              <w:left w:type="dxa" w:w="80"/>
+              <w:bottom w:type="dxa" w:w="80"/>
+              <w:right w:type="dxa" w:w="80"/>
             </w:tcMar>
             <w:vAlign w:val="center"/>
           </w:tcPr>
@@ -1977,16 +2321,16 @@
                 <w:b w:val="false"/>
                 <w:bCs w:val="false"/>
                 <w:color w:val="0D1F3C"/>
-                <w:sz w:val="20"/>
-                <w:szCs w:val="20"/>
-              </w:rPr>
-              <w:t xml:space="preserve">2 days</w:t>
-            </w:r>
-          </w:p>
-        </w:tc>
-        <w:tc>
-          <w:tcPr>
-            <w:tcW w:type="dxa" w:w="2257"/>
+                <w:sz w:val="19"/>
+                <w:szCs w:val="19"/>
+              </w:rPr>
+              <w:t xml:space="preserve">3–4 wks</w:t>
+            </w:r>
+          </w:p>
+        </w:tc>
+        <w:tc>
+          <w:tcPr>
+            <w:tcW w:type="dxa" w:w="2248"/>
             <w:tcBorders>
               <w:top w:val="single" w:color="C5DDF9" w:sz="4"/>
               <w:left w:val="single" w:color="C5DDF9" w:sz="4"/>
@@ -1996,9 +2340,9 @@
             <w:shd w:fill="F0F5FF" w:val="clear"/>
             <w:tcMar>
               <w:top w:type="dxa" w:w="80"/>
-              <w:left w:type="dxa" w:w="120"/>
-              <w:bottom w:type="dxa" w:w="80"/>
-              <w:right w:type="dxa" w:w="120"/>
+              <w:left w:type="dxa" w:w="80"/>
+              <w:bottom w:type="dxa" w:w="80"/>
+              <w:right w:type="dxa" w:w="80"/>
             </w:tcMar>
             <w:vAlign w:val="center"/>
           </w:tcPr>
@@ -2013,16 +2357,16 @@
                 <w:b w:val="false"/>
                 <w:bCs w:val="false"/>
                 <w:color w:val="0D1F3C"/>
-                <w:sz w:val="20"/>
-                <w:szCs w:val="20"/>
-              </w:rPr>
-              <w:t xml:space="preserve">2–3 days</w:t>
-            </w:r>
-          </w:p>
-        </w:tc>
-        <w:tc>
-          <w:tcPr>
-            <w:tcW w:type="dxa" w:w="2257"/>
+                <w:sz w:val="19"/>
+                <w:szCs w:val="19"/>
+              </w:rPr>
+              <w:t xml:space="preserve">4–6 wks</w:t>
+            </w:r>
+          </w:p>
+        </w:tc>
+        <w:tc>
+          <w:tcPr>
+            <w:tcW w:type="dxa" w:w="2248"/>
             <w:tcBorders>
               <w:top w:val="single" w:color="C5DDF9" w:sz="4"/>
               <w:left w:val="single" w:color="C5DDF9" w:sz="4"/>
@@ -2032,9 +2376,9 @@
             <w:shd w:fill="F0F5FF" w:val="clear"/>
             <w:tcMar>
               <w:top w:type="dxa" w:w="80"/>
-              <w:left w:type="dxa" w:w="120"/>
-              <w:bottom w:type="dxa" w:w="80"/>
-              <w:right w:type="dxa" w:w="120"/>
+              <w:left w:type="dxa" w:w="80"/>
+              <w:bottom w:type="dxa" w:w="80"/>
+              <w:right w:type="dxa" w:w="80"/>
             </w:tcMar>
             <w:vAlign w:val="center"/>
           </w:tcPr>
@@ -2049,153 +2393,8 @@
                 <w:b w:val="false"/>
                 <w:bCs w:val="false"/>
                 <w:color w:val="0D1F3C"/>
-                <w:sz w:val="20"/>
-                <w:szCs w:val="20"/>
-              </w:rPr>
-              <w:t xml:space="preserve">3–4 days</w:t>
-            </w:r>
-          </w:p>
-        </w:tc>
-      </w:tr>
-      <w:tr>
-        <w:tc>
-          <w:tcPr>
-            <w:tcW w:type="dxa" w:w="3255"/>
-            <w:tcBorders>
-              <w:top w:val="single" w:color="C5DDF9" w:sz="4"/>
-              <w:left w:val="single" w:color="C5DDF9" w:sz="4"/>
-              <w:bottom w:val="single" w:color="C5DDF9" w:sz="4"/>
-              <w:right w:val="single" w:color="C5DDF9" w:sz="4"/>
-            </w:tcBorders>
-            <w:shd w:fill="EEF5FF" w:val="clear"/>
-            <w:tcMar>
-              <w:top w:type="dxa" w:w="80"/>
-              <w:left w:type="dxa" w:w="120"/>
-              <w:bottom w:type="dxa" w:w="80"/>
-              <w:right w:type="dxa" w:w="120"/>
-            </w:tcMar>
-            <w:vAlign w:val="center"/>
-          </w:tcPr>
-          <w:p>
-            <w:pPr>
-              <w:spacing w:before="0" w:after="0"/>
-            </w:pPr>
-            <w:r>
-              <w:rPr>
-                <w:rFonts w:ascii="Arial" w:cs="Arial" w:eastAsia="Arial" w:hAnsi="Arial"/>
-                <w:b/>
-                <w:bCs/>
-                <w:color w:val="334E6E"/>
-                <w:sz w:val="19"/>
-                <w:szCs w:val="19"/>
-              </w:rPr>
-              <w:t xml:space="preserve">Go-live timeline</w:t>
-            </w:r>
-          </w:p>
-        </w:tc>
-        <w:tc>
-          <w:tcPr>
-            <w:tcW w:type="dxa" w:w="2257"/>
-            <w:tcBorders>
-              <w:top w:val="single" w:color="C5DDF9" w:sz="4"/>
-              <w:left w:val="single" w:color="C5DDF9" w:sz="4"/>
-              <w:bottom w:val="single" w:color="C5DDF9" w:sz="4"/>
-              <w:right w:val="single" w:color="C5DDF9" w:sz="4"/>
-            </w:tcBorders>
-            <w:shd w:fill="EEF5FF" w:val="clear"/>
-            <w:tcMar>
-              <w:top w:type="dxa" w:w="80"/>
-              <w:left w:type="dxa" w:w="120"/>
-              <w:bottom w:type="dxa" w:w="80"/>
-              <w:right w:type="dxa" w:w="120"/>
-            </w:tcMar>
-            <w:vAlign w:val="center"/>
-          </w:tcPr>
-          <w:p>
-            <w:pPr>
-              <w:spacing w:before="0" w:after="0"/>
-              <w:jc w:val="center"/>
-            </w:pPr>
-            <w:r>
-              <w:rPr>
-                <w:rFonts w:ascii="Arial" w:cs="Arial" w:eastAsia="Arial" w:hAnsi="Arial"/>
-                <w:b w:val="false"/>
-                <w:bCs w:val="false"/>
-                <w:color w:val="0D1F3C"/>
-                <w:sz w:val="20"/>
-                <w:szCs w:val="20"/>
-              </w:rPr>
-              <w:t xml:space="preserve">3–4 wks</w:t>
-            </w:r>
-          </w:p>
-        </w:tc>
-        <w:tc>
-          <w:tcPr>
-            <w:tcW w:type="dxa" w:w="2257"/>
-            <w:tcBorders>
-              <w:top w:val="single" w:color="C5DDF9" w:sz="4"/>
-              <w:left w:val="single" w:color="C5DDF9" w:sz="4"/>
-              <w:bottom w:val="single" w:color="C5DDF9" w:sz="4"/>
-              <w:right w:val="single" w:color="C5DDF9" w:sz="4"/>
-            </w:tcBorders>
-            <w:shd w:fill="EEF5FF" w:val="clear"/>
-            <w:tcMar>
-              <w:top w:type="dxa" w:w="80"/>
-              <w:left w:type="dxa" w:w="120"/>
-              <w:bottom w:type="dxa" w:w="80"/>
-              <w:right w:type="dxa" w:w="120"/>
-            </w:tcMar>
-            <w:vAlign w:val="center"/>
-          </w:tcPr>
-          <w:p>
-            <w:pPr>
-              <w:spacing w:before="0" w:after="0"/>
-              <w:jc w:val="center"/>
-            </w:pPr>
-            <w:r>
-              <w:rPr>
-                <w:rFonts w:ascii="Arial" w:cs="Arial" w:eastAsia="Arial" w:hAnsi="Arial"/>
-                <w:b w:val="false"/>
-                <w:bCs w:val="false"/>
-                <w:color w:val="0D1F3C"/>
-                <w:sz w:val="20"/>
-                <w:szCs w:val="20"/>
-              </w:rPr>
-              <w:t xml:space="preserve">4–6 wks</w:t>
-            </w:r>
-          </w:p>
-        </w:tc>
-        <w:tc>
-          <w:tcPr>
-            <w:tcW w:type="dxa" w:w="2257"/>
-            <w:tcBorders>
-              <w:top w:val="single" w:color="C5DDF9" w:sz="4"/>
-              <w:left w:val="single" w:color="C5DDF9" w:sz="4"/>
-              <w:bottom w:val="single" w:color="C5DDF9" w:sz="4"/>
-              <w:right w:val="single" w:color="C5DDF9" w:sz="4"/>
-            </w:tcBorders>
-            <w:shd w:fill="EEF5FF" w:val="clear"/>
-            <w:tcMar>
-              <w:top w:type="dxa" w:w="80"/>
-              <w:left w:type="dxa" w:w="120"/>
-              <w:bottom w:type="dxa" w:w="80"/>
-              <w:right w:type="dxa" w:w="120"/>
-            </w:tcMar>
-            <w:vAlign w:val="center"/>
-          </w:tcPr>
-          <w:p>
-            <w:pPr>
-              <w:spacing w:before="0" w:after="0"/>
-              <w:jc w:val="center"/>
-            </w:pPr>
-            <w:r>
-              <w:rPr>
-                <w:rFonts w:ascii="Arial" w:cs="Arial" w:eastAsia="Arial" w:hAnsi="Arial"/>
-                <w:b w:val="false"/>
-                <w:bCs w:val="false"/>
-                <w:color w:val="0D1F3C"/>
-                <w:sz w:val="20"/>
-                <w:szCs w:val="20"/>
+                <w:sz w:val="19"/>
+                <w:szCs w:val="19"/>
               </w:rPr>
               <w:t xml:space="preserve">6–10 wks</w:t>
             </w:r>
@@ -2205,7 +2404,7 @@
     </w:tbl>
     <w:p>
       <w:pPr>
-        <w:spacing w:before="0" w:after="100"/>
+        <w:spacing w:before="0" w:after="120"/>
       </w:pPr>
       <w:r>
         <w:rPr>
@@ -2219,7 +2418,7 @@
     </w:p>
     <w:tbl>
       <w:tblPr>
-        <w:tblW w:type="dxa" w:w="9026"/>
+        <w:tblW w:type="dxa" w:w="9746"/>
         <w:tblBorders>
           <w:top w:val="single" w:color="auto" w:sz="4"/>
           <w:left w:val="single" w:color="auto" w:sz="4"/>
@@ -2230,17 +2429,17 @@
         </w:tblBorders>
       </w:tblPr>
       <w:tblGrid>
-        <w:gridCol w:w="9026"/>
+        <w:gridCol w:w="9746"/>
       </w:tblGrid>
       <w:tr>
         <w:tc>
           <w:tcPr>
-            <w:tcW w:type="dxa" w:w="9026"/>
-            <w:tcBorders>
-              <w:top w:val="none" w:color="FFFFFF" w:sz="0"/>
-              <w:left w:val="single" w:color="C9A84C" w:sz="18"/>
-              <w:bottom w:val="none" w:color="FFFFFF" w:sz="0"/>
-              <w:right w:val="none" w:color="FFFFFF" w:sz="0"/>
+            <w:tcW w:type="dxa" w:w="9746"/>
+            <w:tcBorders>
+              <w:top w:val="none" w:color="auto" w:sz="0"/>
+              <w:left w:val="single" w:color="C9A84C" w:sz="20"/>
+              <w:bottom w:val="none" w:color="auto" w:sz="0"/>
+              <w:right w:val="none" w:color="auto" w:sz="0"/>
             </w:tcBorders>
             <w:shd w:fill="FFF8E8" w:val="clear"/>
             <w:tcMar>
@@ -2261,7 +2460,7 @@
                 <w:sz w:val="19"/>
                 <w:szCs w:val="19"/>
               </w:rPr>
-              <w:t xml:space="preserve">💡  Pricing is flexible and tailored to your institution's scale. Final deployment cost depends on number of branches, active clients, and integrations required. Enterprise pricing starts at UGX 5,500,000 and is scoped per engagement. Contact us for a custom proposal.</w:t>
+              <w:t xml:space="preserve">💡  Pricing is flexible and tailored to your institution’s scale. Final cost depends on branches, clients, and integrations required. Enterprise starts at UGX 5,500,000 and is scoped per engagement.</w:t>
             </w:r>
           </w:p>
         </w:tc>
@@ -2283,7 +2482,7 @@
     </w:p>
     <w:p>
       <w:pPr>
-        <w:spacing w:before="160" w:after="60"/>
+        <w:spacing w:before="180" w:after="80"/>
       </w:pPr>
       <w:r>
         <w:rPr>
@@ -2308,7 +2507,7 @@
           <w:sz w:val="20"/>
           <w:szCs w:val="20"/>
         </w:rPr>
-        <w:t xml:space="preserve">The monthly rate is flat across all three deployment tiers — UGX 400,000/month. No per-user charges, no tier-based increases.</w:t>
+        <w:t xml:space="preserve">The monthly rate is fixed at UGX 400,000 across all three tiers. No per-user charges, no tier-based increases.</w:t>
       </w:r>
     </w:p>
     <w:p>
@@ -2327,7 +2526,7 @@
     </w:p>
     <w:tbl>
       <w:tblPr>
-        <w:tblW w:type="dxa" w:w="9026"/>
+        <w:tblW w:type="dxa" w:w="9746"/>
         <w:tblBorders>
           <w:top w:val="single" w:color="auto" w:sz="4"/>
           <w:left w:val="single" w:color="auto" w:sz="4"/>
@@ -2338,13 +2537,13 @@
         </w:tblBorders>
       </w:tblPr>
       <w:tblGrid>
-        <w:gridCol w:w="4513"/>
-        <w:gridCol w:w="4513"/>
+        <w:gridCol w:w="4873"/>
+        <w:gridCol w:w="4873"/>
       </w:tblGrid>
       <w:tr>
         <w:tc>
           <w:tcPr>
-            <w:tcW w:type="dxa" w:w="9026"/>
+            <w:tcW w:type="dxa" w:w="9746"/>
             <w:gridSpan w:val="2"/>
             <w:tcBorders>
               <w:top w:val="single" w:color="C5DDF9" w:sz="4"/>
@@ -2354,15 +2553,15 @@
             </w:tcBorders>
             <w:shd w:fill="0F2D5A" w:val="clear"/>
             <w:tcMar>
-              <w:top w:type="dxa" w:w="120"/>
+              <w:top w:type="dxa" w:w="130"/>
               <w:left w:type="dxa" w:w="160"/>
-              <w:bottom w:type="dxa" w:w="120"/>
+              <w:bottom w:type="dxa" w:w="130"/>
               <w:right w:type="dxa" w:w="160"/>
             </w:tcMar>
           </w:tcPr>
           <w:p>
             <w:pPr>
-              <w:spacing w:before="0" w:after="40"/>
+              <w:spacing w:before="0" w:after="60"/>
             </w:pPr>
             <w:r>
               <w:rPr>
@@ -2382,7 +2581,7 @@
                 <w:sz w:val="19"/>
                 <w:szCs w:val="19"/>
               </w:rPr>
-              <w:t xml:space="preserve">   —   Same across all three deployment packages</w:t>
+              <w:t xml:space="preserve"> — same across all tiers</w:t>
             </w:r>
           </w:p>
           <w:p>
@@ -2404,7 +2603,7 @@
       <w:tr>
         <w:tc>
           <w:tcPr>
-            <w:tcW w:type="dxa" w:w="9026"/>
+            <w:tcW w:type="dxa" w:w="9746"/>
             <w:gridSpan w:val="2"/>
             <w:tcBorders>
               <w:top w:val="single" w:color="C5DDF9" w:sz="4"/>
@@ -2434,7 +2633,7 @@
                 <w:sz w:val="16"/>
                 <w:szCs w:val="16"/>
               </w:rPr>
-              <w:t xml:space="preserve">WHAT IS INCLUDED IN MONTHLY MAINTENANCE</w:t>
+              <w:t xml:space="preserve">COVERED SERVICES</w:t>
             </w:r>
           </w:p>
         </w:tc>
@@ -2442,7 +2641,7 @@
       <w:tr>
         <w:tc>
           <w:tcPr>
-            <w:tcW w:type="dxa" w:w="4513"/>
+            <w:tcW w:type="dxa" w:w="4873"/>
             <w:tcBorders>
               <w:top w:val="single" w:color="C5DDF9" w:sz="4"/>
               <w:left w:val="single" w:color="C5DDF9" w:sz="4"/>
@@ -2452,9 +2651,9 @@
             <w:shd w:fill="FFFFFF" w:val="clear"/>
             <w:tcMar>
               <w:top w:type="dxa" w:w="80"/>
-              <w:left w:type="dxa" w:w="160"/>
-              <w:bottom w:type="dxa" w:w="80"/>
-              <w:right w:type="dxa" w:w="120"/>
+              <w:left w:type="dxa" w:w="120"/>
+              <w:bottom w:type="dxa" w:w="80"/>
+              <w:right w:type="dxa" w:w="80"/>
             </w:tcMar>
           </w:tcPr>
           <w:p>
@@ -2470,7 +2669,7 @@
                 <w:sz w:val="19"/>
                 <w:szCs w:val="19"/>
               </w:rPr>
-              <w:t xml:space="preserve">✔  </w:t>
+              <w:t xml:space="preserve">✔ </w:t>
             </w:r>
             <w:r>
               <w:rPr>
@@ -2485,7 +2684,7 @@
         </w:tc>
         <w:tc>
           <w:tcPr>
-            <w:tcW w:type="dxa" w:w="4513"/>
+            <w:tcW w:type="dxa" w:w="4873"/>
             <w:tcBorders>
               <w:top w:val="single" w:color="C5DDF9" w:sz="4"/>
               <w:left w:val="single" w:color="C5DDF9" w:sz="4"/>
@@ -2495,9 +2694,9 @@
             <w:shd w:fill="FFFFFF" w:val="clear"/>
             <w:tcMar>
               <w:top w:type="dxa" w:w="80"/>
-              <w:left w:type="dxa" w:w="160"/>
-              <w:bottom w:type="dxa" w:w="80"/>
-              <w:right w:type="dxa" w:w="120"/>
+              <w:left w:type="dxa" w:w="120"/>
+              <w:bottom w:type="dxa" w:w="80"/>
+              <w:right w:type="dxa" w:w="80"/>
             </w:tcMar>
           </w:tcPr>
           <w:p>
@@ -2513,7 +2712,7 @@
                 <w:sz w:val="19"/>
                 <w:szCs w:val="19"/>
               </w:rPr>
-              <w:t xml:space="preserve">✔  </w:t>
+              <w:t xml:space="preserve">✔ </w:t>
             </w:r>
             <w:r>
               <w:rPr>
@@ -2530,7 +2729,7 @@
       <w:tr>
         <w:tc>
           <w:tcPr>
-            <w:tcW w:type="dxa" w:w="4513"/>
+            <w:tcW w:type="dxa" w:w="4873"/>
             <w:tcBorders>
               <w:top w:val="single" w:color="C5DDF9" w:sz="4"/>
               <w:left w:val="single" w:color="C5DDF9" w:sz="4"/>
@@ -2540,9 +2739,9 @@
             <w:shd w:fill="F4F8FF" w:val="clear"/>
             <w:tcMar>
               <w:top w:type="dxa" w:w="80"/>
-              <w:left w:type="dxa" w:w="160"/>
-              <w:bottom w:type="dxa" w:w="80"/>
-              <w:right w:type="dxa" w:w="120"/>
+              <w:left w:type="dxa" w:w="120"/>
+              <w:bottom w:type="dxa" w:w="80"/>
+              <w:right w:type="dxa" w:w="80"/>
             </w:tcMar>
           </w:tcPr>
           <w:p>
@@ -2558,7 +2757,7 @@
                 <w:sz w:val="19"/>
                 <w:szCs w:val="19"/>
               </w:rPr>
-              <w:t xml:space="preserve">✔  </w:t>
+              <w:t xml:space="preserve">✔ </w:t>
             </w:r>
             <w:r>
               <w:rPr>
@@ -2573,7 +2772,7 @@
         </w:tc>
         <w:tc>
           <w:tcPr>
-            <w:tcW w:type="dxa" w:w="4513"/>
+            <w:tcW w:type="dxa" w:w="4873"/>
             <w:tcBorders>
               <w:top w:val="single" w:color="C5DDF9" w:sz="4"/>
               <w:left w:val="single" w:color="C5DDF9" w:sz="4"/>
@@ -2583,9 +2782,9 @@
             <w:shd w:fill="F4F8FF" w:val="clear"/>
             <w:tcMar>
               <w:top w:type="dxa" w:w="80"/>
-              <w:left w:type="dxa" w:w="160"/>
-              <w:bottom w:type="dxa" w:w="80"/>
-              <w:right w:type="dxa" w:w="120"/>
+              <w:left w:type="dxa" w:w="120"/>
+              <w:bottom w:type="dxa" w:w="80"/>
+              <w:right w:type="dxa" w:w="80"/>
             </w:tcMar>
           </w:tcPr>
           <w:p>
@@ -2601,7 +2800,7 @@
                 <w:sz w:val="19"/>
                 <w:szCs w:val="19"/>
               </w:rPr>
-              <w:t xml:space="preserve">✔  </w:t>
+              <w:t xml:space="preserve">✔ </w:t>
             </w:r>
             <w:r>
               <w:rPr>
@@ -2618,7 +2817,7 @@
       <w:tr>
         <w:tc>
           <w:tcPr>
-            <w:tcW w:type="dxa" w:w="4513"/>
+            <w:tcW w:type="dxa" w:w="4873"/>
             <w:tcBorders>
               <w:top w:val="single" w:color="C5DDF9" w:sz="4"/>
               <w:left w:val="single" w:color="C5DDF9" w:sz="4"/>
@@ -2628,9 +2827,9 @@
             <w:shd w:fill="FFFFFF" w:val="clear"/>
             <w:tcMar>
               <w:top w:type="dxa" w:w="80"/>
-              <w:left w:type="dxa" w:w="160"/>
-              <w:bottom w:type="dxa" w:w="80"/>
-              <w:right w:type="dxa" w:w="120"/>
+              <w:left w:type="dxa" w:w="120"/>
+              <w:bottom w:type="dxa" w:w="80"/>
+              <w:right w:type="dxa" w:w="80"/>
             </w:tcMar>
           </w:tcPr>
           <w:p>
@@ -2646,7 +2845,7 @@
                 <w:sz w:val="19"/>
                 <w:szCs w:val="19"/>
               </w:rPr>
-              <w:t xml:space="preserve">✔  </w:t>
+              <w:t xml:space="preserve">✔ </w:t>
             </w:r>
             <w:r>
               <w:rPr>
@@ -2661,7 +2860,7 @@
         </w:tc>
         <w:tc>
           <w:tcPr>
-            <w:tcW w:type="dxa" w:w="4513"/>
+            <w:tcW w:type="dxa" w:w="4873"/>
             <w:tcBorders>
               <w:top w:val="single" w:color="C5DDF9" w:sz="4"/>
               <w:left w:val="single" w:color="C5DDF9" w:sz="4"/>
@@ -2671,9 +2870,9 @@
             <w:shd w:fill="FFFFFF" w:val="clear"/>
             <w:tcMar>
               <w:top w:type="dxa" w:w="80"/>
-              <w:left w:type="dxa" w:w="160"/>
-              <w:bottom w:type="dxa" w:w="80"/>
-              <w:right w:type="dxa" w:w="120"/>
+              <w:left w:type="dxa" w:w="120"/>
+              <w:bottom w:type="dxa" w:w="80"/>
+              <w:right w:type="dxa" w:w="80"/>
             </w:tcMar>
           </w:tcPr>
           <w:p>
@@ -2689,7 +2888,7 @@
                 <w:sz w:val="19"/>
                 <w:szCs w:val="19"/>
               </w:rPr>
-              <w:t xml:space="preserve">✔  </w:t>
+              <w:t xml:space="preserve">✔ </w:t>
             </w:r>
             <w:r>
               <w:rPr>
@@ -2706,7 +2905,7 @@
       <w:tr>
         <w:tc>
           <w:tcPr>
-            <w:tcW w:type="dxa" w:w="4513"/>
+            <w:tcW w:type="dxa" w:w="4873"/>
             <w:tcBorders>
               <w:top w:val="single" w:color="C5DDF9" w:sz="4"/>
               <w:left w:val="single" w:color="C5DDF9" w:sz="4"/>
@@ -2716,9 +2915,9 @@
             <w:shd w:fill="F4F8FF" w:val="clear"/>
             <w:tcMar>
               <w:top w:type="dxa" w:w="80"/>
-              <w:left w:type="dxa" w:w="160"/>
-              <w:bottom w:type="dxa" w:w="80"/>
-              <w:right w:type="dxa" w:w="120"/>
+              <w:left w:type="dxa" w:w="120"/>
+              <w:bottom w:type="dxa" w:w="80"/>
+              <w:right w:type="dxa" w:w="80"/>
             </w:tcMar>
           </w:tcPr>
           <w:p>
@@ -2734,7 +2933,7 @@
                 <w:sz w:val="19"/>
                 <w:szCs w:val="19"/>
               </w:rPr>
-              <w:t xml:space="preserve">✔  </w:t>
+              <w:t xml:space="preserve">✔ </w:t>
             </w:r>
             <w:r>
               <w:rPr>
@@ -2749,7 +2948,7 @@
         </w:tc>
         <w:tc>
           <w:tcPr>
-            <w:tcW w:type="dxa" w:w="4513"/>
+            <w:tcW w:type="dxa" w:w="4873"/>
             <w:tcBorders>
               <w:top w:val="single" w:color="C5DDF9" w:sz="4"/>
               <w:left w:val="single" w:color="C5DDF9" w:sz="4"/>
@@ -2759,9 +2958,9 @@
             <w:shd w:fill="F4F8FF" w:val="clear"/>
             <w:tcMar>
               <w:top w:type="dxa" w:w="80"/>
-              <w:left w:type="dxa" w:w="160"/>
-              <w:bottom w:type="dxa" w:w="80"/>
-              <w:right w:type="dxa" w:w="120"/>
+              <w:left w:type="dxa" w:w="120"/>
+              <w:bottom w:type="dxa" w:w="80"/>
+              <w:right w:type="dxa" w:w="80"/>
             </w:tcMar>
           </w:tcPr>
           <w:p>
@@ -2777,7 +2976,7 @@
                 <w:sz w:val="19"/>
                 <w:szCs w:val="19"/>
               </w:rPr>
-              <w:t xml:space="preserve">✔  </w:t>
+              <w:t xml:space="preserve">✔ </w:t>
             </w:r>
             <w:r>
               <w:rPr>
@@ -2799,7 +2998,7 @@
     </w:p>
     <w:p>
       <w:pPr>
-        <w:spacing w:before="200" w:after="60"/>
+        <w:spacing w:before="220" w:after="60"/>
       </w:pPr>
       <w:r>
         <w:rPr>
@@ -2807,7 +3006,7 @@
           <w:b/>
           <w:bCs/>
           <w:color w:val="1E88E5"/>
-          <w:spacing w:val="40"/>
+          <w:spacing w:val="50"/>
           <w:sz w:val="16"/>
           <w:szCs w:val="16"/>
         </w:rPr>
@@ -2817,9 +3016,9 @@
     <w:p>
       <w:pPr>
         <w:pBdr>
-          <w:bottom w:val="single" w:color="1E88E5" w:sz="8" w:space="4"/>
+          <w:bottom w:val="single" w:color="1E88E5" w:sz="10" w:space="4"/>
         </w:pBdr>
-        <w:spacing w:before="0" w:after="80"/>
+        <w:spacing w:before="0" w:after="100"/>
       </w:pPr>
       <w:r>
         <w:rPr>
@@ -2827,8 +3026,8 @@
           <w:b/>
           <w:bCs/>
           <w:color w:val="0F2D5A"/>
-          <w:sz w:val="36"/>
-          <w:szCs w:val="36"/>
+          <w:sz w:val="34"/>
+          <w:szCs w:val="34"/>
         </w:rPr>
         <w:t xml:space="preserve">What Each Package Delivers</w:t>
       </w:r>
@@ -2858,7 +3057,7 @@
           <w:sz w:val="20"/>
           <w:szCs w:val="20"/>
         </w:rPr>
-        <w:t xml:space="preserve">Detailed scope for each deployment tier. Features marked in bold are key differentiators for that tier.</w:t>
+        <w:t xml:space="preserve">Detailed scope for each tier. Bold items are the key differentiators introduced at that level.</w:t>
       </w:r>
     </w:p>
     <w:p>
@@ -2877,7 +3076,7 @@
     </w:p>
     <w:tbl>
       <w:tblPr>
-        <w:tblW w:type="dxa" w:w="9026"/>
+        <w:tblW w:type="dxa" w:w="9746"/>
         <w:tblBorders>
           <w:top w:val="single" w:color="auto" w:sz="4"/>
           <w:left w:val="single" w:color="auto" w:sz="4"/>
@@ -2888,13 +3087,13 @@
         </w:tblBorders>
       </w:tblPr>
       <w:tblGrid>
-        <w:gridCol w:w="4513"/>
-        <w:gridCol w:w="4513"/>
+        <w:gridCol w:w="4873"/>
+        <w:gridCol w:w="4873"/>
       </w:tblGrid>
       <w:tr>
         <w:tc>
           <w:tcPr>
-            <w:tcW w:type="dxa" w:w="9026"/>
+            <w:tcW w:type="dxa" w:w="9746"/>
             <w:gridSpan w:val="2"/>
             <w:tcBorders>
               <w:top w:val="single" w:color="C5DDF9" w:sz="4"/>
@@ -2904,15 +3103,15 @@
             </w:tcBorders>
             <w:shd w:fill="EEF5FF" w:val="clear"/>
             <w:tcMar>
-              <w:top w:type="dxa" w:w="120"/>
-              <w:left w:type="dxa" w:w="160"/>
-              <w:bottom w:type="dxa" w:w="120"/>
-              <w:right w:type="dxa" w:w="160"/>
-            </w:tcMar>
-          </w:tcPr>
-          <w:p>
-            <w:pPr>
-              <w:spacing w:before="0" w:after="40"/>
+              <w:top w:type="dxa" w:w="130"/>
+              <w:left w:type="dxa" w:w="180"/>
+              <w:bottom w:type="dxa" w:w="130"/>
+              <w:right w:type="dxa" w:w="180"/>
+            </w:tcMar>
+          </w:tcPr>
+          <w:p>
+            <w:pPr>
+              <w:spacing w:before="0" w:after="50"/>
             </w:pPr>
             <w:r>
               <w:rPr>
@@ -2928,7 +3127,7 @@
           </w:p>
           <w:p>
             <w:pPr>
-              <w:spacing w:before="0" w:after="40"/>
+              <w:spacing w:before="0" w:after="80"/>
             </w:pPr>
             <w:r>
               <w:rPr>
@@ -2964,7 +3163,7 @@
                 <w:sz w:val="17"/>
                 <w:szCs w:val="17"/>
               </w:rPr>
-              <w:t xml:space="preserve">  — One-time deployment</w:t>
+              <w:t xml:space="preserve"> — One-time deployment</w:t>
             </w:r>
           </w:p>
         </w:tc>
@@ -2972,7 +3171,7 @@
       <w:tr>
         <w:tc>
           <w:tcPr>
-            <w:tcW w:type="dxa" w:w="9026"/>
+            <w:tcW w:type="dxa" w:w="9746"/>
             <w:gridSpan w:val="2"/>
             <w:tcBorders>
               <w:top w:val="single" w:color="C5DDF9" w:sz="4"/>
@@ -3010,7 +3209,7 @@
       <w:tr>
         <w:tc>
           <w:tcPr>
-            <w:tcW w:type="dxa" w:w="4513"/>
+            <w:tcW w:type="dxa" w:w="4873"/>
             <w:tcBorders>
               <w:top w:val="single" w:color="C5DDF9" w:sz="4"/>
               <w:left w:val="single" w:color="C5DDF9" w:sz="4"/>
@@ -3020,9 +3219,9 @@
             <w:shd w:fill="FFFFFF" w:val="clear"/>
             <w:tcMar>
               <w:top w:type="dxa" w:w="80"/>
-              <w:left w:type="dxa" w:w="160"/>
-              <w:bottom w:type="dxa" w:w="80"/>
-              <w:right w:type="dxa" w:w="120"/>
+              <w:left w:type="dxa" w:w="120"/>
+              <w:bottom w:type="dxa" w:w="80"/>
+              <w:right w:type="dxa" w:w="80"/>
             </w:tcMar>
           </w:tcPr>
           <w:p>
@@ -3036,7 +3235,7 @@
                 <w:sz w:val="18"/>
                 <w:szCs w:val="18"/>
               </w:rPr>
-              <w:t xml:space="preserve">◆  </w:t>
+              <w:t xml:space="preserve">◆ </w:t>
             </w:r>
             <w:r>
               <w:rPr>
@@ -3053,7 +3252,7 @@
         </w:tc>
         <w:tc>
           <w:tcPr>
-            <w:tcW w:type="dxa" w:w="4513"/>
+            <w:tcW w:type="dxa" w:w="4873"/>
             <w:tcBorders>
               <w:top w:val="single" w:color="C5DDF9" w:sz="4"/>
               <w:left w:val="single" w:color="C5DDF9" w:sz="4"/>
@@ -3063,9 +3262,9 @@
             <w:shd w:fill="FFFFFF" w:val="clear"/>
             <w:tcMar>
               <w:top w:type="dxa" w:w="80"/>
-              <w:left w:type="dxa" w:w="160"/>
-              <w:bottom w:type="dxa" w:w="80"/>
-              <w:right w:type="dxa" w:w="120"/>
+              <w:left w:type="dxa" w:w="120"/>
+              <w:bottom w:type="dxa" w:w="80"/>
+              <w:right w:type="dxa" w:w="80"/>
             </w:tcMar>
           </w:tcPr>
           <w:p>
@@ -3079,7 +3278,7 @@
                 <w:sz w:val="18"/>
                 <w:szCs w:val="18"/>
               </w:rPr>
-              <w:t xml:space="preserve">◆  </w:t>
+              <w:t xml:space="preserve">◆ </w:t>
             </w:r>
             <w:r>
               <w:rPr>
@@ -3098,7 +3297,7 @@
       <w:tr>
         <w:tc>
           <w:tcPr>
-            <w:tcW w:type="dxa" w:w="4513"/>
+            <w:tcW w:type="dxa" w:w="4873"/>
             <w:tcBorders>
               <w:top w:val="single" w:color="C5DDF9" w:sz="4"/>
               <w:left w:val="single" w:color="C5DDF9" w:sz="4"/>
@@ -3108,9 +3307,9 @@
             <w:shd w:fill="F4F8FF" w:val="clear"/>
             <w:tcMar>
               <w:top w:type="dxa" w:w="80"/>
-              <w:left w:type="dxa" w:w="160"/>
-              <w:bottom w:type="dxa" w:w="80"/>
-              <w:right w:type="dxa" w:w="120"/>
+              <w:left w:type="dxa" w:w="120"/>
+              <w:bottom w:type="dxa" w:w="80"/>
+              <w:right w:type="dxa" w:w="80"/>
             </w:tcMar>
           </w:tcPr>
           <w:p>
@@ -3124,7 +3323,7 @@
                 <w:sz w:val="18"/>
                 <w:szCs w:val="18"/>
               </w:rPr>
-              <w:t xml:space="preserve">◆  </w:t>
+              <w:t xml:space="preserve">◆ </w:t>
             </w:r>
             <w:r>
               <w:rPr>
@@ -3141,7 +3340,7 @@
         </w:tc>
         <w:tc>
           <w:tcPr>
-            <w:tcW w:type="dxa" w:w="4513"/>
+            <w:tcW w:type="dxa" w:w="4873"/>
             <w:tcBorders>
               <w:top w:val="single" w:color="C5DDF9" w:sz="4"/>
               <w:left w:val="single" w:color="C5DDF9" w:sz="4"/>
@@ -3151,9 +3350,9 @@
             <w:shd w:fill="F4F8FF" w:val="clear"/>
             <w:tcMar>
               <w:top w:type="dxa" w:w="80"/>
-              <w:left w:type="dxa" w:w="160"/>
-              <w:bottom w:type="dxa" w:w="80"/>
-              <w:right w:type="dxa" w:w="120"/>
+              <w:left w:type="dxa" w:w="120"/>
+              <w:bottom w:type="dxa" w:w="80"/>
+              <w:right w:type="dxa" w:w="80"/>
             </w:tcMar>
           </w:tcPr>
           <w:p>
@@ -3167,7 +3366,7 @@
                 <w:sz w:val="18"/>
                 <w:szCs w:val="18"/>
               </w:rPr>
-              <w:t xml:space="preserve">◆  </w:t>
+              <w:t xml:space="preserve">◆ </w:t>
             </w:r>
             <w:r>
               <w:rPr>
@@ -3186,7 +3385,7 @@
       <w:tr>
         <w:tc>
           <w:tcPr>
-            <w:tcW w:type="dxa" w:w="4513"/>
+            <w:tcW w:type="dxa" w:w="4873"/>
             <w:tcBorders>
               <w:top w:val="single" w:color="C5DDF9" w:sz="4"/>
               <w:left w:val="single" w:color="C5DDF9" w:sz="4"/>
@@ -3196,9 +3395,9 @@
             <w:shd w:fill="FFFFFF" w:val="clear"/>
             <w:tcMar>
               <w:top w:type="dxa" w:w="80"/>
-              <w:left w:type="dxa" w:w="160"/>
-              <w:bottom w:type="dxa" w:w="80"/>
-              <w:right w:type="dxa" w:w="120"/>
+              <w:left w:type="dxa" w:w="120"/>
+              <w:bottom w:type="dxa" w:w="80"/>
+              <w:right w:type="dxa" w:w="80"/>
             </w:tcMar>
           </w:tcPr>
           <w:p>
@@ -3212,7 +3411,7 @@
                 <w:sz w:val="18"/>
                 <w:szCs w:val="18"/>
               </w:rPr>
-              <w:t xml:space="preserve">◆  </w:t>
+              <w:t xml:space="preserve">◆ </w:t>
             </w:r>
             <w:r>
               <w:rPr>
@@ -3229,7 +3428,7 @@
         </w:tc>
         <w:tc>
           <w:tcPr>
-            <w:tcW w:type="dxa" w:w="4513"/>
+            <w:tcW w:type="dxa" w:w="4873"/>
             <w:tcBorders>
               <w:top w:val="single" w:color="C5DDF9" w:sz="4"/>
               <w:left w:val="single" w:color="C5DDF9" w:sz="4"/>
@@ -3239,9 +3438,9 @@
             <w:shd w:fill="FFFFFF" w:val="clear"/>
             <w:tcMar>
               <w:top w:type="dxa" w:w="80"/>
-              <w:left w:type="dxa" w:w="160"/>
-              <w:bottom w:type="dxa" w:w="80"/>
-              <w:right w:type="dxa" w:w="120"/>
+              <w:left w:type="dxa" w:w="120"/>
+              <w:bottom w:type="dxa" w:w="80"/>
+              <w:right w:type="dxa" w:w="80"/>
             </w:tcMar>
           </w:tcPr>
           <w:p>
@@ -3255,7 +3454,7 @@
                 <w:sz w:val="18"/>
                 <w:szCs w:val="18"/>
               </w:rPr>
-              <w:t xml:space="preserve">◆  </w:t>
+              <w:t xml:space="preserve">◆ </w:t>
             </w:r>
             <w:r>
               <w:rPr>
@@ -3274,7 +3473,7 @@
       <w:tr>
         <w:tc>
           <w:tcPr>
-            <w:tcW w:type="dxa" w:w="4513"/>
+            <w:tcW w:type="dxa" w:w="4873"/>
             <w:tcBorders>
               <w:top w:val="single" w:color="C5DDF9" w:sz="4"/>
               <w:left w:val="single" w:color="C5DDF9" w:sz="4"/>
@@ -3284,9 +3483,9 @@
             <w:shd w:fill="F4F8FF" w:val="clear"/>
             <w:tcMar>
               <w:top w:type="dxa" w:w="80"/>
-              <w:left w:type="dxa" w:w="160"/>
-              <w:bottom w:type="dxa" w:w="80"/>
-              <w:right w:type="dxa" w:w="120"/>
+              <w:left w:type="dxa" w:w="120"/>
+              <w:bottom w:type="dxa" w:w="80"/>
+              <w:right w:type="dxa" w:w="80"/>
             </w:tcMar>
           </w:tcPr>
           <w:p>
@@ -3300,7 +3499,7 @@
                 <w:sz w:val="18"/>
                 <w:szCs w:val="18"/>
               </w:rPr>
-              <w:t xml:space="preserve">◆  </w:t>
+              <w:t xml:space="preserve">◆ </w:t>
             </w:r>
             <w:r>
               <w:rPr>
@@ -3317,7 +3516,7 @@
         </w:tc>
         <w:tc>
           <w:tcPr>
-            <w:tcW w:type="dxa" w:w="4513"/>
+            <w:tcW w:type="dxa" w:w="4873"/>
             <w:tcBorders>
               <w:top w:val="single" w:color="C5DDF9" w:sz="4"/>
               <w:left w:val="single" w:color="C5DDF9" w:sz="4"/>
@@ -3327,9 +3526,9 @@
             <w:shd w:fill="F4F8FF" w:val="clear"/>
             <w:tcMar>
               <w:top w:type="dxa" w:w="80"/>
-              <w:left w:type="dxa" w:w="160"/>
-              <w:bottom w:type="dxa" w:w="80"/>
-              <w:right w:type="dxa" w:w="120"/>
+              <w:left w:type="dxa" w:w="120"/>
+              <w:bottom w:type="dxa" w:w="80"/>
+              <w:right w:type="dxa" w:w="80"/>
             </w:tcMar>
           </w:tcPr>
           <w:p>
@@ -3343,7 +3542,7 @@
                 <w:sz w:val="18"/>
                 <w:szCs w:val="18"/>
               </w:rPr>
-              <w:t xml:space="preserve">◆  </w:t>
+              <w:t xml:space="preserve">◆ </w:t>
             </w:r>
             <w:r>
               <w:rPr>
@@ -3362,7 +3561,7 @@
     </w:tbl>
     <w:p>
       <w:pPr>
-        <w:spacing w:before="0" w:after="160"/>
+        <w:spacing w:before="0" w:after="200"/>
       </w:pPr>
       <w:r>
         <w:rPr>
@@ -3376,7 +3575,7 @@
     </w:p>
     <w:tbl>
       <w:tblPr>
-        <w:tblW w:type="dxa" w:w="9026"/>
+        <w:tblW w:type="dxa" w:w="9746"/>
         <w:tblBorders>
           <w:top w:val="single" w:color="auto" w:sz="4"/>
           <w:left w:val="single" w:color="auto" w:sz="4"/>
@@ -3387,13 +3586,13 @@
         </w:tblBorders>
       </w:tblPr>
       <w:tblGrid>
-        <w:gridCol w:w="4513"/>
-        <w:gridCol w:w="4513"/>
+        <w:gridCol w:w="4873"/>
+        <w:gridCol w:w="4873"/>
       </w:tblGrid>
       <w:tr>
         <w:tc>
           <w:tcPr>
-            <w:tcW w:type="dxa" w:w="9026"/>
+            <w:tcW w:type="dxa" w:w="9746"/>
             <w:gridSpan w:val="2"/>
             <w:tcBorders>
               <w:top w:val="single" w:color="C5DDF9" w:sz="4"/>
@@ -3403,15 +3602,15 @@
             </w:tcBorders>
             <w:shd w:fill="1040A0" w:val="clear"/>
             <w:tcMar>
-              <w:top w:type="dxa" w:w="120"/>
-              <w:left w:type="dxa" w:w="160"/>
-              <w:bottom w:type="dxa" w:w="120"/>
-              <w:right w:type="dxa" w:w="160"/>
-            </w:tcMar>
-          </w:tcPr>
-          <w:p>
-            <w:pPr>
-              <w:spacing w:before="0" w:after="40"/>
+              <w:top w:type="dxa" w:w="130"/>
+              <w:left w:type="dxa" w:w="180"/>
+              <w:bottom w:type="dxa" w:w="130"/>
+              <w:right w:type="dxa" w:w="180"/>
+            </w:tcMar>
+          </w:tcPr>
+          <w:p>
+            <w:pPr>
+              <w:spacing w:before="0" w:after="50"/>
             </w:pPr>
             <w:r>
               <w:rPr>
@@ -3427,14 +3626,14 @@
           </w:p>
           <w:p>
             <w:pPr>
-              <w:spacing w:before="0" w:after="40"/>
+              <w:spacing w:before="0" w:after="80"/>
             </w:pPr>
             <w:r>
               <w:rPr>
                 <w:rFonts w:ascii="Arial" w:cs="Arial" w:eastAsia="Arial" w:hAnsi="Arial"/>
                 <w:i/>
                 <w:iCs/>
-                <w:color w:val="A8C8F0"/>
+                <w:color w:val="7AACDB"/>
                 <w:sz w:val="18"/>
                 <w:szCs w:val="18"/>
               </w:rPr>
@@ -3463,7 +3662,7 @@
                 <w:sz w:val="17"/>
                 <w:szCs w:val="17"/>
               </w:rPr>
-              <w:t xml:space="preserve">  — One-time deployment</w:t>
+              <w:t xml:space="preserve"> — One-time deployment</w:t>
             </w:r>
           </w:p>
         </w:tc>
@@ -3471,7 +3670,7 @@
       <w:tr>
         <w:tc>
           <w:tcPr>
-            <w:tcW w:type="dxa" w:w="9026"/>
+            <w:tcW w:type="dxa" w:w="9746"/>
             <w:gridSpan w:val="2"/>
             <w:tcBorders>
               <w:top w:val="single" w:color="C5DDF9" w:sz="4"/>
@@ -3509,7 +3708,7 @@
       <w:tr>
         <w:tc>
           <w:tcPr>
-            <w:tcW w:type="dxa" w:w="4513"/>
+            <w:tcW w:type="dxa" w:w="4873"/>
             <w:tcBorders>
               <w:top w:val="single" w:color="C5DDF9" w:sz="4"/>
               <w:left w:val="single" w:color="C5DDF9" w:sz="4"/>
@@ -3519,9 +3718,9 @@
             <w:shd w:fill="FFFFFF" w:val="clear"/>
             <w:tcMar>
               <w:top w:type="dxa" w:w="80"/>
-              <w:left w:type="dxa" w:w="160"/>
-              <w:bottom w:type="dxa" w:w="80"/>
-              <w:right w:type="dxa" w:w="120"/>
+              <w:left w:type="dxa" w:w="120"/>
+              <w:bottom w:type="dxa" w:w="80"/>
+              <w:right w:type="dxa" w:w="80"/>
             </w:tcMar>
           </w:tcPr>
           <w:p>
@@ -3535,7 +3734,7 @@
                 <w:sz w:val="18"/>
                 <w:szCs w:val="18"/>
               </w:rPr>
-              <w:t xml:space="preserve">◆  </w:t>
+              <w:t xml:space="preserve">◆ </w:t>
             </w:r>
             <w:r>
               <w:rPr>
@@ -3552,7 +3751,7 @@
         </w:tc>
         <w:tc>
           <w:tcPr>
-            <w:tcW w:type="dxa" w:w="4513"/>
+            <w:tcW w:type="dxa" w:w="4873"/>
             <w:tcBorders>
               <w:top w:val="single" w:color="C5DDF9" w:sz="4"/>
               <w:left w:val="single" w:color="C5DDF9" w:sz="4"/>
@@ -3562,9 +3761,9 @@
             <w:shd w:fill="FFFFFF" w:val="clear"/>
             <w:tcMar>
               <w:top w:type="dxa" w:w="80"/>
-              <w:left w:type="dxa" w:w="160"/>
-              <w:bottom w:type="dxa" w:w="80"/>
-              <w:right w:type="dxa" w:w="120"/>
+              <w:left w:type="dxa" w:w="120"/>
+              <w:bottom w:type="dxa" w:w="80"/>
+              <w:right w:type="dxa" w:w="80"/>
             </w:tcMar>
           </w:tcPr>
           <w:p>
@@ -3578,7 +3777,7 @@
                 <w:sz w:val="18"/>
                 <w:szCs w:val="18"/>
               </w:rPr>
-              <w:t xml:space="preserve">◆  </w:t>
+              <w:t xml:space="preserve">◆ </w:t>
             </w:r>
             <w:r>
               <w:rPr>
@@ -3597,7 +3796,7 @@
       <w:tr>
         <w:tc>
           <w:tcPr>
-            <w:tcW w:type="dxa" w:w="4513"/>
+            <w:tcW w:type="dxa" w:w="4873"/>
             <w:tcBorders>
               <w:top w:val="single" w:color="C5DDF9" w:sz="4"/>
               <w:left w:val="single" w:color="C5DDF9" w:sz="4"/>
@@ -3607,9 +3806,9 @@
             <w:shd w:fill="F4F8FF" w:val="clear"/>
             <w:tcMar>
               <w:top w:type="dxa" w:w="80"/>
-              <w:left w:type="dxa" w:w="160"/>
-              <w:bottom w:type="dxa" w:w="80"/>
-              <w:right w:type="dxa" w:w="120"/>
+              <w:left w:type="dxa" w:w="120"/>
+              <w:bottom w:type="dxa" w:w="80"/>
+              <w:right w:type="dxa" w:w="80"/>
             </w:tcMar>
           </w:tcPr>
           <w:p>
@@ -3623,7 +3822,7 @@
                 <w:sz w:val="18"/>
                 <w:szCs w:val="18"/>
               </w:rPr>
-              <w:t xml:space="preserve">◆  </w:t>
+              <w:t xml:space="preserve">◆ </w:t>
             </w:r>
             <w:r>
               <w:rPr>
@@ -3640,7 +3839,7 @@
         </w:tc>
         <w:tc>
           <w:tcPr>
-            <w:tcW w:type="dxa" w:w="4513"/>
+            <w:tcW w:type="dxa" w:w="4873"/>
             <w:tcBorders>
               <w:top w:val="single" w:color="C5DDF9" w:sz="4"/>
               <w:left w:val="single" w:color="C5DDF9" w:sz="4"/>
@@ -3650,9 +3849,9 @@
             <w:shd w:fill="F4F8FF" w:val="clear"/>
             <w:tcMar>
               <w:top w:type="dxa" w:w="80"/>
-              <w:left w:type="dxa" w:w="160"/>
-              <w:bottom w:type="dxa" w:w="80"/>
-              <w:right w:type="dxa" w:w="120"/>
+              <w:left w:type="dxa" w:w="120"/>
+              <w:bottom w:type="dxa" w:w="80"/>
+              <w:right w:type="dxa" w:w="80"/>
             </w:tcMar>
           </w:tcPr>
           <w:p>
@@ -3666,7 +3865,7 @@
                 <w:sz w:val="18"/>
                 <w:szCs w:val="18"/>
               </w:rPr>
-              <w:t xml:space="preserve">◆  </w:t>
+              <w:t xml:space="preserve">◆ </w:t>
             </w:r>
             <w:r>
               <w:rPr>
@@ -3685,7 +3884,7 @@
       <w:tr>
         <w:tc>
           <w:tcPr>
-            <w:tcW w:type="dxa" w:w="4513"/>
+            <w:tcW w:type="dxa" w:w="4873"/>
             <w:tcBorders>
               <w:top w:val="single" w:color="C5DDF9" w:sz="4"/>
               <w:left w:val="single" w:color="C5DDF9" w:sz="4"/>
@@ -3695,9 +3894,9 @@
             <w:shd w:fill="FFFFFF" w:val="clear"/>
             <w:tcMar>
               <w:top w:type="dxa" w:w="80"/>
-              <w:left w:type="dxa" w:w="160"/>
-              <w:bottom w:type="dxa" w:w="80"/>
-              <w:right w:type="dxa" w:w="120"/>
+              <w:left w:type="dxa" w:w="120"/>
+              <w:bottom w:type="dxa" w:w="80"/>
+              <w:right w:type="dxa" w:w="80"/>
             </w:tcMar>
           </w:tcPr>
           <w:p>
@@ -3711,7 +3910,7 @@
                 <w:sz w:val="18"/>
                 <w:szCs w:val="18"/>
               </w:rPr>
-              <w:t xml:space="preserve">◆  </w:t>
+              <w:t xml:space="preserve">◆ </w:t>
             </w:r>
             <w:r>
               <w:rPr>
@@ -3728,7 +3927,7 @@
         </w:tc>
         <w:tc>
           <w:tcPr>
-            <w:tcW w:type="dxa" w:w="4513"/>
+            <w:tcW w:type="dxa" w:w="4873"/>
             <w:tcBorders>
               <w:top w:val="single" w:color="C5DDF9" w:sz="4"/>
               <w:left w:val="single" w:color="C5DDF9" w:sz="4"/>
@@ -3738,9 +3937,9 @@
             <w:shd w:fill="FFFFFF" w:val="clear"/>
             <w:tcMar>
               <w:top w:type="dxa" w:w="80"/>
-              <w:left w:type="dxa" w:w="160"/>
-              <w:bottom w:type="dxa" w:w="80"/>
-              <w:right w:type="dxa" w:w="120"/>
+              <w:left w:type="dxa" w:w="120"/>
+              <w:bottom w:type="dxa" w:w="80"/>
+              <w:right w:type="dxa" w:w="80"/>
             </w:tcMar>
           </w:tcPr>
           <w:p>
@@ -3754,7 +3953,7 @@
                 <w:sz w:val="18"/>
                 <w:szCs w:val="18"/>
               </w:rPr>
-              <w:t xml:space="preserve">◆  </w:t>
+              <w:t xml:space="preserve">◆ </w:t>
             </w:r>
             <w:r>
               <w:rPr>
@@ -3773,7 +3972,7 @@
       <w:tr>
         <w:tc>
           <w:tcPr>
-            <w:tcW w:type="dxa" w:w="4513"/>
+            <w:tcW w:type="dxa" w:w="4873"/>
             <w:tcBorders>
               <w:top w:val="single" w:color="C5DDF9" w:sz="4"/>
               <w:left w:val="single" w:color="C5DDF9" w:sz="4"/>
@@ -3783,9 +3982,9 @@
             <w:shd w:fill="F4F8FF" w:val="clear"/>
             <w:tcMar>
               <w:top w:type="dxa" w:w="80"/>
-              <w:left w:type="dxa" w:w="160"/>
-              <w:bottom w:type="dxa" w:w="80"/>
-              <w:right w:type="dxa" w:w="120"/>
+              <w:left w:type="dxa" w:w="120"/>
+              <w:bottom w:type="dxa" w:w="80"/>
+              <w:right w:type="dxa" w:w="80"/>
             </w:tcMar>
           </w:tcPr>
           <w:p>
@@ -3799,7 +3998,7 @@
                 <w:sz w:val="18"/>
                 <w:szCs w:val="18"/>
               </w:rPr>
-              <w:t xml:space="preserve">◆  </w:t>
+              <w:t xml:space="preserve">◆ </w:t>
             </w:r>
             <w:r>
               <w:rPr>
@@ -3816,7 +4015,7 @@
         </w:tc>
         <w:tc>
           <w:tcPr>
-            <w:tcW w:type="dxa" w:w="4513"/>
+            <w:tcW w:type="dxa" w:w="4873"/>
             <w:tcBorders>
               <w:top w:val="single" w:color="C5DDF9" w:sz="4"/>
               <w:left w:val="single" w:color="C5DDF9" w:sz="4"/>
@@ -3826,9 +4025,9 @@
             <w:shd w:fill="F4F8FF" w:val="clear"/>
             <w:tcMar>
               <w:top w:type="dxa" w:w="80"/>
-              <w:left w:type="dxa" w:w="160"/>
-              <w:bottom w:type="dxa" w:w="80"/>
-              <w:right w:type="dxa" w:w="120"/>
+              <w:left w:type="dxa" w:w="120"/>
+              <w:bottom w:type="dxa" w:w="80"/>
+              <w:right w:type="dxa" w:w="80"/>
             </w:tcMar>
           </w:tcPr>
           <w:p>
@@ -3842,7 +4041,7 @@
                 <w:sz w:val="18"/>
                 <w:szCs w:val="18"/>
               </w:rPr>
-              <w:t xml:space="preserve">◆  </w:t>
+              <w:t xml:space="preserve">◆ </w:t>
             </w:r>
             <w:r>
               <w:rPr>
@@ -3861,7 +4060,7 @@
       <w:tr>
         <w:tc>
           <w:tcPr>
-            <w:tcW w:type="dxa" w:w="4513"/>
+            <w:tcW w:type="dxa" w:w="4873"/>
             <w:tcBorders>
               <w:top w:val="single" w:color="C5DDF9" w:sz="4"/>
               <w:left w:val="single" w:color="C5DDF9" w:sz="4"/>
@@ -3871,9 +4070,9 @@
             <w:shd w:fill="FFFFFF" w:val="clear"/>
             <w:tcMar>
               <w:top w:type="dxa" w:w="80"/>
-              <w:left w:type="dxa" w:w="160"/>
-              <w:bottom w:type="dxa" w:w="80"/>
-              <w:right w:type="dxa" w:w="120"/>
+              <w:left w:type="dxa" w:w="120"/>
+              <w:bottom w:type="dxa" w:w="80"/>
+              <w:right w:type="dxa" w:w="80"/>
             </w:tcMar>
           </w:tcPr>
           <w:p>
@@ -3887,7 +4086,7 @@
                 <w:sz w:val="18"/>
                 <w:szCs w:val="18"/>
               </w:rPr>
-              <w:t xml:space="preserve">◆  </w:t>
+              <w:t xml:space="preserve">◆ </w:t>
             </w:r>
             <w:r>
               <w:rPr>
@@ -3898,13 +4097,13 @@
                 <w:sz w:val="19"/>
                 <w:szCs w:val="19"/>
               </w:rPr>
-              <w:t xml:space="preserve">Operational management training — 2–3 days</w:t>
-            </w:r>
-          </w:p>
-        </w:tc>
-        <w:tc>
-          <w:tcPr>
-            <w:tcW w:type="dxa" w:w="4513"/>
+              <w:t xml:space="preserve">Operational training — 2–3 days</w:t>
+            </w:r>
+          </w:p>
+        </w:tc>
+        <w:tc>
+          <w:tcPr>
+            <w:tcW w:type="dxa" w:w="4873"/>
             <w:tcBorders>
               <w:top w:val="single" w:color="C5DDF9" w:sz="4"/>
               <w:left w:val="single" w:color="C5DDF9" w:sz="4"/>
@@ -3914,9 +4113,9 @@
             <w:shd w:fill="FFFFFF" w:val="clear"/>
             <w:tcMar>
               <w:top w:type="dxa" w:w="80"/>
-              <w:left w:type="dxa" w:w="160"/>
-              <w:bottom w:type="dxa" w:w="80"/>
-              <w:right w:type="dxa" w:w="120"/>
+              <w:left w:type="dxa" w:w="120"/>
+              <w:bottom w:type="dxa" w:w="80"/>
+              <w:right w:type="dxa" w:w="80"/>
             </w:tcMar>
           </w:tcPr>
           <w:p>
@@ -3938,7 +4137,7 @@
     </w:tbl>
     <w:p>
       <w:pPr>
-        <w:spacing w:before="0" w:after="160"/>
+        <w:spacing w:before="0" w:after="200"/>
       </w:pPr>
       <w:r>
         <w:rPr>
@@ -3952,7 +4151,7 @@
     </w:p>
     <w:tbl>
       <w:tblPr>
-        <w:tblW w:type="dxa" w:w="9026"/>
+        <w:tblW w:type="dxa" w:w="9746"/>
         <w:tblBorders>
           <w:top w:val="single" w:color="auto" w:sz="4"/>
           <w:left w:val="single" w:color="auto" w:sz="4"/>
@@ -3963,13 +4162,13 @@
         </w:tblBorders>
       </w:tblPr>
       <w:tblGrid>
-        <w:gridCol w:w="4513"/>
-        <w:gridCol w:w="4513"/>
+        <w:gridCol w:w="4873"/>
+        <w:gridCol w:w="4873"/>
       </w:tblGrid>
       <w:tr>
         <w:tc>
           <w:tcPr>
-            <w:tcW w:type="dxa" w:w="9026"/>
+            <w:tcW w:type="dxa" w:w="9746"/>
             <w:gridSpan w:val="2"/>
             <w:tcBorders>
               <w:top w:val="single" w:color="C5DDF9" w:sz="4"/>
@@ -3979,15 +4178,15 @@
             </w:tcBorders>
             <w:shd w:fill="0F2D5A" w:val="clear"/>
             <w:tcMar>
-              <w:top w:type="dxa" w:w="120"/>
-              <w:left w:type="dxa" w:w="160"/>
-              <w:bottom w:type="dxa" w:w="120"/>
-              <w:right w:type="dxa" w:w="160"/>
-            </w:tcMar>
-          </w:tcPr>
-          <w:p>
-            <w:pPr>
-              <w:spacing w:before="0" w:after="40"/>
+              <w:top w:type="dxa" w:w="130"/>
+              <w:left w:type="dxa" w:w="180"/>
+              <w:bottom w:type="dxa" w:w="130"/>
+              <w:right w:type="dxa" w:w="180"/>
+            </w:tcMar>
+          </w:tcPr>
+          <w:p>
+            <w:pPr>
+              <w:spacing w:before="0" w:after="50"/>
             </w:pPr>
             <w:r>
               <w:rPr>
@@ -4003,14 +4202,14 @@
           </w:p>
           <w:p>
             <w:pPr>
-              <w:spacing w:before="0" w:after="40"/>
+              <w:spacing w:before="0" w:after="80"/>
             </w:pPr>
             <w:r>
               <w:rPr>
                 <w:rFonts w:ascii="Arial" w:cs="Arial" w:eastAsia="Arial" w:hAnsi="Arial"/>
                 <w:i/>
                 <w:iCs/>
-                <w:color w:val="A8C8F0"/>
+                <w:color w:val="7AACDB"/>
                 <w:sz w:val="18"/>
                 <w:szCs w:val="18"/>
               </w:rPr>
@@ -4039,7 +4238,7 @@
                 <w:sz w:val="17"/>
                 <w:szCs w:val="17"/>
               </w:rPr>
-              <w:t xml:space="preserve">  — One-time · Custom scoped</w:t>
+              <w:t xml:space="preserve"> — One-time · Custom scoped</w:t>
             </w:r>
           </w:p>
         </w:tc>
@@ -4047,7 +4246,7 @@
       <w:tr>
         <w:tc>
           <w:tcPr>
-            <w:tcW w:type="dxa" w:w="9026"/>
+            <w:tcW w:type="dxa" w:w="9746"/>
             <w:gridSpan w:val="2"/>
             <w:tcBorders>
               <w:top w:val="single" w:color="C5DDF9" w:sz="4"/>
@@ -4085,7 +4284,7 @@
       <w:tr>
         <w:tc>
           <w:tcPr>
-            <w:tcW w:type="dxa" w:w="4513"/>
+            <w:tcW w:type="dxa" w:w="4873"/>
             <w:tcBorders>
               <w:top w:val="single" w:color="C5DDF9" w:sz="4"/>
               <w:left w:val="single" w:color="C5DDF9" w:sz="4"/>
@@ -4095,9 +4294,9 @@
             <w:shd w:fill="FFFFFF" w:val="clear"/>
             <w:tcMar>
               <w:top w:type="dxa" w:w="80"/>
-              <w:left w:type="dxa" w:w="160"/>
-              <w:bottom w:type="dxa" w:w="80"/>
-              <w:right w:type="dxa" w:w="120"/>
+              <w:left w:type="dxa" w:w="120"/>
+              <w:bottom w:type="dxa" w:w="80"/>
+              <w:right w:type="dxa" w:w="80"/>
             </w:tcMar>
           </w:tcPr>
           <w:p>
@@ -4111,7 +4310,7 @@
                 <w:sz w:val="18"/>
                 <w:szCs w:val="18"/>
               </w:rPr>
-              <w:t xml:space="preserve">◆  </w:t>
+              <w:t xml:space="preserve">◆ </w:t>
             </w:r>
             <w:r>
               <w:rPr>
@@ -4128,7 +4327,7 @@
         </w:tc>
         <w:tc>
           <w:tcPr>
-            <w:tcW w:type="dxa" w:w="4513"/>
+            <w:tcW w:type="dxa" w:w="4873"/>
             <w:tcBorders>
               <w:top w:val="single" w:color="C5DDF9" w:sz="4"/>
               <w:left w:val="single" w:color="C5DDF9" w:sz="4"/>
@@ -4138,9 +4337,9 @@
             <w:shd w:fill="FFFFFF" w:val="clear"/>
             <w:tcMar>
               <w:top w:type="dxa" w:w="80"/>
-              <w:left w:type="dxa" w:w="160"/>
-              <w:bottom w:type="dxa" w:w="80"/>
-              <w:right w:type="dxa" w:w="120"/>
+              <w:left w:type="dxa" w:w="120"/>
+              <w:bottom w:type="dxa" w:w="80"/>
+              <w:right w:type="dxa" w:w="80"/>
             </w:tcMar>
           </w:tcPr>
           <w:p>
@@ -4154,7 +4353,7 @@
                 <w:sz w:val="18"/>
                 <w:szCs w:val="18"/>
               </w:rPr>
-              <w:t xml:space="preserve">◆  </w:t>
+              <w:t xml:space="preserve">◆ </w:t>
             </w:r>
             <w:r>
               <w:rPr>
@@ -4173,7 +4372,7 @@
       <w:tr>
         <w:tc>
           <w:tcPr>
-            <w:tcW w:type="dxa" w:w="4513"/>
+            <w:tcW w:type="dxa" w:w="4873"/>
             <w:tcBorders>
               <w:top w:val="single" w:color="C5DDF9" w:sz="4"/>
               <w:left w:val="single" w:color="C5DDF9" w:sz="4"/>
@@ -4183,9 +4382,9 @@
             <w:shd w:fill="F4F8FF" w:val="clear"/>
             <w:tcMar>
               <w:top w:type="dxa" w:w="80"/>
-              <w:left w:type="dxa" w:w="160"/>
-              <w:bottom w:type="dxa" w:w="80"/>
-              <w:right w:type="dxa" w:w="120"/>
+              <w:left w:type="dxa" w:w="120"/>
+              <w:bottom w:type="dxa" w:w="80"/>
+              <w:right w:type="dxa" w:w="80"/>
             </w:tcMar>
           </w:tcPr>
           <w:p>
@@ -4199,7 +4398,7 @@
                 <w:sz w:val="18"/>
                 <w:szCs w:val="18"/>
               </w:rPr>
-              <w:t xml:space="preserve">◆  </w:t>
+              <w:t xml:space="preserve">◆ </w:t>
             </w:r>
             <w:r>
               <w:rPr>
@@ -4216,7 +4415,7 @@
         </w:tc>
         <w:tc>
           <w:tcPr>
-            <w:tcW w:type="dxa" w:w="4513"/>
+            <w:tcW w:type="dxa" w:w="4873"/>
             <w:tcBorders>
               <w:top w:val="single" w:color="C5DDF9" w:sz="4"/>
               <w:left w:val="single" w:color="C5DDF9" w:sz="4"/>
@@ -4226,9 +4425,9 @@
             <w:shd w:fill="F4F8FF" w:val="clear"/>
             <w:tcMar>
               <w:top w:type="dxa" w:w="80"/>
-              <w:left w:type="dxa" w:w="160"/>
-              <w:bottom w:type="dxa" w:w="80"/>
-              <w:right w:type="dxa" w:w="120"/>
+              <w:left w:type="dxa" w:w="120"/>
+              <w:bottom w:type="dxa" w:w="80"/>
+              <w:right w:type="dxa" w:w="80"/>
             </w:tcMar>
           </w:tcPr>
           <w:p>
@@ -4242,7 +4441,7 @@
                 <w:sz w:val="18"/>
                 <w:szCs w:val="18"/>
               </w:rPr>
-              <w:t xml:space="preserve">◆  </w:t>
+              <w:t xml:space="preserve">◆ </w:t>
             </w:r>
             <w:r>
               <w:rPr>
@@ -4261,7 +4460,7 @@
       <w:tr>
         <w:tc>
           <w:tcPr>
-            <w:tcW w:type="dxa" w:w="4513"/>
+            <w:tcW w:type="dxa" w:w="4873"/>
             <w:tcBorders>
               <w:top w:val="single" w:color="C5DDF9" w:sz="4"/>
               <w:left w:val="single" w:color="C5DDF9" w:sz="4"/>
@@ -4271,9 +4470,9 @@
             <w:shd w:fill="FFFFFF" w:val="clear"/>
             <w:tcMar>
               <w:top w:type="dxa" w:w="80"/>
-              <w:left w:type="dxa" w:w="160"/>
-              <w:bottom w:type="dxa" w:w="80"/>
-              <w:right w:type="dxa" w:w="120"/>
+              <w:left w:type="dxa" w:w="120"/>
+              <w:bottom w:type="dxa" w:w="80"/>
+              <w:right w:type="dxa" w:w="80"/>
             </w:tcMar>
           </w:tcPr>
           <w:p>
@@ -4287,7 +4486,7 @@
                 <w:sz w:val="18"/>
                 <w:szCs w:val="18"/>
               </w:rPr>
-              <w:t xml:space="preserve">◆  </w:t>
+              <w:t xml:space="preserve">◆ </w:t>
             </w:r>
             <w:r>
               <w:rPr>
@@ -4304,7 +4503,7 @@
         </w:tc>
         <w:tc>
           <w:tcPr>
-            <w:tcW w:type="dxa" w:w="4513"/>
+            <w:tcW w:type="dxa" w:w="4873"/>
             <w:tcBorders>
               <w:top w:val="single" w:color="C5DDF9" w:sz="4"/>
               <w:left w:val="single" w:color="C5DDF9" w:sz="4"/>
@@ -4314,9 +4513,9 @@
             <w:shd w:fill="FFFFFF" w:val="clear"/>
             <w:tcMar>
               <w:top w:type="dxa" w:w="80"/>
-              <w:left w:type="dxa" w:w="160"/>
-              <w:bottom w:type="dxa" w:w="80"/>
-              <w:right w:type="dxa" w:w="120"/>
+              <w:left w:type="dxa" w:w="120"/>
+              <w:bottom w:type="dxa" w:w="80"/>
+              <w:right w:type="dxa" w:w="80"/>
             </w:tcMar>
           </w:tcPr>
           <w:p>
@@ -4330,7 +4529,7 @@
                 <w:sz w:val="18"/>
                 <w:szCs w:val="18"/>
               </w:rPr>
-              <w:t xml:space="preserve">◆  </w:t>
+              <w:t xml:space="preserve">◆ </w:t>
             </w:r>
             <w:r>
               <w:rPr>
@@ -4341,7 +4540,7 @@
                 <w:sz w:val="19"/>
                 <w:szCs w:val="19"/>
               </w:rPr>
-              <w:t xml:space="preserve">Multi-branch, multi-product operational setup</w:t>
+              <w:t xml:space="preserve">Multi-branch, multi-product setup</w:t>
             </w:r>
           </w:p>
         </w:tc>
@@ -4349,7 +4548,7 @@
       <w:tr>
         <w:tc>
           <w:tcPr>
-            <w:tcW w:type="dxa" w:w="4513"/>
+            <w:tcW w:type="dxa" w:w="4873"/>
             <w:tcBorders>
               <w:top w:val="single" w:color="C5DDF9" w:sz="4"/>
               <w:left w:val="single" w:color="C5DDF9" w:sz="4"/>
@@ -4359,9 +4558,9 @@
             <w:shd w:fill="F4F8FF" w:val="clear"/>
             <w:tcMar>
               <w:top w:type="dxa" w:w="80"/>
-              <w:left w:type="dxa" w:w="160"/>
-              <w:bottom w:type="dxa" w:w="80"/>
-              <w:right w:type="dxa" w:w="120"/>
+              <w:left w:type="dxa" w:w="120"/>
+              <w:bottom w:type="dxa" w:w="80"/>
+              <w:right w:type="dxa" w:w="80"/>
             </w:tcMar>
           </w:tcPr>
           <w:p>
@@ -4375,7 +4574,7 @@
                 <w:sz w:val="18"/>
                 <w:szCs w:val="18"/>
               </w:rPr>
-              <w:t xml:space="preserve">◆  </w:t>
+              <w:t xml:space="preserve">◆ </w:t>
             </w:r>
             <w:r>
               <w:rPr>
@@ -4392,7 +4591,7 @@
         </w:tc>
         <w:tc>
           <w:tcPr>
-            <w:tcW w:type="dxa" w:w="4513"/>
+            <w:tcW w:type="dxa" w:w="4873"/>
             <w:tcBorders>
               <w:top w:val="single" w:color="C5DDF9" w:sz="4"/>
               <w:left w:val="single" w:color="C5DDF9" w:sz="4"/>
@@ -4402,9 +4601,9 @@
             <w:shd w:fill="F4F8FF" w:val="clear"/>
             <w:tcMar>
               <w:top w:type="dxa" w:w="80"/>
-              <w:left w:type="dxa" w:w="160"/>
-              <w:bottom w:type="dxa" w:w="80"/>
-              <w:right w:type="dxa" w:w="120"/>
+              <w:left w:type="dxa" w:w="120"/>
+              <w:bottom w:type="dxa" w:w="80"/>
+              <w:right w:type="dxa" w:w="80"/>
             </w:tcMar>
           </w:tcPr>
           <w:p>
@@ -4418,7 +4617,7 @@
                 <w:sz w:val="18"/>
                 <w:szCs w:val="18"/>
               </w:rPr>
-              <w:t xml:space="preserve">◆  </w:t>
+              <w:t xml:space="preserve">◆ </w:t>
             </w:r>
             <w:r>
               <w:rPr>
@@ -4429,7 +4628,7 @@
                 <w:sz w:val="19"/>
                 <w:szCs w:val="19"/>
               </w:rPr>
-              <w:t xml:space="preserve">Full digital banking operations training — 3–4 days</w:t>
+              <w:t xml:space="preserve">Full digital banking training — 3–4 days</w:t>
             </w:r>
           </w:p>
         </w:tc>
@@ -4437,7 +4636,7 @@
       <w:tr>
         <w:tc>
           <w:tcPr>
-            <w:tcW w:type="dxa" w:w="4513"/>
+            <w:tcW w:type="dxa" w:w="4873"/>
             <w:tcBorders>
               <w:top w:val="single" w:color="C5DDF9" w:sz="4"/>
               <w:left w:val="single" w:color="C5DDF9" w:sz="4"/>
@@ -4447,9 +4646,9 @@
             <w:shd w:fill="FFFFFF" w:val="clear"/>
             <w:tcMar>
               <w:top w:type="dxa" w:w="80"/>
-              <w:left w:type="dxa" w:w="160"/>
-              <w:bottom w:type="dxa" w:w="80"/>
-              <w:right w:type="dxa" w:w="120"/>
+              <w:left w:type="dxa" w:w="120"/>
+              <w:bottom w:type="dxa" w:w="80"/>
+              <w:right w:type="dxa" w:w="80"/>
             </w:tcMar>
           </w:tcPr>
           <w:p>
@@ -4463,7 +4662,7 @@
                 <w:sz w:val="18"/>
                 <w:szCs w:val="18"/>
               </w:rPr>
-              <w:t xml:space="preserve">◆  </w:t>
+              <w:t xml:space="preserve">◆ </w:t>
             </w:r>
             <w:r>
               <w:rPr>
@@ -4480,7 +4679,7 @@
         </w:tc>
         <w:tc>
           <w:tcPr>
-            <w:tcW w:type="dxa" w:w="4513"/>
+            <w:tcW w:type="dxa" w:w="4873"/>
             <w:tcBorders>
               <w:top w:val="single" w:color="C5DDF9" w:sz="4"/>
               <w:left w:val="single" w:color="C5DDF9" w:sz="4"/>
@@ -4490,9 +4689,9 @@
             <w:shd w:fill="FFFFFF" w:val="clear"/>
             <w:tcMar>
               <w:top w:type="dxa" w:w="80"/>
-              <w:left w:type="dxa" w:w="160"/>
-              <w:bottom w:type="dxa" w:w="80"/>
-              <w:right w:type="dxa" w:w="120"/>
+              <w:left w:type="dxa" w:w="120"/>
+              <w:bottom w:type="dxa" w:w="80"/>
+              <w:right w:type="dxa" w:w="80"/>
             </w:tcMar>
           </w:tcPr>
           <w:p>
@@ -4519,7 +4718,7 @@
     </w:p>
     <w:p>
       <w:pPr>
-        <w:spacing w:before="200" w:after="60"/>
+        <w:spacing w:before="220" w:after="60"/>
       </w:pPr>
       <w:r>
         <w:rPr>
@@ -4527,7 +4726,7 @@
           <w:b/>
           <w:bCs/>
           <w:color w:val="1E88E5"/>
-          <w:spacing w:val="40"/>
+          <w:spacing w:val="50"/>
           <w:sz w:val="16"/>
           <w:szCs w:val="16"/>
         </w:rPr>
@@ -4537,9 +4736,9 @@
     <w:p>
       <w:pPr>
         <w:pBdr>
-          <w:bottom w:val="single" w:color="1E88E5" w:sz="8" w:space="4"/>
+          <w:bottom w:val="single" w:color="1E88E5" w:sz="10" w:space="4"/>
         </w:pBdr>
-        <w:spacing w:before="0" w:after="80"/>
+        <w:spacing w:before="0" w:after="100"/>
       </w:pPr>
       <w:r>
         <w:rPr>
@@ -4547,8 +4746,8 @@
           <w:b/>
           <w:bCs/>
           <w:color w:val="0F2D5A"/>
-          <w:sz w:val="36"/>
-          <w:szCs w:val="36"/>
+          <w:sz w:val="34"/>
+          <w:szCs w:val="34"/>
         </w:rPr>
         <w:t xml:space="preserve">Request a Demo or Custom Quote</w:t>
       </w:r>
@@ -4578,7 +4777,7 @@
           <w:sz w:val="20"/>
           <w:szCs w:val="20"/>
         </w:rPr>
-        <w:t xml:space="preserve">Our consultants will walk through your institution's specific needs, demonstrate Mifos X live, and deliver a tailored proposal within 48 hours — no obligation, no pressure.</w:t>
+        <w:t xml:space="preserve">Our consultants will walk through your institution’s specific needs, demonstrate Mifos X live, and deliver a tailored proposal within 48 hours — no obligation.</w:t>
       </w:r>
     </w:p>
     <w:p>
@@ -4597,7 +4796,7 @@
     </w:p>
     <w:tbl>
       <w:tblPr>
-        <w:tblW w:type="dxa" w:w="9026"/>
+        <w:tblW w:type="dxa" w:w="9746"/>
         <w:tblBorders>
           <w:top w:val="single" w:color="auto" w:sz="4"/>
           <w:left w:val="single" w:color="auto" w:sz="4"/>
@@ -4608,24 +4807,24 @@
         </w:tblBorders>
       </w:tblPr>
       <w:tblGrid>
-        <w:gridCol w:w="4513"/>
-        <w:gridCol w:w="4513"/>
+        <w:gridCol w:w="4873"/>
+        <w:gridCol w:w="4873"/>
       </w:tblGrid>
       <w:tr>
         <w:tc>
           <w:tcPr>
-            <w:tcW w:type="dxa" w:w="4513"/>
-            <w:tcBorders>
-              <w:top w:val="none" w:color="FFFFFF" w:sz="0"/>
-              <w:left w:val="none" w:color="FFFFFF" w:sz="0"/>
-              <w:bottom w:val="none" w:color="FFFFFF" w:sz="0"/>
-              <w:right w:val="none" w:color="FFFFFF" w:sz="0"/>
+            <w:tcW w:type="dxa" w:w="4873"/>
+            <w:tcBorders>
+              <w:top w:val="single" w:color="C5DDF9" w:sz="4"/>
+              <w:left w:val="single" w:color="C5DDF9" w:sz="4"/>
+              <w:bottom w:val="single" w:color="C5DDF9" w:sz="4"/>
+              <w:right w:val="single" w:color="C5DDF9" w:sz="4"/>
             </w:tcBorders>
             <w:shd w:fill="0F2D5A" w:val="clear"/>
             <w:tcMar>
-              <w:top w:type="dxa" w:w="160"/>
+              <w:top w:type="dxa" w:w="180"/>
               <w:left w:type="dxa" w:w="200"/>
-              <w:bottom w:type="dxa" w:w="160"/>
+              <w:bottom w:type="dxa" w:w="180"/>
               <w:right w:type="dxa" w:w="200"/>
             </w:tcMar>
           </w:tcPr>
@@ -4647,7 +4846,7 @@
           </w:p>
           <w:p>
             <w:pPr>
-              <w:spacing w:before="0" w:after="100"/>
+              <w:spacing w:before="0" w:after="120"/>
             </w:pPr>
             <w:r>
               <w:rPr>
@@ -4656,17 +4855,16 @@
                 <w:sz w:val="18"/>
                 <w:szCs w:val="18"/>
               </w:rPr>
-              <w:t xml:space="preserve">Send us a message through our secure online form. We respond within 24 hours.</w:t>
-            </w:r>
-          </w:p>
-          <w:p>
-            <w:pPr>
-              <w:spacing w:before="0" w:after="0"/>
-            </w:pPr>
-            <w:hyperlink w:history="1" r:id="rIdm-vsmxahmrw4pznempgqh">
+              <w:t xml:space="preserve">Send us a message via our secure online form. We respond within 24 hours.</w:t>
+            </w:r>
+          </w:p>
+          <w:p>
+            <w:pPr>
+              <w:spacing w:before="0" w:after="0"/>
+            </w:pPr>
+            <w:hyperlink w:history="1" r:id="rIditpyuogh7gj0yrujbzqzb">
               <w:r>
                 <w:rPr>
-                  <w:rStyle w:val="Hyperlink"/>
                   <w:rFonts w:ascii="Arial" w:cs="Arial" w:eastAsia="Arial" w:hAnsi="Arial"/>
                   <w:b/>
                   <w:bCs/>
@@ -4674,25 +4872,25 @@
                   <w:sz w:val="20"/>
                   <w:szCs w:val="20"/>
                 </w:rPr>
-                <w:t xml:space="preserve">→  Click here to send an enquiry</w:t>
+                <w:t xml:space="preserve">→ Click here to send an enquiry</w:t>
               </w:r>
             </w:hyperlink>
           </w:p>
         </w:tc>
         <w:tc>
           <w:tcPr>
-            <w:tcW w:type="dxa" w:w="4513"/>
-            <w:tcBorders>
-              <w:top w:val="none" w:color="FFFFFF" w:sz="0"/>
-              <w:left w:val="none" w:color="FFFFFF" w:sz="0"/>
-              <w:bottom w:val="none" w:color="FFFFFF" w:sz="0"/>
-              <w:right w:val="none" w:color="FFFFFF" w:sz="0"/>
+            <w:tcW w:type="dxa" w:w="4873"/>
+            <w:tcBorders>
+              <w:top w:val="single" w:color="C5DDF9" w:sz="4"/>
+              <w:left w:val="single" w:color="C5DDF9" w:sz="4"/>
+              <w:bottom w:val="single" w:color="C5DDF9" w:sz="4"/>
+              <w:right w:val="single" w:color="C5DDF9" w:sz="4"/>
             </w:tcBorders>
             <w:shd w:fill="E8F2FF" w:val="clear"/>
             <w:tcMar>
-              <w:top w:type="dxa" w:w="160"/>
+              <w:top w:type="dxa" w:w="180"/>
               <w:left w:type="dxa" w:w="200"/>
-              <w:bottom w:type="dxa" w:w="160"/>
+              <w:bottom w:type="dxa" w:w="180"/>
               <w:right w:type="dxa" w:w="200"/>
             </w:tcMar>
           </w:tcPr>
@@ -4751,7 +4949,7 @@
                 <w:sz w:val="18"/>
                 <w:szCs w:val="18"/>
               </w:rPr>
-              <w:t xml:space="preserve">Certified Digital Public Good</w:t>
+              <w:t xml:space="preserve">✔ Certified Digital Public Good</w:t>
             </w:r>
           </w:p>
         </w:tc>
@@ -4773,7 +4971,7 @@
     </w:p>
     <w:p>
       <w:pPr>
-        <w:spacing w:before="160" w:after="60"/>
+        <w:spacing w:before="180" w:after="80"/>
       </w:pPr>
       <w:r>
         <w:rPr>
@@ -4798,12 +4996,12 @@
           <w:sz w:val="20"/>
           <w:szCs w:val="20"/>
         </w:rPr>
-        <w:t xml:space="preserve">Use the space below to note your institution's details before submitting your enquiry:</w:t>
+        <w:t xml:space="preserve">Use this space to note your institution’s details before submitting your enquiry:</w:t>
       </w:r>
     </w:p>
     <w:p>
       <w:pPr>
-        <w:spacing w:before="0" w:after="60"/>
+        <w:spacing w:before="0" w:after="80"/>
       </w:pPr>
       <w:r>
         <w:rPr>
@@ -5065,7 +5263,7 @@
     </w:p>
     <w:p>
       <w:pPr>
-        <w:spacing w:before="100" w:after="100"/>
+        <w:spacing w:before="80" w:after="80"/>
       </w:pPr>
       <w:r>
         <w:rPr>
@@ -5079,7 +5277,7 @@
     </w:p>
     <w:tbl>
       <w:tblPr>
-        <w:tblW w:type="dxa" w:w="9026"/>
+        <w:tblW w:type="dxa" w:w="9746"/>
         <w:tblBorders>
           <w:top w:val="single" w:color="auto" w:sz="4"/>
           <w:left w:val="single" w:color="auto" w:sz="4"/>
@@ -5090,17 +5288,17 @@
         </w:tblBorders>
       </w:tblPr>
       <w:tblGrid>
-        <w:gridCol w:w="9026"/>
+        <w:gridCol w:w="9746"/>
       </w:tblGrid>
       <w:tr>
         <w:tc>
           <w:tcPr>
-            <w:tcW w:type="dxa" w:w="9026"/>
-            <w:tcBorders>
-              <w:top w:val="none" w:color="FFFFFF" w:sz="0"/>
-              <w:left w:val="single" w:color="1E88E5" w:sz="18"/>
-              <w:bottom w:val="none" w:color="FFFFFF" w:sz="0"/>
-              <w:right w:val="none" w:color="FFFFFF" w:sz="0"/>
+            <w:tcW w:type="dxa" w:w="9746"/>
+            <w:tcBorders>
+              <w:top w:val="none" w:color="auto" w:sz="0"/>
+              <w:left w:val="single" w:color="1E88E5" w:sz="20"/>
+              <w:bottom w:val="none" w:color="auto" w:sz="0"/>
+              <w:right w:val="none" w:color="auto" w:sz="0"/>
             </w:tcBorders>
             <w:shd w:fill="E8F2FF" w:val="clear"/>
             <w:tcMar>
@@ -5121,7 +5319,7 @@
                 <w:sz w:val="19"/>
                 <w:szCs w:val="19"/>
               </w:rPr>
-              <w:t xml:space="preserve">Pricing valid for 2025. Subject to formal engagement agreement. All figures in Uganda Shillings (UGX). Enterprise deployment is custom-scoped and final pricing depends on confirmed institutional requirements.</w:t>
+              <w:t xml:space="preserve">Pricing valid for 2025. Subject to formal engagement agreement. All figures in Uganda Shillings (UGX). Enterprise is custom-scoped; final pricing depends on confirmed requirements.</w:t>
             </w:r>
           </w:p>
         </w:tc>
@@ -5130,6 +5328,7 @@
     <w:sectPr>
       <w:headerReference w:type="default" r:id="rId6"/>
       <w:footerReference w:type="default" r:id="rId7"/>
+      <w:type w:val="nextPage"/>
       <w:pgSz w:w="11906" w:h="16838" w:orient="portrait"/>
       <w:pgMar w:top="1200" w:right="1080" w:bottom="1200" w:left="1080" w:header="708" w:footer="708" w:gutter="0"/>
       <w:pgNumType/>
@@ -5151,7 +5350,7 @@
         <w:top w:val="single" w:color="C5DDF9" w:sz="4" w:space="4"/>
       </w:pBdr>
       <w:tabs>
-        <w:tab w:val="right" w:pos="9026"/>
+        <w:tab w:val="right" w:pos="9746"/>
       </w:tabs>
       <w:spacing w:before="80" w:after="0"/>
     </w:pPr>
@@ -5162,11 +5361,12 @@
         <w:sz w:val="16"/>
         <w:szCs w:val="16"/>
       </w:rPr>
-      <w:t xml:space="preserve">Legitimo Tech Solutions  ·  Mifos X / Apache Fineract  ·  Confidential</w:t>
+      <w:t xml:space="preserve">Legitimo Tech Solutions · Mifos X / Apache Fineract · Confidential</w:t>
     </w:r>
     <w:r>
       <w:rPr>
         <w:rFonts w:ascii="Arial" w:cs="Arial" w:eastAsia="Arial" w:hAnsi="Arial"/>
+        <w:color w:val="6B84A0"/>
         <w:sz w:val="16"/>
         <w:szCs w:val="16"/>
       </w:rPr>
@@ -5227,7 +5427,7 @@
 <w:hdr xmlns:wpc="http://schemas.microsoft.com/office/word/2010/wordprocessingCanvas" xmlns:mc="http://schemas.openxmlformats.org/markup-compatibility/2006" xmlns:o="urn:schemas-microsoft-com:office:office" xmlns:r="http://schemas.openxmlformats.org/officeDocument/2006/relationships" xmlns:m="http://schemas.openxmlformats.org/officeDocument/2006/math" xmlns:v="urn:schemas-microsoft-com:vml" xmlns:wp14="http://schemas.microsoft.com/office/word/2010/wordprocessingDrawing" xmlns:wp="http://schemas.openxmlformats.org/drawingml/2006/wordprocessingDrawing" xmlns:w10="urn:schemas-microsoft-com:office:word" xmlns:w="http://schemas.openxmlformats.org/wordprocessingml/2006/main" xmlns:w14="http://schemas.microsoft.com/office/word/2010/wordml" xmlns:w15="http://schemas.microsoft.com/office/word/2012/wordml" xmlns:wpg="http://schemas.microsoft.com/office/word/2010/wordprocessingGroup" xmlns:wpi="http://schemas.microsoft.com/office/word/2010/wordprocessingInk" xmlns:wne="http://schemas.microsoft.com/office/word/2006/wordml" xmlns:wps="http://schemas.microsoft.com/office/word/2010/wordprocessingShape" xmlns:cx="http://schemas.microsoft.com/office/drawing/2014/chartex" xmlns:cx1="http://schemas.microsoft.com/office/drawing/2015/9/8/chartex" xmlns:cx2="http://schemas.microsoft.com/office/drawing/2015/10/21/chartex" xmlns:cx3="http://schemas.microsoft.com/office/drawing/2016/5/9/chartex" xmlns:cx4="http://schemas.microsoft.com/office/drawing/2016/5/10/chartex" xmlns:cx5="http://schemas.microsoft.com/office/drawing/2016/5/11/chartex" xmlns:cx6="http://schemas.microsoft.com/office/drawing/2016/5/12/chartex" xmlns:cx7="http://schemas.microsoft.com/office/drawing/2016/5/13/chartex" xmlns:cx8="http://schemas.microsoft.com/office/drawing/2016/5/14/chartex" xmlns:w16cid="http://schemas.microsoft.com/office/word/2016/wordml/cid" xmlns:w16se="http://schemas.microsoft.com/office/word/2015/wordml/symex">
   <w:tbl>
     <w:tblPr>
-      <w:tblW w:type="dxa" w:w="9026"/>
+      <w:tblW w:type="dxa" w:w="9746"/>
       <w:tblBorders>
         <w:top w:val="single" w:color="auto" w:sz="4"/>
         <w:left w:val="single" w:color="auto" w:sz="4"/>
@@ -5238,25 +5438,25 @@
       </w:tblBorders>
     </w:tblPr>
     <w:tblGrid>
-      <w:gridCol w:w="4513"/>
-      <w:gridCol w:w="4513"/>
+      <w:gridCol w:w="4873"/>
+      <w:gridCol w:w="4873"/>
     </w:tblGrid>
     <w:tr>
       <w:tc>
         <w:tcPr>
-          <w:tcW w:type="dxa" w:w="4513"/>
+          <w:tcW w:type="dxa" w:w="4873"/>
           <w:tcBorders>
-            <w:top w:val="none" w:color="FFFFFF" w:sz="0"/>
-            <w:left w:val="none" w:color="FFFFFF" w:sz="0"/>
-            <w:bottom w:val="none" w:color="FFFFFF" w:sz="0"/>
-            <w:right w:val="none" w:color="FFFFFF" w:sz="0"/>
+            <w:top w:val="none" w:color="auto" w:sz="0"/>
+            <w:left w:val="none" w:color="auto" w:sz="0"/>
+            <w:bottom w:val="none" w:color="auto" w:sz="0"/>
+            <w:right w:val="none" w:color="auto" w:sz="0"/>
           </w:tcBorders>
           <w:shd w:fill="0F2D5A" w:val="clear"/>
           <w:tcMar>
-            <w:top w:type="dxa" w:w="80"/>
+            <w:top w:type="dxa" w:w="90"/>
             <w:left w:type="dxa" w:w="140"/>
-            <w:bottom w:type="dxa" w:w="80"/>
-            <w:right w:type="dxa" w:w="140"/>
+            <w:bottom w:type="dxa" w:w="90"/>
+            <w:right w:type="dxa" w:w="0"/>
           </w:tcMar>
         </w:tcPr>
         <w:p>
@@ -5289,18 +5489,18 @@
       </w:tc>
       <w:tc>
         <w:tcPr>
-          <w:tcW w:type="dxa" w:w="4513"/>
+          <w:tcW w:type="dxa" w:w="4873"/>
           <w:tcBorders>
-            <w:top w:val="none" w:color="FFFFFF" w:sz="0"/>
-            <w:left w:val="none" w:color="FFFFFF" w:sz="0"/>
-            <w:bottom w:val="none" w:color="FFFFFF" w:sz="0"/>
-            <w:right w:val="none" w:color="FFFFFF" w:sz="0"/>
+            <w:top w:val="none" w:color="auto" w:sz="0"/>
+            <w:left w:val="none" w:color="auto" w:sz="0"/>
+            <w:bottom w:val="none" w:color="auto" w:sz="0"/>
+            <w:right w:val="none" w:color="auto" w:sz="0"/>
           </w:tcBorders>
           <w:shd w:fill="0F2D5A" w:val="clear"/>
           <w:tcMar>
-            <w:top w:type="dxa" w:w="80"/>
-            <w:left w:type="dxa" w:w="140"/>
-            <w:bottom w:type="dxa" w:w="80"/>
+            <w:top w:type="dxa" w:w="90"/>
+            <w:left w:type="dxa" w:w="0"/>
+            <w:bottom w:type="dxa" w:w="90"/>
             <w:right w:type="dxa" w:w="140"/>
           </w:tcMar>
         </w:tcPr>
@@ -5317,7 +5517,7 @@
               <w:sz w:val="16"/>
               <w:szCs w:val="16"/>
             </w:rPr>
-            <w:t xml:space="preserve">MIFOS X PRICING  ·  2025</w:t>
+            <w:t xml:space="preserve">MIFOS X  ·  PRICING 2025</w:t>
           </w:r>
         </w:p>
       </w:tc>
@@ -5621,23 +5821,5 @@
       <w:szCs w:val="26"/>
     </w:rPr>
   </w:style>
-  <w:style w:type="paragraph" w:styleId="Heading3">
-    <w:name w:val="Heading 3"/>
-    <w:basedOn w:val="Normal"/>
-    <w:next w:val="Normal"/>
-    <w:qFormat/>
-    <w:pPr>
-      <w:spacing w:before="160" w:after="60"/>
-      <w:outlineLvl w:val="2"/>
-    </w:pPr>
-    <w:rPr>
-      <w:rFonts w:ascii="Arial" w:cs="Arial" w:eastAsia="Arial" w:hAnsi="Arial"/>
-      <w:b/>
-      <w:bCs/>
-      <w:color w:val="1565C0"/>
-      <w:sz w:val="22"/>
-      <w:szCs w:val="22"/>
-    </w:rPr>
-  </w:style>
 </w:styles>
 </file>
</xml_diff>